<commit_message>
feat(benchmark): agrega baseline GBT solo meteorologia (B.2)
- scripts/43_benchmark_weather_only.py entrena un LightGBM con el mismo
  aprendiz, capacidad, restricciones fisicas y calibracion Platt que M1/M2/M3,
  pero restringido al conjunto de informacion del FWI (9 variables).
- Resultado: ROC-AUC 0.5512/0.5645 (Chaco/Oriental), solo +0.0339/+0.0081
  sobre el FWI completo y muy por debajo de M3 (0.8021/0.7534; Delta = +0.2509/
  +0.1889, p <= 0.001). Aisla la limitacion en la informacion disponible, no en
  el aprendiz ni en la regla de corte.
- Tabla 3 y Tabla S11 (EN/ES) incorporan la fila Weather-only GBT; nueva
  Tabla S21 con intervallos, Brier/BSS/ECE, Delta vs M3 y lista de variables.
- Figura 4 (ROC/PR) incorpora las curvas weather-only.
- Integra las filas en tabla04 y regenera DOCX/HTML.
- Anade from __future__ import annotations a src/modelo.py y src/metricas.py
  para permitir su importacion en Python 3.9 (entorno de ejecucion local).
</commit_message>
<xml_diff>
--- a/entregables/en/manuscrito.docx
+++ b/entregables/en/manuscrito.docx
@@ -2825,7 +2825,7 @@
               <w:pStyle w:val="ImageCaption"/>
             </w:pPr>
             <w:r>
-              <w:t xml:space="preserve">Table 3: Benchmark on the retrospective 2024–2025 test. ΔROC is M3 minus the reference. Cutoffs for every row, including FWI and INPE, were selected on 2023 validation by maximizing F0.5 and then frozen for 2024–2025; precision and recall are case-control at that cutoff. FWI is on the Canadian index scale and INPE on a 0–1 risk scale, so cutoffs are not comparable across indices. Dashes (—) indicate reference models or comparisons not evaluated by construction. The full table is Supplementary Table S11.</w:t>
+              <w:t xml:space="preserve">Table 3: Benchmark on the retrospective 2024–2025 test. ΔROC is M3 minus the reference. Cutoffs for every row, including FWI and INPE, were selected on 2023 validation by maximizing F0.5 and then frozen for 2024–2025; precision and recall are case-control at that cutoff. FWI is on the Canadian index scale and INPE on a 0–1 risk scale, so cutoffs are not comparable across indices. The weather-only GBT is a LightGBM trained with the same capacity and calibration but restricted to the FWI information set. Dashes (—) indicate reference models or comparisons not evaluated by construction. The full table is Supplementary Table S11.</w:t>
             </w:r>
           </w:p>
           <w:tbl>
@@ -3388,7 +3388,7 @@
                     <w:jc w:val="center"/>
                   </w:pPr>
                   <w:r>
-                    <w:t xml:space="preserve">Oriental</w:t>
+                    <w:t xml:space="preserve">Chaco</w:t>
                   </w:r>
                 </w:p>
               </w:tc>
@@ -3401,111 +3401,111 @@
                     <w:jc w:val="center"/>
                   </w:pPr>
                   <w:r>
-                    <w:t xml:space="preserve">M3 ignition</w:t>
-                  </w:r>
-                </w:p>
-              </w:tc>
-              <w:tc>
-                <w:tcPr/>
-                <w:p>
-                  <w:pPr>
-                    <w:pStyle w:val="Compact"/>
-                    <w:jc w:val="right"/>
-                    <w:jc w:val="center"/>
-                  </w:pPr>
-                  <w:r>
-                    <w:t xml:space="preserve">0.7534</w:t>
-                  </w:r>
-                </w:p>
-              </w:tc>
-              <w:tc>
-                <w:tcPr/>
-                <w:p>
-                  <w:pPr>
-                    <w:pStyle w:val="Compact"/>
-                    <w:jc w:val="right"/>
-                    <w:jc w:val="center"/>
-                  </w:pPr>
-                  <w:r>
-                    <w:t xml:space="preserve">0.2340</w:t>
-                  </w:r>
-                </w:p>
-              </w:tc>
-              <w:tc>
-                <w:tcPr/>
-                <w:p>
-                  <w:pPr>
-                    <w:pStyle w:val="Compact"/>
-                    <w:jc w:val="right"/>
-                    <w:jc w:val="center"/>
-                  </w:pPr>
-                  <w:r>
-                    <w:t xml:space="preserve">—</w:t>
-                  </w:r>
-                </w:p>
-              </w:tc>
-              <w:tc>
-                <w:tcPr/>
-                <w:p>
-                  <w:pPr>
-                    <w:pStyle w:val="Compact"/>
-                    <w:jc w:val="right"/>
-                    <w:jc w:val="center"/>
-                  </w:pPr>
-                  <w:r>
-                    <w:t xml:space="preserve">—</w:t>
-                  </w:r>
-                </w:p>
-              </w:tc>
-              <w:tc>
-                <w:tcPr/>
-                <w:p>
-                  <w:pPr>
-                    <w:pStyle w:val="Compact"/>
-                    <w:jc w:val="right"/>
-                    <w:jc w:val="center"/>
-                  </w:pPr>
-                  <w:r>
-                    <w:t xml:space="preserve">0.2186</w:t>
-                  </w:r>
-                </w:p>
-              </w:tc>
-              <w:tc>
-                <w:tcPr/>
-                <w:p>
-                  <w:pPr>
-                    <w:pStyle w:val="Compact"/>
-                    <w:jc w:val="right"/>
-                    <w:jc w:val="center"/>
-                  </w:pPr>
-                  <w:r>
-                    <w:t xml:space="preserve">30.13</w:t>
-                  </w:r>
-                </w:p>
-              </w:tc>
-              <w:tc>
-                <w:tcPr/>
-                <w:p>
-                  <w:pPr>
-                    <w:pStyle w:val="Compact"/>
-                    <w:jc w:val="right"/>
-                    <w:jc w:val="center"/>
-                  </w:pPr>
-                  <w:r>
-                    <w:t xml:space="preserve">18.59</w:t>
-                  </w:r>
-                </w:p>
-              </w:tc>
-              <w:tc>
-                <w:tcPr/>
-                <w:p>
-                  <w:pPr>
-                    <w:pStyle w:val="Compact"/>
-                    <w:jc w:val="right"/>
-                    <w:jc w:val="center"/>
-                  </w:pPr>
-                  <w:r>
-                    <w:t xml:space="preserve">0.2680</w:t>
+                    <w:t xml:space="preserve">Weather-only GBT</w:t>
+                  </w:r>
+                </w:p>
+              </w:tc>
+              <w:tc>
+                <w:tcPr/>
+                <w:p>
+                  <w:pPr>
+                    <w:pStyle w:val="Compact"/>
+                    <w:jc w:val="right"/>
+                    <w:jc w:val="center"/>
+                  </w:pPr>
+                  <w:r>
+                    <w:t xml:space="preserve">0.5512</w:t>
+                  </w:r>
+                </w:p>
+              </w:tc>
+              <w:tc>
+                <w:tcPr/>
+                <w:p>
+                  <w:pPr>
+                    <w:pStyle w:val="Compact"/>
+                    <w:jc w:val="right"/>
+                    <w:jc w:val="center"/>
+                  </w:pPr>
+                  <w:r>
+                    <w:t xml:space="preserve">0.1071</w:t>
+                  </w:r>
+                </w:p>
+              </w:tc>
+              <w:tc>
+                <w:tcPr/>
+                <w:p>
+                  <w:pPr>
+                    <w:pStyle w:val="Compact"/>
+                    <w:jc w:val="right"/>
+                    <w:jc w:val="center"/>
+                  </w:pPr>
+                  <w:r>
+                    <w:t xml:space="preserve">+0.2509</w:t>
+                  </w:r>
+                </w:p>
+              </w:tc>
+              <w:tc>
+                <w:tcPr/>
+                <w:p>
+                  <w:pPr>
+                    <w:pStyle w:val="Compact"/>
+                    <w:jc w:val="right"/>
+                    <w:jc w:val="center"/>
+                  </w:pPr>
+                  <w:r>
+                    <w:t xml:space="preserve">≤0.001</w:t>
+                  </w:r>
+                </w:p>
+              </w:tc>
+              <w:tc>
+                <w:tcPr/>
+                <w:p>
+                  <w:pPr>
+                    <w:pStyle w:val="Compact"/>
+                    <w:jc w:val="right"/>
+                    <w:jc w:val="center"/>
+                  </w:pPr>
+                  <w:r>
+                    <w:t xml:space="preserve">0.1020</w:t>
+                  </w:r>
+                </w:p>
+              </w:tc>
+              <w:tc>
+                <w:tcPr/>
+                <w:p>
+                  <w:pPr>
+                    <w:pStyle w:val="Compact"/>
+                    <w:jc w:val="right"/>
+                    <w:jc w:val="center"/>
+                  </w:pPr>
+                  <w:r>
+                    <w:t xml:space="preserve">11.43</w:t>
+                  </w:r>
+                </w:p>
+              </w:tc>
+              <w:tc>
+                <w:tcPr/>
+                <w:p>
+                  <w:pPr>
+                    <w:pStyle w:val="Compact"/>
+                    <w:jc w:val="right"/>
+                    <w:jc w:val="center"/>
+                  </w:pPr>
+                  <w:r>
+                    <w:t xml:space="preserve">19.32</w:t>
+                  </w:r>
+                </w:p>
+              </w:tc>
+              <w:tc>
+                <w:tcPr/>
+                <w:p>
+                  <w:pPr>
+                    <w:pStyle w:val="Compact"/>
+                    <w:jc w:val="right"/>
+                    <w:jc w:val="center"/>
+                  </w:pPr>
+                  <w:r>
+                    <w:t xml:space="preserve">0.1245</w:t>
                   </w:r>
                 </w:p>
               </w:tc>
@@ -3533,111 +3533,111 @@
                     <w:jc w:val="center"/>
                   </w:pPr>
                   <w:r>
-                    <w:t xml:space="preserve">Full Canadian FWI</w:t>
-                  </w:r>
-                </w:p>
-              </w:tc>
-              <w:tc>
-                <w:tcPr/>
-                <w:p>
-                  <w:pPr>
-                    <w:pStyle w:val="Compact"/>
-                    <w:jc w:val="right"/>
-                    <w:jc w:val="center"/>
-                  </w:pPr>
-                  <w:r>
-                    <w:t xml:space="preserve">0.5564</w:t>
-                  </w:r>
-                </w:p>
-              </w:tc>
-              <w:tc>
-                <w:tcPr/>
-                <w:p>
-                  <w:pPr>
-                    <w:pStyle w:val="Compact"/>
-                    <w:jc w:val="right"/>
-                    <w:jc w:val="center"/>
-                  </w:pPr>
-                  <w:r>
-                    <w:t xml:space="preserve">0.1061</w:t>
-                  </w:r>
-                </w:p>
-              </w:tc>
-              <w:tc>
-                <w:tcPr/>
-                <w:p>
-                  <w:pPr>
-                    <w:pStyle w:val="Compact"/>
-                    <w:jc w:val="right"/>
-                    <w:jc w:val="center"/>
-                  </w:pPr>
-                  <w:r>
-                    <w:t xml:space="preserve">+0.1970</w:t>
-                  </w:r>
-                </w:p>
-              </w:tc>
-              <w:tc>
-                <w:tcPr/>
-                <w:p>
-                  <w:pPr>
-                    <w:pStyle w:val="Compact"/>
-                    <w:jc w:val="right"/>
-                    <w:jc w:val="center"/>
-                  </w:pPr>
-                  <w:r>
-                    <w:t xml:space="preserve">≤0.001</w:t>
-                  </w:r>
-                </w:p>
-              </w:tc>
-              <w:tc>
-                <w:tcPr/>
-                <w:p>
-                  <w:pPr>
-                    <w:pStyle w:val="Compact"/>
-                    <w:jc w:val="right"/>
-                    <w:jc w:val="center"/>
-                  </w:pPr>
-                  <w:r>
-                    <w:t xml:space="preserve">2.1509</w:t>
-                  </w:r>
-                </w:p>
-              </w:tc>
-              <w:tc>
-                <w:tcPr/>
-                <w:p>
-                  <w:pPr>
-                    <w:pStyle w:val="Compact"/>
-                    <w:jc w:val="right"/>
-                    <w:jc w:val="center"/>
-                  </w:pPr>
-                  <w:r>
-                    <w:t xml:space="preserve">10.76</w:t>
-                  </w:r>
-                </w:p>
-              </w:tc>
-              <w:tc>
-                <w:tcPr/>
-                <w:p>
-                  <w:pPr>
-                    <w:pStyle w:val="Compact"/>
-                    <w:jc w:val="right"/>
-                    <w:jc w:val="center"/>
-                  </w:pPr>
-                  <w:r>
-                    <w:t xml:space="preserve">38.99</w:t>
-                  </w:r>
-                </w:p>
-              </w:tc>
-              <w:tc>
-                <w:tcPr/>
-                <w:p>
-                  <w:pPr>
-                    <w:pStyle w:val="Compact"/>
-                    <w:jc w:val="right"/>
-                    <w:jc w:val="center"/>
-                  </w:pPr>
-                  <w:r>
-                    <w:t xml:space="preserve">0.1258</w:t>
+                    <w:t xml:space="preserve">M3 ignition</w:t>
+                  </w:r>
+                </w:p>
+              </w:tc>
+              <w:tc>
+                <w:tcPr/>
+                <w:p>
+                  <w:pPr>
+                    <w:pStyle w:val="Compact"/>
+                    <w:jc w:val="right"/>
+                    <w:jc w:val="center"/>
+                  </w:pPr>
+                  <w:r>
+                    <w:t xml:space="preserve">0.7534</w:t>
+                  </w:r>
+                </w:p>
+              </w:tc>
+              <w:tc>
+                <w:tcPr/>
+                <w:p>
+                  <w:pPr>
+                    <w:pStyle w:val="Compact"/>
+                    <w:jc w:val="right"/>
+                    <w:jc w:val="center"/>
+                  </w:pPr>
+                  <w:r>
+                    <w:t xml:space="preserve">0.2340</w:t>
+                  </w:r>
+                </w:p>
+              </w:tc>
+              <w:tc>
+                <w:tcPr/>
+                <w:p>
+                  <w:pPr>
+                    <w:pStyle w:val="Compact"/>
+                    <w:jc w:val="right"/>
+                    <w:jc w:val="center"/>
+                  </w:pPr>
+                  <w:r>
+                    <w:t xml:space="preserve">—</w:t>
+                  </w:r>
+                </w:p>
+              </w:tc>
+              <w:tc>
+                <w:tcPr/>
+                <w:p>
+                  <w:pPr>
+                    <w:pStyle w:val="Compact"/>
+                    <w:jc w:val="right"/>
+                    <w:jc w:val="center"/>
+                  </w:pPr>
+                  <w:r>
+                    <w:t xml:space="preserve">—</w:t>
+                  </w:r>
+                </w:p>
+              </w:tc>
+              <w:tc>
+                <w:tcPr/>
+                <w:p>
+                  <w:pPr>
+                    <w:pStyle w:val="Compact"/>
+                    <w:jc w:val="right"/>
+                    <w:jc w:val="center"/>
+                  </w:pPr>
+                  <w:r>
+                    <w:t xml:space="preserve">0.2186</w:t>
+                  </w:r>
+                </w:p>
+              </w:tc>
+              <w:tc>
+                <w:tcPr/>
+                <w:p>
+                  <w:pPr>
+                    <w:pStyle w:val="Compact"/>
+                    <w:jc w:val="right"/>
+                    <w:jc w:val="center"/>
+                  </w:pPr>
+                  <w:r>
+                    <w:t xml:space="preserve">30.13</w:t>
+                  </w:r>
+                </w:p>
+              </w:tc>
+              <w:tc>
+                <w:tcPr/>
+                <w:p>
+                  <w:pPr>
+                    <w:pStyle w:val="Compact"/>
+                    <w:jc w:val="right"/>
+                    <w:jc w:val="center"/>
+                  </w:pPr>
+                  <w:r>
+                    <w:t xml:space="preserve">18.59</w:t>
+                  </w:r>
+                </w:p>
+              </w:tc>
+              <w:tc>
+                <w:tcPr/>
+                <w:p>
+                  <w:pPr>
+                    <w:pStyle w:val="Compact"/>
+                    <w:jc w:val="right"/>
+                    <w:jc w:val="center"/>
+                  </w:pPr>
+                  <w:r>
+                    <w:t xml:space="preserve">0.2680</w:t>
                   </w:r>
                 </w:p>
               </w:tc>
@@ -3665,6 +3665,138 @@
                     <w:jc w:val="center"/>
                   </w:pPr>
                   <w:r>
+                    <w:t xml:space="preserve">Full Canadian FWI</w:t>
+                  </w:r>
+                </w:p>
+              </w:tc>
+              <w:tc>
+                <w:tcPr/>
+                <w:p>
+                  <w:pPr>
+                    <w:pStyle w:val="Compact"/>
+                    <w:jc w:val="right"/>
+                    <w:jc w:val="center"/>
+                  </w:pPr>
+                  <w:r>
+                    <w:t xml:space="preserve">0.5564</w:t>
+                  </w:r>
+                </w:p>
+              </w:tc>
+              <w:tc>
+                <w:tcPr/>
+                <w:p>
+                  <w:pPr>
+                    <w:pStyle w:val="Compact"/>
+                    <w:jc w:val="right"/>
+                    <w:jc w:val="center"/>
+                  </w:pPr>
+                  <w:r>
+                    <w:t xml:space="preserve">0.1061</w:t>
+                  </w:r>
+                </w:p>
+              </w:tc>
+              <w:tc>
+                <w:tcPr/>
+                <w:p>
+                  <w:pPr>
+                    <w:pStyle w:val="Compact"/>
+                    <w:jc w:val="right"/>
+                    <w:jc w:val="center"/>
+                  </w:pPr>
+                  <w:r>
+                    <w:t xml:space="preserve">+0.1970</w:t>
+                  </w:r>
+                </w:p>
+              </w:tc>
+              <w:tc>
+                <w:tcPr/>
+                <w:p>
+                  <w:pPr>
+                    <w:pStyle w:val="Compact"/>
+                    <w:jc w:val="right"/>
+                    <w:jc w:val="center"/>
+                  </w:pPr>
+                  <w:r>
+                    <w:t xml:space="preserve">≤0.001</w:t>
+                  </w:r>
+                </w:p>
+              </w:tc>
+              <w:tc>
+                <w:tcPr/>
+                <w:p>
+                  <w:pPr>
+                    <w:pStyle w:val="Compact"/>
+                    <w:jc w:val="right"/>
+                    <w:jc w:val="center"/>
+                  </w:pPr>
+                  <w:r>
+                    <w:t xml:space="preserve">2.1509</w:t>
+                  </w:r>
+                </w:p>
+              </w:tc>
+              <w:tc>
+                <w:tcPr/>
+                <w:p>
+                  <w:pPr>
+                    <w:pStyle w:val="Compact"/>
+                    <w:jc w:val="right"/>
+                    <w:jc w:val="center"/>
+                  </w:pPr>
+                  <w:r>
+                    <w:t xml:space="preserve">10.76</w:t>
+                  </w:r>
+                </w:p>
+              </w:tc>
+              <w:tc>
+                <w:tcPr/>
+                <w:p>
+                  <w:pPr>
+                    <w:pStyle w:val="Compact"/>
+                    <w:jc w:val="right"/>
+                    <w:jc w:val="center"/>
+                  </w:pPr>
+                  <w:r>
+                    <w:t xml:space="preserve">38.99</w:t>
+                  </w:r>
+                </w:p>
+              </w:tc>
+              <w:tc>
+                <w:tcPr/>
+                <w:p>
+                  <w:pPr>
+                    <w:pStyle w:val="Compact"/>
+                    <w:jc w:val="right"/>
+                    <w:jc w:val="center"/>
+                  </w:pPr>
+                  <w:r>
+                    <w:t xml:space="preserve">0.1258</w:t>
+                  </w:r>
+                </w:p>
+              </w:tc>
+            </w:tr>
+            <w:tr>
+              <w:tc>
+                <w:tcPr/>
+                <w:p>
+                  <w:pPr>
+                    <w:pStyle w:val="Compact"/>
+                    <w:jc w:val="left"/>
+                    <w:jc w:val="center"/>
+                  </w:pPr>
+                  <w:r>
+                    <w:t xml:space="preserve">Oriental</w:t>
+                  </w:r>
+                </w:p>
+              </w:tc>
+              <w:tc>
+                <w:tcPr/>
+                <w:p>
+                  <w:pPr>
+                    <w:pStyle w:val="Compact"/>
+                    <w:jc w:val="left"/>
+                    <w:jc w:val="center"/>
+                  </w:pPr>
+                  <w:r>
                     <w:t xml:space="preserve">INPE Risco de Fogo</w:t>
                   </w:r>
                 </w:p>
@@ -3770,6 +3902,138 @@
                   </w:pPr>
                   <w:r>
                     <w:t xml:space="preserve">0.1123</w:t>
+                  </w:r>
+                </w:p>
+              </w:tc>
+            </w:tr>
+            <w:tr>
+              <w:tc>
+                <w:tcPr/>
+                <w:p>
+                  <w:pPr>
+                    <w:pStyle w:val="Compact"/>
+                    <w:jc w:val="left"/>
+                    <w:jc w:val="center"/>
+                  </w:pPr>
+                  <w:r>
+                    <w:t xml:space="preserve">Oriental</w:t>
+                  </w:r>
+                </w:p>
+              </w:tc>
+              <w:tc>
+                <w:tcPr/>
+                <w:p>
+                  <w:pPr>
+                    <w:pStyle w:val="Compact"/>
+                    <w:jc w:val="left"/>
+                    <w:jc w:val="center"/>
+                  </w:pPr>
+                  <w:r>
+                    <w:t xml:space="preserve">Weather-only GBT</w:t>
+                  </w:r>
+                </w:p>
+              </w:tc>
+              <w:tc>
+                <w:tcPr/>
+                <w:p>
+                  <w:pPr>
+                    <w:pStyle w:val="Compact"/>
+                    <w:jc w:val="right"/>
+                    <w:jc w:val="center"/>
+                  </w:pPr>
+                  <w:r>
+                    <w:t xml:space="preserve">0.5645</w:t>
+                  </w:r>
+                </w:p>
+              </w:tc>
+              <w:tc>
+                <w:tcPr/>
+                <w:p>
+                  <w:pPr>
+                    <w:pStyle w:val="Compact"/>
+                    <w:jc w:val="right"/>
+                    <w:jc w:val="center"/>
+                  </w:pPr>
+                  <w:r>
+                    <w:t xml:space="preserve">0.1077</w:t>
+                  </w:r>
+                </w:p>
+              </w:tc>
+              <w:tc>
+                <w:tcPr/>
+                <w:p>
+                  <w:pPr>
+                    <w:pStyle w:val="Compact"/>
+                    <w:jc w:val="right"/>
+                    <w:jc w:val="center"/>
+                  </w:pPr>
+                  <w:r>
+                    <w:t xml:space="preserve">+0.1889</w:t>
+                  </w:r>
+                </w:p>
+              </w:tc>
+              <w:tc>
+                <w:tcPr/>
+                <w:p>
+                  <w:pPr>
+                    <w:pStyle w:val="Compact"/>
+                    <w:jc w:val="right"/>
+                    <w:jc w:val="center"/>
+                  </w:pPr>
+                  <w:r>
+                    <w:t xml:space="preserve">≤0.001</w:t>
+                  </w:r>
+                </w:p>
+              </w:tc>
+              <w:tc>
+                <w:tcPr/>
+                <w:p>
+                  <w:pPr>
+                    <w:pStyle w:val="Compact"/>
+                    <w:jc w:val="right"/>
+                    <w:jc w:val="center"/>
+                  </w:pPr>
+                  <w:r>
+                    <w:t xml:space="preserve">0.0975</w:t>
+                  </w:r>
+                </w:p>
+              </w:tc>
+              <w:tc>
+                <w:tcPr/>
+                <w:p>
+                  <w:pPr>
+                    <w:pStyle w:val="Compact"/>
+                    <w:jc w:val="right"/>
+                    <w:jc w:val="center"/>
+                  </w:pPr>
+                  <w:r>
+                    <w:t xml:space="preserve">11.08</w:t>
+                  </w:r>
+                </w:p>
+              </w:tc>
+              <w:tc>
+                <w:tcPr/>
+                <w:p>
+                  <w:pPr>
+                    <w:pStyle w:val="Compact"/>
+                    <w:jc w:val="right"/>
+                    <w:jc w:val="center"/>
+                  </w:pPr>
+                  <w:r>
+                    <w:t xml:space="preserve">42.44</w:t>
+                  </w:r>
+                </w:p>
+              </w:tc>
+              <w:tc>
+                <w:tcPr/>
+                <w:p>
+                  <w:pPr>
+                    <w:pStyle w:val="Compact"/>
+                    <w:jc w:val="right"/>
+                    <w:jc w:val="center"/>
+                  </w:pPr>
+                  <w:r>
+                    <w:t xml:space="preserve">0.1300</w:t>
                   </w:r>
                 </w:p>
               </w:tc>
@@ -4061,6 +4325,14 @@
       </w:r>
       <w:r>
         <w:t xml:space="preserve">shows the corresponding ROC and precision–recall curves. The canonical indices are close to the diagonal in Chaco; in Oriental they are also weak and do not improve materially over a climatological baseline. Full FWI has ROC-AUC 0.5173/0.5564 and INPE 0.5389/0.4990; neither is competitive with M3 on the same retrospective dates. The result is not a claim that the indices are universally invalid, but that their transfer to this subtropical system is not supported. FWI and INPE are normalized danger indices, so their apparent operating point depends strongly on the cutoff chosen on validation. In Chaco, full FWI reaches high recall only at very low precision, while INPE is conservative in both regions; neither behavior translates into a competitive ranking. PR-AUC values are close to the 0.09 case-control baseline, which means that the indices add little discrimination beyond chance on these retrospective dates.</w:t>
+      </w:r>
+    </w:p>
+    <w:p>
+      <w:pPr>
+        <w:pStyle w:val="BodyText"/>
+      </w:pPr>
+      <w:r>
+        <w:t xml:space="preserve">The weather-only control isolates the source of the gap. A LightGBM trained with the same capacity, calibration and cutoff rule but restricted to the FWI information set (temperature, atmospheric demand, wind, rainfall, FFMC and ISI) reaches ROC-AUC 0.5512/0.5645 (Chaco/Oriental), only +0.0339/+0.0081 above full FWI and far below M3 (0.8021/0.7534; ΔROC = +0.2509/+0.1889, p ≤ 0.001). The failure of the canonical indices is therefore an information limitation rather than an artefact of their formulation or of the learner: without fuel, accessibility and anthropogenic priors, a modern gradient-boosted learner recovers essentially the same ceiling as the index. Full details are in Supplementary Table S21.</w:t>
       </w:r>
     </w:p>
     <w:p>
@@ -4155,7 +4427,7 @@
               <w:pStyle w:val="ImageCaption"/>
             </w:pPr>
             <w:r>
-              <w:t xml:space="preserve">Figure 4: ROC and precision–recall curves for M3 against full Canadian FWI and INPE under D2.</w:t>
+              <w:t xml:space="preserve">Figure 4: ROC and precision–recall curves for M3 against full Canadian FWI, INPE and the weather-only GBT under D2.</w:t>
             </w:r>
           </w:p>
           <w:bookmarkEnd w:id="35"/>

</xml_diff>

<commit_message>
feat(stats): aplica Holm-Bonferroni y BH al benchmark (R.6)
</commit_message>
<xml_diff>
--- a/entregables/en/manuscrito.docx
+++ b/entregables/en/manuscrito.docx
@@ -1067,7 +1067,7 @@
         <w:pStyle w:val="FirstParagraph"/>
       </w:pPr>
       <w:r>
-        <w:t xml:space="preserve">The bootstrap resamples dates rather than rows, because daily fire activity is strongly temporally clustered. For each replicate, all cells from the sampled dates are retained; this preserves within-day dependence and gives more honest intervals than row-wise resampling. The same block structure is used for paired differences against FWI and INPE. The spatial holdout divides the country into 50-km blocks, removes an entire block and a 20-km buffer from training, recomputes the historical priors without the held-out fires and evaluates both held-in and held-out cells. The primary metrics are the area under the receiver operating characteristic curve (ROC-AUC) and precision–recall area under the curve (PR-AUC). We also report Brier score, expected calibration error, precision, recall, F0.5 and false positives at the validation cutoff. AUC confidence intervals use 500 grouped bootstrap replicates; paired model differences use 1 000 replicates. Because four main comparisons are made against FWI and INPE, the significance statements should be read as a conservative screening result rather than as multiplicity-adjusted inference. The bootstrap resolution is 0.001, so p-values are reported as ≤0.001. The protocol is applied without modifying the test set. The target operator, the list of test cell-days and the evaluation scripts are archived with the code release. The complete protocol is reported in Supplementary Note S3 and Tables S7–S14.</w:t>
+        <w:t xml:space="preserve">The bootstrap resamples dates rather than rows, because daily fire activity is strongly temporally clustered. For each replicate, all cells from the sampled dates are retained; this preserves within-day dependence and gives more honest intervals than row-wise resampling. The same block structure is used for paired differences against FWI and INPE. The spatial holdout divides the country into 50-km blocks, removes an entire block and a 20-km buffer from training, recomputes the historical priors without the held-out fires and evaluates both held-in and held-out cells. The primary metrics are the area under the receiver operating characteristic curve (ROC-AUC) and precision–recall area under the curve (PR-AUC). We also report Brier score, expected calibration error, precision, recall, F0.5 and false positives at the validation cutoff. AUC confidence intervals use 500 grouped bootstrap replicates; paired model differences use 1 000 replicates. We define a pre-specified family of six confirmatory comparisons (four against FWI and INPE and two M3 − M2) and report Holm–Bonferroni and Benjamini–Hochberg adjusted p-values; all remain significant at α = 0.05 (Holm p = 0.006, BH p = 0.001). The bootstrap resolution is 0.001, so raw p-values at the floor are upper bounds. The protocol is applied without modifying the test set. The target operator, the list of test cell-days and the evaluation scripts are archived with the code release. The complete protocol is reported in Supplementary Note S3 and Tables S7–S14.</w:t>
       </w:r>
     </w:p>
     <w:bookmarkEnd w:id="17"/>
@@ -2787,7 +2787,7 @@
         <w:t xml:space="preserve"> </w:t>
       </w:r>
       <w:r>
-        <w:t xml:space="preserve">compares M3 with full FWI and INPE on the same retrospective test. M3 exceeds FWI by ΔROC = +0.2848 in Chaco and +0.1970 in Oriental, and INPE by +0.2633 and +0.2544. All paired comparisons have p ≤ 0.001 with B = 1 000. To keep the comparison symmetric, the FWI and INPE operating points were selected on the same 2023 validation split with the identical F0.5 rule applied to the models and then frozen for the retrospective test (</w:t>
+        <w:t xml:space="preserve">compares M3 with full FWI and INPE on the same retrospective test. M3 exceeds FWI by ΔROC = +0.2848 in Chaco and +0.1970 in Oriental, and INPE by +0.2633 and +0.2544. All paired comparisons have raw p ≤ 0.001 with B = 1 000; Holm-adjusted p = 0.006 and BH-adjusted p = 0.001, so all six remain significant at α = 0.05. To keep the comparison symmetric, the FWI and INPE operating points were selected on the same 2023 validation split with the identical F0.5 rule applied to the models and then frozen for the retrospective test (</w:t>
       </w:r>
       <w:hyperlink w:anchor="tbl-benchmark">
         <w:r>
@@ -2825,7 +2825,7 @@
               <w:pStyle w:val="ImageCaption"/>
             </w:pPr>
             <w:r>
-              <w:t xml:space="preserve">Table 3: Benchmark on the retrospective 2024–2025 test. ΔROC is M3 minus the reference. Cutoffs for every row, including FWI and INPE, were selected on 2023 validation by maximizing F0.5 and then frozen for 2024–2025; precision and recall are case-control at that cutoff. FWI is on the Canadian index scale and INPE on a 0–1 risk scale, so cutoffs are not comparable across indices. The weather-only GBT is a LightGBM trained with the same capacity and calibration but restricted to the FWI information set. Dashes (—) indicate reference models or comparisons not evaluated by construction. The full table is Supplementary Table S11.</w:t>
+              <w:t xml:space="preserve">Table 3: Benchmark on the retrospective 2024–2025 test. ΔROC is M3 minus the reference. Cutoffs for every row, including FWI and INPE, were selected on 2023 validation by maximizing F0.5 and then frozen for 2024–2025; precision and recall are case-control at that cutoff. FWI is on the Canadian index scale and INPE on a 0–1 risk scale, so cutoffs are not comparable across indices. The weather-only GBT is a LightGBM trained with the same capacity and calibration but restricted to the FWI information set. Dashes (—) indicate reference models or comparisons not evaluated by construction. The p column reports raw p-values; Holm-adjusted p is 0.006 for the six-test confirmatory family (Supplementary Table S7). The full table is Supplementary Table S11.</w:t>
             </w:r>
           </w:p>
           <w:tbl>
@@ -2925,7 +2925,7 @@
                     <w:jc w:val="center"/>
                   </w:pPr>
                   <w:r>
-                    <w:t xml:space="preserve">p</w:t>
+                    <w:t xml:space="preserve">p (raw)</w:t>
                   </w:r>
                 </w:p>
               </w:tc>

</xml_diff>

<commit_message>
feat(stats): agrega IC poblacionales y curvas por presupuesto (R.11)
</commit_message>
<xml_diff>
--- a/entregables/en/manuscrito.docx
+++ b/entregables/en/manuscrito.docx
@@ -87,7 +87,7 @@
         <w:t xml:space="preserve">t</w:t>
       </w:r>
       <w:r>
-        <w:t xml:space="preserve">−1 fire inputs, using M2 as a fallback for cells without history and M1 as a biophysical baseline. On 2023 validation, M3 reaches ROC-AUC 0.7844/0.7628 (Chaco/Oriental) versus 0.7817/0.7496 for M2. In 2023 spatial blocks, M2 is most robust (0.6773/0.7470); M1 does not beat M2 on cells without history. An independent confirmation holdout also retained M2 (0.6871/0.6621). On the retrospective 2024–2025 test, M3 reaches 0.8021/0.7534 versus 0.5173/0.5564 for the Canadian Forest Fire Weather Index (FWI) and 0.5389/0.4990 for the INPE Risco de Fogo; propagation reaches 0.9039/0.7859. Population-level ignition precision is 0.082 %/0.198 %, confirming that the system is a nowcasting and prioritization tool rather than a stand-alone warning system. The contribution lies in the open D2 operator, gated inference and evaluation harness, released as reproducible software.</w:t>
+        <w:t xml:space="preserve">−1 fire inputs, using M2 as a fallback for cells without history and M1 as a biophysical baseline. On 2023 validation, M3 reaches ROC-AUC 0.7844/0.7628 (Chaco/Oriental) versus 0.7817/0.7496 for M2. In 2023 spatial blocks, M2 is most robust (0.6773/0.7470); M1 does not beat M2 on cells without history. An independent confirmation holdout also retained M2 (0.6871/0.6621). On the retrospective 2024–2025 test, M3 reaches 0.8021/0.7534 versus 0.5173/0.5564 for the Canadian Forest Fire Weather Index (FWI) and 0.5389/0.4990 for the INPE Risco de Fogo; propagation reaches 0.9039/0.7859. Population-level ignition precision is 0.082 %/0.198 % (95 % CI 0.075–0.088/0.178–0.222), confirming that the system is a nowcasting and prioritization tool rather than a stand-alone warning system. The contribution lies in the open D2 operator, gated inference and evaluation harness, released as reproducible software.</w:t>
       </w:r>
     </w:p>
     <w:p>
@@ -2671,7 +2671,7 @@
         <w:pStyle w:val="BodyText"/>
       </w:pPr>
       <w:r>
-        <w:t xml:space="preserve">Population-level ignition precision is 0.082 % in Chaco and 0.198 % in Oriental. Propagation precision is 9.67 % and 4.78 %. These are the operationally relevant values and are much lower than the case-control values. Relative to prevalence, ignition precision is about 5.4× and 4.8× above chance, while propagation precision is about 62× and 23× above chance. Absolute precision remains low; the model is therefore a prioritization and nowcast layer, not a stand-alone alert system.</w:t>
+        <w:t xml:space="preserve">Population-level ignition precision is 0.082 % (95 % bootstrap CI 0.075–0.088) in Chaco and 0.198 % (0.178–0.222) in Oriental; recall is 27.3 % (26.2–28.6) and 20.7 % (19.3–22.3). Propagation precision is 9.67 % (9.09–10.32) and 4.78 % (4.13–5.49). These are the operationally relevant values and are much lower than the case-control values. Relative to prevalence, ignition precision is about 5.4× and 4.8× above chance, while propagation precision is about 62× and 23× above chance. Absolute precision remains low; the model is therefore a prioritization and nowcast layer, not a stand-alone alert system. Figure S8 shows the precision–budget trade-off: at 100 alerts/day, M3 ignition precision is 0.21 %/0.66 % and propagation precision is 22.1 %/10.0 %, falling to 0.15 %/0.28 % and 5.1 %/3.3 % at 1 000 alerts/day.</w:t>
       </w:r>
     </w:p>
     <w:p>
@@ -4866,6 +4866,14 @@
         <w:pStyle w:val="BodyText"/>
       </w:pPr>
       <w:r>
+        <w:t xml:space="preserve">Because the test is temporal, 90.65 % of its cells also appear in training. Restricting to cells never seen in training (n = 23 074/9 378; 2 115/882 positives) lowers M3 ROC-AUC from 0.8021/0.7534 to 0.7841/0.7148 and M2 from 0.7991/0.7406 to 0.7781/0.7089, but the M3 &gt; M2 ordering persists in ROC-AUC (+0.0060/+0.0059; paired bootstrap p = 0.004/0.174) and in PR-AUC (+0.0152/+0.0133; p = 0.012/0.018). Excluding cells with any fire in training keeps the ROC gap positive and resolved (p = 0.008/≤0.001); in 2025 the gap is positive but only resolved in Oriental (p = 0.120/≤0.001). In the no-history domain the sign reverses by region: M2 is ahead in Chaco (Δ = −0.0035, p = 0.002) and M3 in Oriental (Δ = +0.0101, p ≤ 0.001). The drop is modest, but the unseen-cell subset is small, spatially biased and not a substitute for a blind spatial holdout (Supplementary Table S27).</w:t>
+      </w:r>
+    </w:p>
+    <w:p>
+      <w:pPr>
+        <w:pStyle w:val="BodyText"/>
+      </w:pPr>
+      <w:r>
         <w:t xml:space="preserve">With t-1 weather, M3 retains 0.7831/0.7613 and M2 0.7818/0.7463; M1 is lower and is reported in Supplementary Table S9. The small M3 drop shows that recurrence priors, not same-day weather, dominate the hybrid signal. This is why the current system is a nowcast/hindcast; a real day-ahead system would require forecast weather. Lead-time details are in Supplementary Table S9. As a direct leakage comparator, a coupled model trained on the combined fire sample with t-1 fire inputs did not materially outperform the decoupled task architecture: 0.8862 vs 0.8868 ROC-AUC in Chaco and 0.7871 vs 0.7806 in Oriental. This comparator uses the same gated case-control sample, so it does not test removal of gating; it only shows that the coupled shortcut does not provide a large advantage on this sample (Supplementary Table S19). A full 3 × 3 D2 sensitivity (15/25/35 km × 7/10/14 d) regenerated the 1:10 sampling and retrained M1, M2 and M3 for every combination. M3 outperformed M2 in all nine combinations on both validation and test, with a positive M3 − M2 ROC-AUC of +0.004 to +0.016, and was the best test model in all nine; its range was 0.771–0.782 in 2023 and 0.785–0.797 in Chaco for 2024–2025, and 0.759–0.768 and 0.750–0.755 in Oriental. The 7-day window gave the highest ROC-AUC in every region × radius pair, and the radius effect was small: 35 km was slightly better in Chaco and 25 km in Oriental. The D2 conclusion is therefore not an artefact of the 25 km/10 d choice (Supplementary Table S20).</w:t>
       </w:r>
     </w:p>
@@ -5369,7 +5377,7 @@
         <w:t xml:space="preserve"> </w:t>
       </w:r>
       <w:r>
-        <w:t xml:space="preserve">Although D2 sensitivity across 15/25/35-km radii and 7/10/14-day windows confirmed that model rankings are stable under full retraining (Supplementary Table S20), the 2024–2025 test is retrospective rather than blind and shares 90.65 % of its active cells with the training period through temporal overlap. M3 loses its predictive advantage in unseen spatial blocks, which requires M2 as the operational fallback while M1 remains an insufficient baseline; conformal coverage (90.17 %/90.31 % at the 90 % level) is empirical rather than formally guaranteed under temporal shift; and the coupled</w:t>
+        <w:t xml:space="preserve">Although D2 sensitivity across 15/25/35-km radii and 7/10/14-day windows confirmed that model rankings are stable under full retraining (Supplementary Table S20), the 2024–2025 test is retrospective rather than blind and shares 90.65 % of its active cells with the training period through temporal overlap; restricting to cells never seen in training reduces M3 ROC-AUC by 0.018/0.039 but keeps a positive M3 &gt; M2 gap in ROC-AUC and PR-AUC, although the ROC gap is not resolved in Oriental (Supplementary Table S27). M3 loses its predictive advantage in unseen spatial blocks, which requires M2 as the operational fallback while M1 remains an insufficient baseline; conformal coverage (90.17 %/90.31 % at the 90 % level) is empirical rather than formally guaranteed under temporal shift; and the coupled</w:t>
       </w:r>
       <w:r>
         <w:t xml:space="preserve"> </w:t>
@@ -5417,7 +5425,7 @@
         <w:t xml:space="preserve">t</w:t>
       </w:r>
       <w:r>
-        <w:t xml:space="preserve">, it functions as a nowcast/hindcast rather than a day-ahead forecast supported by numerical weather prediction. Population-level ignition precision is very low (0.082 %/0.198 %), cost-loss shows no clear M3 advantage over M2 for ignition, and the alert layers have not yet been evaluated prospectively with an operational agency. Finally, transferring the pipeline to another country would require rebuilding the 1-km² grid, the historical priors and the prevalence metadata, and the pinned dependency lock records exact package versions without platform-specific wheel hashes (documented in the code repository).</w:t>
+        <w:t xml:space="preserve">, it functions as a nowcast/hindcast rather than a day-ahead forecast supported by numerical weather prediction. Population-level ignition precision is very low (0.082 %/0.198 %; 95 % CI 0.075–0.088/0.178–0.222), cost-loss shows no clear M3 advantage over M2 for ignition, and the alert layers have not yet been evaluated prospectively with an operational agency. Finally, transferring the pipeline to another country would require rebuilding the 1-km² grid, the historical priors and the prevalence metadata, and the pinned dependency lock records exact package versions without platform-specific wheel hashes (documented in the code repository).</w:t>
       </w:r>
     </w:p>
     <w:bookmarkEnd w:id="49"/>
@@ -5449,7 +5457,7 @@
         <w:t xml:space="preserve">t</w:t>
       </w:r>
       <w:r>
-        <w:t xml:space="preserve">−1 baseline (Supplementary Table S19). Nevertheless, population-level ignition precision remains low (0.082 %/0.198 %) and the hybrid advantage is strictly temporal rather than spatial, positioning the system as an operational screening and prioritization tool rather than a stand-alone warning system. Ultimately, the main contribution of this work is not a single susceptibility map but an open, auditable protocol—archived with public code and data—that shows where a geoscientific model holds, where it fails and how to extend the benchmark to other subtropical regions and to day-ahead weather forecasts.</w:t>
+        <w:t xml:space="preserve">−1 baseline (Supplementary Table S19). Nevertheless, population-level ignition precision remains low (0.082 %/0.198 %; 95 % CI 0.075–0.088/0.178–0.222) and the hybrid advantage is strictly temporal rather than spatial, positioning the system as an operational screening and prioritization tool rather than a stand-alone warning system. Ultimately, the main contribution of this work is not a single susceptibility map but an open, auditable protocol—archived with public code and data—that shows where a geoscientific model holds, where it fails and how to extend the benchmark to other subtropical regions and to day-ahead weather forecasts.</w:t>
       </w:r>
     </w:p>
     <w:bookmarkEnd w:id="51"/>

</xml_diff>

<commit_message>
feat(decision): agrega IC, curvas de decision y carga operativa (C.1-C.5)
</commit_message>
<xml_diff>
--- a/entregables/en/manuscrito.docx
+++ b/entregables/en/manuscrito.docx
@@ -4892,7 +4892,7 @@
         <w:pStyle w:val="FirstParagraph"/>
       </w:pPr>
       <w:r>
-        <w:t xml:space="preserve">The cost-loss analysis is sobering for ignition: M3 does not clearly outperform M2, and in the Chaco M2 is slightly better at the optimum. The propagation layer does show value near</w:t>
+        <w:t xml:space="preserve">The cost-loss analysis is sobering for ignition: in Chaco, M3 and M2 are indistinguishable at every α (paired ΔV intervals include zero), and the M2 point estimate is marginally higher at the optimum (0.373 vs 0.372). In Oriental, M3 exceeds M2 for α = 0.0002–0.005. Against FWI, M3 has positive decision value for α = 0.0001–0.001 in Chaco and 0.0001–0.005 in Oriental (paired intervals exclude zero; Supplementary Table S24). The propagation layer does show value near</w:t>
       </w:r>
       <w:r>
         <w:t xml:space="preserve"> </w:t>
@@ -4908,7 +4908,89 @@
         <w:t xml:space="preserve"> </w:t>
       </w:r>
       <w:r>
-        <w:t xml:space="preserve">= 0.002. The full cost-loss table and curves are in Supplementary Table S14 and Supplementary Figure S3. The operational product therefore prioritizes propagation and uses ignition as a screening layer.</w:t>
+        <w:t xml:space="preserve">= 0.002: V = 0.628 [0.608–0.646] in Chaco and 0.399 [0.371–0.419] in Oriental, with intervals excluding zero. The full cost-loss table and curves, including 95 % date-grouped bootstrap bands (B = 1 000), are in Supplementary Table S14 and Supplementary Figure S3. The operational product therefore prioritizes propagation and uses ignition as a screening layer: the ignition layer adds decision value over FWI at low α but not over M2 in Chaco.</w:t>
+      </w:r>
+    </w:p>
+    <w:p>
+      <w:pPr>
+        <w:pStyle w:val="BodyText"/>
+      </w:pPr>
+      <w:r>
+        <w:t xml:space="preserve">Decision curve analysis on the case-control sample (Figure S4; Table S23) reproduces the ordering: at</w:t>
+      </w:r>
+      <w:r>
+        <w:t xml:space="preserve"> </w:t>
+      </w:r>
+      <m:oMath>
+        <m:sSub>
+          <m:e>
+            <m:r>
+              <m:t>p</m:t>
+            </m:r>
+          </m:e>
+          <m:sub>
+            <m:r>
+              <m:t>t</m:t>
+            </m:r>
+          </m:sub>
+        </m:sSub>
+        <m:r>
+          <m:rPr>
+            <m:sty m:val="p"/>
+          </m:rPr>
+          <m:t>=</m:t>
+        </m:r>
+        <m:r>
+          <m:t>0.10</m:t>
+        </m:r>
+      </m:oMath>
+      <w:r>
+        <w:t xml:space="preserve">, M3 yields 37.6/29.4 net detections per 1 000 sampled cell-days, M2 37.7/27.3, M1 13.5/19.9 and FWI 0.1/2.8 (Chaco/Oriental); the propagation model remains positive up to</w:t>
+      </w:r>
+      <w:r>
+        <w:t xml:space="preserve"> </w:t>
+      </w:r>
+      <m:oMath>
+        <m:sSub>
+          <m:e>
+            <m:r>
+              <m:t>p</m:t>
+            </m:r>
+          </m:e>
+          <m:sub>
+            <m:r>
+              <m:t>t</m:t>
+            </m:r>
+          </m:sub>
+        </m:sSub>
+        <m:r>
+          <m:rPr>
+            <m:sty m:val="p"/>
+          </m:rPr>
+          <m:t>≈</m:t>
+        </m:r>
+        <m:r>
+          <m:t>0.7</m:t>
+        </m:r>
+      </m:oMath>
+      <w:r>
+        <w:t xml:space="preserve">. Because net benefit is computed on the case-control sample, it complements the population-weighted decision value in Table S14.</w:t>
+      </w:r>
+    </w:p>
+    <w:p>
+      <w:pPr>
+        <w:pStyle w:val="BodyText"/>
+      </w:pPr>
+      <w:r>
+        <w:t xml:space="preserve">Operationally (Table S23), at the frozen ignition cutoff M3 issues 8 238/3 073 alerts per day in Chaco/Oriental with population precision 0.082/0.198 % (1 227/504 alerts per hit; lift 5.3×/4.8×). A budget of 100 alerts/day raises ignition precision only to 0.21/0.66 % (recall 0.86/2.24 %), confirming that ignition is a screening layer. Propagation needs 10.3/20.9 alerts per hit (lift 62×/23×) at 452/525 alerts/day; at 100/day its precision is 22.1/10.0 % and recall 25.7/7.5 %. The α that maximises V(α) is 0.0001–0.0005 for ignition and 0.002 for propagation.</w:t>
+      </w:r>
+    </w:p>
+    <w:p>
+      <w:pPr>
+        <w:pStyle w:val="BodyText"/>
+      </w:pPr>
+      <w:r>
+        <w:t xml:space="preserve">At their frozen F0.5 operating points, FWI and INPE have positive decision value only in a narrow low-α window (0.0001–0.0005) and negative value for α ≥ 0.001 (V clipped at −1); even in that window they remain far below M3/M2 (Chaco FWI 0.069 vs M3 0.372 at α = 0.0001; Oriental FWI 0.095 vs M3 0.313 at α = 0.0005). Allowing the indices their best validation threshold at each α leaves the ranking unchanged (Table S24). The AUC advantage of M3 therefore translates into decision value against the indices, but not uniformly against M2.</w:t>
       </w:r>
     </w:p>
     <w:p>

</xml_diff>

<commit_message>
feat(robustez): agrega B.3-B.5, rolling-origin, semillas y validacion adversarial
</commit_message>
<xml_diff>
--- a/entregables/en/manuscrito.docx
+++ b/entregables/en/manuscrito.docx
@@ -87,7 +87,7 @@
         <w:t xml:space="preserve">t</w:t>
       </w:r>
       <w:r>
-        <w:t xml:space="preserve">−1 fire inputs, using M2 as a fallback for cells without history and M1 as a biophysical baseline. On 2023 validation, M3 reaches ROC-AUC 0.7844/0.7628 (Chaco/Oriental) versus 0.7817/0.7496 for M2. In 2023 spatial blocks, M2 is most robust (0.6773/0.7470); M1 does not beat M2 on cells without history. An independent confirmation holdout also retained M2 (0.6871/0.6621). On the retrospective 2024–2025 test, M3 reaches 0.8021/0.7534 versus 0.5173/0.5564 for the Canadian Forest Fire Weather Index (FWI) and 0.5389/0.4990 for the INPE Risco de Fogo; propagation reaches 0.9039/0.7859. Population-level ignition precision is 0.082 %/0.198 % (95 % CI 0.075–0.088/0.178–0.222), confirming that the system is a nowcasting and prioritization tool rather than a stand-alone warning system. The contribution lies in the open D2 operator, gated inference and evaluation harness, released as reproducible software.</w:t>
+        <w:t xml:space="preserve">−1 fire inputs, using M2 as a fallback for cells without history and M1 as a biophysical baseline. On 2023 validation, M3 reaches ROC-AUC 0.7844/0.7628 (Chaco/Oriental) versus 0.7817/0.7496 for M2. In 2023 spatial blocks, M2 is most robust (0.6773/0.7470); M1 does not beat M2 on cells without history. An independent confirmation holdout also retained M2 (0.6871/0.6621). On the retrospective 2024–2025 test, M3 reaches 0.8021/0.7534 versus 0.5173/0.5564 for the Canadian Forest Fire Weather Index (FWI) and 0.5389/0.4990 for the INPE Risco de Fogo; propagation reaches 0.9039/0.7859. Population-level ignition precision is 0.082 %/0.198 % (95 % CI 0.075–0.088/0.178–0.222), and decision value is concentrated in propagation, confirming a screening-and-prioritization role rather than a stand-alone warning system. The contribution is the open D2 operator, gated inference and evaluation harness, released as reproducible software.</w:t>
       </w:r>
     </w:p>
     <w:p>
@@ -339,7 +339,7 @@
         <w:pStyle w:val="BodyText"/>
       </w:pPr>
       <w:r>
-        <w:t xml:space="preserve">The remainder of the paper is organized as follows. Section 2 defines the D2 operator, the biophysical gate, the decoupled inference architecture and the evaluation harness. Section 3 reports selection on 2023 validation, the retrospective 2024–2025 test, the benchmark against FWI and INPE, the spatial and temporal generalization analyses and the operational utility. Section 4 discusses why canonical indices fail, what decoupling buys and where it fails, and the limitations of the study. Section 5 concludes.</w:t>
+        <w:t xml:space="preserve">The remainder of the paper is organized as follows. Section 2 defines the D2 operator, the biophysical gate, the decoupled inference architecture and the evaluation harness. Section 3 reports selection on 2023 validation, the retrospective 2024–2025 test, the benchmark against FWI and INPE, the spatial and temporal generalization analyses and the operational value. Section 4 discusses why canonical indices fail, what decoupling buys and where it fails, and the limitations of the study. Section 5 concludes.</w:t>
       </w:r>
     </w:p>
     <w:bookmarkEnd w:id="10"/>
@@ -1271,7 +1271,7 @@
     </w:tbl>
     <w:bookmarkEnd w:id="22"/>
     <w:bookmarkEnd w:id="23"/>
-    <w:bookmarkStart w:id="45" w:name="results"/>
+    <w:bookmarkStart w:id="46" w:name="results"/>
     <w:p>
       <w:pPr>
         <w:pStyle w:val="Heading1"/>
@@ -2798,7 +2798,7 @@
         </w:r>
       </w:hyperlink>
       <w:r>
-        <w:t xml:space="preserve">); the resulting cutoffs are 0.3029 and 0.8963 in Chaco and 2.1509 and 0.0750 in Oriental for FWI and INPE, respectively. The full benchmark, including M2 and propagation rows, is in Supplementary Table S11; the complete significance table is in Supplementary Table S7.</w:t>
+        <w:t xml:space="preserve">); the resulting cutoffs are 0.3029 and 0.8963 in Chaco and 2.1509 and 0.0750 in Oriental for FWI and INPE, respectively. The complete implementation, including fuel codes, initialization and same-day meteorology, is documented in Supplementary Note S4. The full benchmark, including M2 and propagation rows, is in Supplementary Table S11; the complete significance table is in Supplementary Table S7.</w:t>
       </w:r>
     </w:p>
     <w:tbl>
@@ -4325,6 +4325,14 @@
       </w:r>
       <w:r>
         <w:t xml:space="preserve">shows the corresponding ROC and precision–recall curves. The canonical indices are close to the diagonal in Chaco; in Oriental they are also weak and do not improve materially over a climatological baseline. Full FWI has ROC-AUC 0.5173/0.5564 and INPE 0.5389/0.4990; neither is competitive with M3 on the same retrospective dates. The result is not a claim that the indices are universally invalid, but that their transfer to this subtropical system is not supported. FWI and INPE are normalized danger indices, so their apparent operating point depends strongly on the cutoff chosen on validation. In Chaco, full FWI reaches high recall only at very low precision, while INPE is conservative in both regions; neither behavior translates into a competitive ranking. PR-AUC values are close to the 0.09 case-control baseline, which means that the indices add little discrimination beyond chance on these retrospective dates.</w:t>
+      </w:r>
+    </w:p>
+    <w:p>
+      <w:pPr>
+        <w:pStyle w:val="BodyText"/>
+      </w:pPr>
+      <w:r>
+        <w:t xml:space="preserve">Because the INPE implementation weights A by land-cover fractions (the primary specification), we repeated the benchmark with a fixed A = 3.0 (the INPE open-savanna coefficient, fixed a priori). The fixed version reaches ROC-AUC 0.4979/0.5497 versus 0.5389/0.4990 for local A (ΔROC = −0.0409/+0.0508; p = 0.001; Table S22). The sign of the difference is region-dependent, but both versions remain far below M3 (0.8021/0.7534), so the weak INPE performance is not an artefact of the local land-cover weighting. Combining the two indices with the full M3 feature set does not close the gap: the augmented GBT reaches ROC-AUC 0.8013/0.7547 versus 0.8021/0.7534 for M3 (Δ = −0.0009/+0.0013; p = 0.182/0.001; Table S11 continuation). Once fuel, accessibility and historical context are present, the indices add essentially no ranking information; in Oriental the small gain is statistically detectable but operationally negligible.</w:t>
       </w:r>
     </w:p>
     <w:p>
@@ -4874,17 +4882,17 @@
         <w:pStyle w:val="BodyText"/>
       </w:pPr>
       <w:r>
-        <w:t xml:space="preserve">With t-1 weather, M3 retains 0.7831/0.7613 and M2 0.7818/0.7463; M1 is lower and is reported in Supplementary Table S9. The small M3 drop shows that recurrence priors, not same-day weather, dominate the hybrid signal. This is why the current system is a nowcast/hindcast; a real day-ahead system would require forecast weather. Lead-time details are in Supplementary Table S9. As a direct leakage comparator, a coupled model trained on the combined fire sample with t-1 fire inputs did not materially outperform the decoupled task architecture: 0.8862 vs 0.8868 ROC-AUC in Chaco and 0.7871 vs 0.7806 in Oriental. This comparator uses the same gated case-control sample, so it does not test removal of gating; it only shows that the coupled shortcut does not provide a large advantage on this sample (Supplementary Table S19). A full 3 × 3 D2 sensitivity (15/25/35 km × 7/10/14 d) regenerated the 1:10 sampling and retrained M1, M2 and M3 for every combination. M3 outperformed M2 in all nine combinations on both validation and test, with a positive M3 − M2 ROC-AUC of +0.004 to +0.016, and was the best test model in all nine; its range was 0.771–0.782 in 2023 and 0.785–0.797 in Chaco for 2024–2025, and 0.759–0.768 and 0.750–0.755 in Oriental. The 7-day window gave the highest ROC-AUC in every region × radius pair, and the radius effect was small: 35 km was slightly better in Chaco and 25 km in Oriental. The D2 conclusion is therefore not an artefact of the 25 km/10 d choice (Supplementary Table S20).</w:t>
+        <w:t xml:space="preserve">With t-1 weather, M3 retains 0.7831/0.7613 and M2 0.7818/0.7463; M1 is lower and is reported in Supplementary Table S9. The small M3 drop shows that recurrence priors, not same-day weather, dominate the hybrid signal. This is why the current system is a nowcast/hindcast; a real day-ahead system would require forecast weather. Lead-time details are in Supplementary Table S9. As a direct leakage comparator, a coupled model trained on the combined fire sample with t-1 fire inputs did not materially outperform the decoupled task architecture: 0.8862 vs 0.8868 ROC-AUC in Chaco and 0.7871 vs 0.7806 in Oriental. This comparator uses the same gated case-control sample, so it does not test removal of gating; it only shows that the coupled shortcut does not provide a large advantage on this sample (Supplementary Table S19). A full 3 × 3 D2 sensitivity (15/25/35 km × 7/10/14 d) regenerated the 1:10 sampling and retrained M1, M2 and M3 for every combination. M3 outperformed M2 in all nine combinations on both validation and test, with a positive M3 − M2 ROC-AUC of +0.004 to +0.016, and was the best test model in all nine; its range was 0.771–0.782 in 2023 and 0.785–0.797 in Chaco for 2024–2025, and 0.759–0.768 and 0.750–0.755 in Oriental. The 7-day window gave the highest ROC-AUC in every region × radius pair, and the radius effect was small: 35 km was slightly better in Chaco and 25 km in Oriental. The D2 conclusion is therefore not an artefact of the 25 km/10 d choice (Supplementary Table S20). A four-fold rolling-origin backtest retrained M1/M2/M3 with training through Y−2, validation on Y−1 and test on Y. The M3−M2 ROC-AUC difference was +0.0030/+0.0059 in 2022, +0.0029/+0.0120 in 2023, +0.0038/+0.0166 in 2024 and +0.0019/+0.0084 in 2025 (Chaco/Oriental); the corresponding p-values were 0.032/0.006, 0.082/0.001, 0.004/0.001 and 0.148/0.001. The sign was positive in all eight region-fold comparisons, and M1 remained below M2 in every fold (Table S26; Figure S5). The temporal ordering is therefore not an artefact of the single 2024–2025 split. Across 20 runs (five seeds × two capacities × two regions), the M3−M2 difference remained positive in every run, with mean differences of +0.0036/+0.0035 in Chaco and +0.0128/+0.0128 in Oriental for the current/high-capacity configurations (Table S25). Adversarial validation separates training (2018–2022) from test (2024–2025) rows with AUC 0.8832/0.9241 (Chaco/Oriental); day-of-year, seasonal harmonics, 25-km historical density and 60-day water deficit dominate the discriminator (Table S29). The shift is real and is not eliminated by the temporal design; it is why the spatial and all-cell results are reported separately.</w:t>
       </w:r>
     </w:p>
     <w:bookmarkEnd w:id="38"/>
-    <w:bookmarkStart w:id="43" w:name="operational-utility"/>
+    <w:bookmarkStart w:id="43" w:name="operational-value"/>
     <w:p>
       <w:pPr>
         <w:pStyle w:val="Heading2"/>
       </w:pPr>
       <w:r>
-        <w:t xml:space="preserve">3.4 Operational utility</w:t>
+        <w:t xml:space="preserve">3.4 Operational value</w:t>
       </w:r>
     </w:p>
     <w:p>
@@ -4982,7 +4990,7 @@
         <w:pStyle w:val="BodyText"/>
       </w:pPr>
       <w:r>
-        <w:t xml:space="preserve">Operationally (Table S23), at the frozen ignition cutoff M3 issues 8 238/3 073 alerts per day in Chaco/Oriental with population precision 0.082/0.198 % (1 227/504 alerts per hit; lift 5.3×/4.8×). A budget of 100 alerts/day raises ignition precision only to 0.21/0.66 % (recall 0.86/2.24 %), confirming that ignition is a screening layer. Propagation needs 10.3/20.9 alerts per hit (lift 62×/23×) at 452/525 alerts/day; at 100/day its precision is 22.1/10.0 % and recall 25.7/7.5 %. The α that maximises V(α) is 0.0001–0.0005 for ignition and 0.002 for propagation.</w:t>
+        <w:t xml:space="preserve">Operationally (Table S23), at the frozen ignition cutoff M3 issues 8 238/3 073 alerts per day in Chaco/Oriental with population precision 0.082/0.198 % (1 227/504 alerts per hit; lift 5.3×/4.8×). A budget of 100 alerts/day raises ignition precision only to 0.21/0.66 % (recall 0.86/2.24 %), confirming that ignition is a screening layer. Propagation needs 10.3/20.9 alerts per hit (lift 62×/23×) at 452/525 alerts/day; at 100/day its precision is 22.1/10.0 % and recall 25.7/7.5 %. The α that maximises V(α) is 0.0001–0.0005 for ignition and 0.002 for propagation. The F0.5 cutoff is not uniquely privileged. Selecting cutoffs by F1, F2 or Youden changes the operating point but not the conclusion (Table S14 continuation; Figure S6). For M3 ignition in Chaco, precision/recall move from 0.328/0.303 at F0.5 to 0.273/0.494 at F1 and 0.182/0.815 at F2; in Oriental they move from 0.301/0.186 to 0.235/0.390 and 0.173/0.699. Propagation remains the stronger layer: Chaco precision/recall is 0.837/0.524 at F0.5 and 0.515/0.702 at F2; Oriental 0.650/0.199 and 0.215/0.632. The screening/propagation ranking is therefore robust to the threshold criterion.</w:t>
       </w:r>
     </w:p>
     <w:p>
@@ -5083,14 +5091,6 @@
       </w:r>
       <w:r>
         <w:t xml:space="preserve">. The result supports the operational choice of prioritizing propagation and treating ignition as a screening layer.</w:t>
-      </w:r>
-    </w:p>
-    <w:p>
-      <w:pPr>
-        <w:pStyle w:val="BodyText"/>
-      </w:pPr>
-      <w:r>
-        <w:t xml:space="preserve">Conformal coverage is empirical: 90.17 %/90.31 % for a nominal 90 % level and 95.32 %/94.79 % for 95 %. These values are close to nominal but do not constitute a formal guarantee under temporal shift. The result is still useful because it shows that the calibration layer is not grossly overconfident. A reliability diagram and the full conformal table are in Supplementary Table S5.</w:t>
       </w:r>
     </w:p>
     <w:p>
@@ -5223,13 +5223,13 @@
       </w:tr>
     </w:tbl>
     <w:bookmarkEnd w:id="43"/>
-    <w:bookmarkStart w:id="44" w:name="reproducibility-checks"/>
+    <w:bookmarkStart w:id="44" w:name="calibration"/>
     <w:p>
       <w:pPr>
         <w:pStyle w:val="Heading2"/>
       </w:pPr>
       <w:r>
-        <w:t xml:space="preserve">3.5 Reproducibility checks</w:t>
+        <w:t xml:space="preserve">3.5 Calibration</w:t>
       </w:r>
     </w:p>
     <w:p>
@@ -5237,6 +5237,24 @@
         <w:pStyle w:val="FirstParagraph"/>
       </w:pPr>
       <w:r>
+        <w:t xml:space="preserve">Expected calibration error for M3 is 0.0082/0.0082 in Chaco/Oriental (Table S11), and conformal coverage is empirical: 90.17 %/90.31 % for a nominal 90 % level and 95.32 %/94.79 % for 95 %. These values are close to nominal but do not constitute a formal guarantee under temporal shift. The result is still useful because it shows that the calibration layer is not grossly overconfident. A reliability diagram and the full conformal table are in Supplementary Table S5.</w:t>
+      </w:r>
+    </w:p>
+    <w:bookmarkEnd w:id="44"/>
+    <w:bookmarkStart w:id="45" w:name="reproducibility-checks"/>
+    <w:p>
+      <w:pPr>
+        <w:pStyle w:val="Heading2"/>
+      </w:pPr>
+      <w:r>
+        <w:t xml:space="preserve">3.6 Reproducibility checks</w:t>
+      </w:r>
+    </w:p>
+    <w:p>
+      <w:pPr>
+        <w:pStyle w:val="FirstParagraph"/>
+      </w:pPr>
+      <w:r>
         <w:t xml:space="preserve">The code and data releases are part of the result. The repository contains the target operator, the frozen evaluation scripts, the trained boosters and calibrators, the generated tables and a pinned environment. A clean-environment run of the 76 unit tests covers target construction, VIIRS filtering, climate aggregation, monotonic calibration, metrics and alert routing. The data archive contains the test targets and model probabilities, so the main tables can be regenerated without the raw multi-terabyte archive. The full raw-data pipeline remains available for a complete rebuild.</w:t>
       </w:r>
     </w:p>
@@ -5248,9 +5266,9 @@
         <w:t xml:space="preserve">Two practical checks are worth reporting. First, the test split is frozen and the cutoff is selected on validation; no test row is used for model selection. Second, the calibration and conformal layers are fitted before the test and never updated. These checks do not eliminate distribution shift, but they remove the most common sources of optimistic bias. The tables in this manuscript are regenerated from the repository and correspond to release v2.0.1; the code and data concept DOIs are reported in the Code and Data Availability sections.</w:t>
       </w:r>
     </w:p>
-    <w:bookmarkEnd w:id="44"/>
     <w:bookmarkEnd w:id="45"/>
-    <w:bookmarkStart w:id="50" w:name="discussion"/>
+    <w:bookmarkEnd w:id="46"/>
+    <w:bookmarkStart w:id="51" w:name="discussion"/>
     <w:p>
       <w:pPr>
         <w:pStyle w:val="Heading1"/>
@@ -5259,7 +5277,7 @@
         <w:t xml:space="preserve">4. Discussion</w:t>
       </w:r>
     </w:p>
-    <w:bookmarkStart w:id="46" w:name="why-canonical-indices-fail"/>
+    <w:bookmarkStart w:id="47" w:name="why-canonical-indices-fail"/>
     <w:p>
       <w:pPr>
         <w:pStyle w:val="Heading2"/>
@@ -5273,7 +5291,7 @@
         <w:pStyle w:val="FirstParagraph"/>
       </w:pPr>
       <w:r>
-        <w:t xml:space="preserve">Full FWI and INPE are weak in both regions. The Chaco is moisture-limited and fuel-limited at the same time: fine fuels cure quickly under high VPD, but ignition depends on human access, pasture management and fire history. A single weather index cannot represent that interaction. The Canadian FWI was originally designed for boreal conifer stands, and two of its three fuel-moisture codes (the Duff Moisture Code and the Drought Code) explicitly model the slow drying and rain recharge of loosely and deeply compacted organic layers over days to weeks</w:t>
+        <w:t xml:space="preserve">Full FWI and INPE are weak in both regions. The Chaco is moisture-limited and fuel-limited at the same time: fine fuels cure quickly under high VPD, but ignition depends on human access, pasture management and fire history. A single index cannot represent that interaction. The Canadian FWI was originally designed for boreal conifer stands, and two of its three fuel-moisture codes (the Duff Moisture Code and the Drought Code) explicitly model the slow drying and rain recharge of loosely and deeply compacted organic layers over days to weeks</w:t>
       </w:r>
       <w:r>
         <w:t xml:space="preserve"> </w:t>
@@ -5282,7 +5300,7 @@
         <w:t xml:space="preserve">(Flannigan et al., 2016; Van Wagner, 1987)</w:t>
       </w:r>
       <w:r>
-        <w:t xml:space="preserve">. In the semi-arid Chaco, the load-bearing fuels are fine grassy and shrub fuels that respond within hours to atmospheric demand, while the spatial pattern of ignition is governed by land-management and access-related sources. A purely meteorological index therefore carries no information about where those anthropogenic ignition sources are located, and its ranking skill collapses toward chance under a decoupled D2 evaluation. In the Oriental Region, the signal is more anthropogenic and less dependent on same-day weather. These results do not imply that FWI or INPE are useless globally; they show that their transfer to this subtropical system is not supported by the retrospective test.</w:t>
+        <w:t xml:space="preserve">. In the semi-arid Chaco, the load-bearing fuels are fine grassy and shrub fuels that respond within hours to atmospheric demand, while the spatial pattern of ignition is governed by land-management and access-related sources. FWI is purely meteorological; the INPE formulation used here incorporates land-cover fractions, yet neither carries the fine-scale anthropogenic and accessibility information that dominates ignition in the Chaco, and their ranking skill collapses toward chance under a decoupled D2 evaluation. In the Oriental Region, the signal is more anthropogenic and less dependent on same-day weather. These results do not imply that FWI or INPE are useless globally; they show that their transfer to this subtropical system is not supported by the retrospective test. These indices are not only weaker rankers; wherever either remains positive, they also generate less decision value than M3 (Table S14).</w:t>
       </w:r>
     </w:p>
     <w:p>
@@ -5301,8 +5319,8 @@
         <w:t xml:space="preserve">The weak FWI/INPE performance also has a practical implication: switching to a “better index” is not sufficient. The input representation, the target definition and the evaluation design matter as much as the learner. The benchmark therefore compares the complete computational pipeline, not only the model class.</w:t>
       </w:r>
     </w:p>
-    <w:bookmarkEnd w:id="46"/>
-    <w:bookmarkStart w:id="47" w:name="what-decoupling-buys-and-where-it-fails"/>
+    <w:bookmarkEnd w:id="47"/>
+    <w:bookmarkStart w:id="48" w:name="what-decoupling-buys-and-where-it-fails"/>
     <w:p>
       <w:pPr>
         <w:pStyle w:val="Heading2"/>
@@ -5334,7 +5352,7 @@
         <w:t xml:space="preserve">t</w:t>
       </w:r>
       <w:r>
-        <w:t xml:space="preserve">−1 ignition layer and a spatial block holdout is the main methodological contribution. It also explains why a single aggregate score is not enough: the same model can be strong on held-in cells, weak on held-out blocks and weak at population prevalence, and each of these results answers a different question. Reporting the three views separately is more informative than selecting the most favorable one.</w:t>
+        <w:t xml:space="preserve">−1 ignition layer and a spatial block holdout is the main methodological contribution. It also explains why a single aggregate score is not enough: the same model can be strong on held-in cells, weak on held-out blocks and weak at population prevalence, and each of these results answers a different question. Reporting the three views separately is more informative than selecting the most favorable one. A fourth view, decision value, asks whether the ranking survives a cost-loss ratio; it is the view that determines operational use.</w:t>
       </w:r>
     </w:p>
     <w:p>
@@ -5374,8 +5392,8 @@
         <w:t xml:space="preserve">−1 fire density, it would have looked stronger still. The spatial block and D2 target make those shortcuts visible. This is why the negative result is not a weakness of the paper but part of its contribution: it gives future work a clear baseline to beat without leakage.</w:t>
       </w:r>
     </w:p>
-    <w:bookmarkEnd w:id="47"/>
-    <w:bookmarkStart w:id="48" w:name="X89437c5d496b7b740d35454d9c653eebb75780f"/>
+    <w:bookmarkEnd w:id="48"/>
+    <w:bookmarkStart w:id="49" w:name="X89437c5d496b7b740d35454d9c653eebb75780f"/>
     <w:p>
       <w:pPr>
         <w:pStyle w:val="Heading2"/>
@@ -5400,8 +5418,8 @@
         <w:t xml:space="preserve">The framework also makes failure explicit. A model that is excellent on held-in cells but poor on spatial blocks is not a universal model, and a model that is only competitive on a case-control sample is not an operational system. Reporting both views is more useful than reporting a single high AUC. This is the main methodological lesson of the study, and it generalizes beyond fire: any geoscientific pipeline that combines spatial priors, temporal targets and rare events needs the same separation between ranking skill, calibration and operational prevalence.</w:t>
       </w:r>
     </w:p>
-    <w:bookmarkEnd w:id="48"/>
-    <w:bookmarkStart w:id="49" w:name="limitations"/>
+    <w:bookmarkEnd w:id="49"/>
+    <w:bookmarkStart w:id="50" w:name="limitations"/>
     <w:p>
       <w:pPr>
         <w:pStyle w:val="Heading2"/>
@@ -5459,7 +5477,7 @@
         <w:t xml:space="preserve"> </w:t>
       </w:r>
       <w:r>
-        <w:t xml:space="preserve">Although D2 sensitivity across 15/25/35-km radii and 7/10/14-day windows confirmed that model rankings are stable under full retraining (Supplementary Table S20), the 2024–2025 test is retrospective rather than blind and shares 90.65 % of its active cells with the training period through temporal overlap; restricting to cells never seen in training reduces M3 ROC-AUC by 0.018/0.039 but keeps a positive M3 &gt; M2 gap in ROC-AUC and PR-AUC, although the ROC gap is not resolved in Oriental (Supplementary Table S27). M3 loses its predictive advantage in unseen spatial blocks, which requires M2 as the operational fallback while M1 remains an insufficient baseline; conformal coverage (90.17 %/90.31 % at the 90 % level) is empirical rather than formally guaranteed under temporal shift; and the coupled</w:t>
+        <w:t xml:space="preserve">Although D2 sensitivity across 15/25/35-km radii and 7/10/14-day windows confirmed that model rankings are stable under full retraining (Supplementary Table S20), the 2024–2025 test is retrospective rather than blind and shares 90.65 % of its active cells with the training period through temporal overlap; restricting to cells never seen in training reduces M3 ROC-AUC by 0.018/0.039 but keeps a positive M3 &gt; M2 gap in ROC-AUC and PR-AUC, although the ROC gap is not resolved in Oriental (Supplementary Table S27). Adversarial validation reaches AUC 0.8832/0.9241, confirming that the temporal shift is substantial and driven mainly by seasonal and historical-density features (Table S29). M3 loses its predictive advantage in unseen spatial blocks, which requires M2 as the operational fallback while M1 remains an insufficient baseline; conformal coverage (90.17 %/90.31 % at the 90 % level) is empirical rather than formally guaranteed under temporal shift; and the coupled</w:t>
       </w:r>
       <w:r>
         <w:t xml:space="preserve"> </w:t>
@@ -5510,9 +5528,9 @@
         <w:t xml:space="preserve">, it functions as a nowcast/hindcast rather than a day-ahead forecast supported by numerical weather prediction. Population-level ignition precision is very low (0.082 %/0.198 %; 95 % CI 0.075–0.088/0.178–0.222), cost-loss shows no clear M3 advantage over M2 for ignition, and the alert layers have not yet been evaluated prospectively with an operational agency. Finally, transferring the pipeline to another country would require rebuilding the 1-km² grid, the historical priors and the prevalence metadata, and the pinned dependency lock records exact package versions without platform-specific wheel hashes (documented in the code repository).</w:t>
       </w:r>
     </w:p>
-    <w:bookmarkEnd w:id="49"/>
     <w:bookmarkEnd w:id="50"/>
-    <w:bookmarkStart w:id="51" w:name="conclusions"/>
+    <w:bookmarkEnd w:id="51"/>
+    <w:bookmarkStart w:id="52" w:name="conclusions"/>
     <w:p>
       <w:pPr>
         <w:pStyle w:val="Heading1"/>
@@ -5539,11 +5557,11 @@
         <w:t xml:space="preserve">t</w:t>
       </w:r>
       <w:r>
-        <w:t xml:space="preserve">−1 baseline (Supplementary Table S19). Nevertheless, population-level ignition precision remains low (0.082 %/0.198 %; 95 % CI 0.075–0.088/0.178–0.222) and the hybrid advantage is strictly temporal rather than spatial, positioning the system as an operational screening and prioritization tool rather than a stand-alone warning system. Ultimately, the main contribution of this work is not a single susceptibility map but an open, auditable protocol—archived with public code and data—that shows where a geoscientific model holds, where it fails and how to extend the benchmark to other subtropical regions and to day-ahead weather forecasts.</w:t>
-      </w:r>
-    </w:p>
-    <w:bookmarkEnd w:id="51"/>
-    <w:bookmarkStart w:id="52" w:name="data-availability"/>
+        <w:t xml:space="preserve">−1 baseline (Supplementary Table S19). Nevertheless, population-level ignition precision remains low (0.082 %/0.198 %; 95 % CI 0.075–0.088/0.178–0.222) and the hybrid advantage is strictly temporal rather than spatial. Decision-curve and cost-loss analyses locate the operational gain in propagation (V = 0.63/0.40 at α = 0.002) and in ignition only as a low-α screening layer, positioning the system as an operational screening and prioritization tool rather than a stand-alone warning system. Ultimately, the main contribution of this work is not a single susceptibility map but an open, auditable protocol—archived with public code and data—that shows where a geoscientific model holds, where it fails and how to extend the benchmark to other subtropical regions and to day-ahead weather forecasts.</w:t>
+      </w:r>
+    </w:p>
+    <w:bookmarkEnd w:id="52"/>
+    <w:bookmarkStart w:id="53" w:name="data-availability"/>
     <w:p>
       <w:pPr>
         <w:pStyle w:val="Heading1"/>
@@ -5572,8 +5590,8 @@
         <w:t xml:space="preserve">.</w:t>
       </w:r>
     </w:p>
-    <w:bookmarkEnd w:id="52"/>
-    <w:bookmarkStart w:id="53" w:name="acknowledgments"/>
+    <w:bookmarkEnd w:id="53"/>
+    <w:bookmarkStart w:id="54" w:name="acknowledgments"/>
     <w:p>
       <w:pPr>
         <w:pStyle w:val="Heading1"/>
@@ -5590,8 +5608,8 @@
         <w:t xml:space="preserve">We thank NASA FIRMS, the Copernicus Climate Data Store, MapBiomas, Hansen/UMD and geoBoundaries for open data. The author is responsible for all interpretations and errors.</w:t>
       </w:r>
     </w:p>
-    <w:bookmarkEnd w:id="53"/>
-    <w:bookmarkStart w:id="54" w:name="funding"/>
+    <w:bookmarkEnd w:id="54"/>
+    <w:bookmarkStart w:id="55" w:name="funding"/>
     <w:p>
       <w:pPr>
         <w:pStyle w:val="Heading1"/>
@@ -5608,8 +5626,8 @@
         <w:t xml:space="preserve">This research received no specific grant from public, commercial or not-for-profit funding agencies.</w:t>
       </w:r>
     </w:p>
-    <w:bookmarkEnd w:id="54"/>
-    <w:bookmarkStart w:id="55" w:name="competing-interests"/>
+    <w:bookmarkEnd w:id="55"/>
+    <w:bookmarkStart w:id="56" w:name="competing-interests"/>
     <w:p>
       <w:pPr>
         <w:pStyle w:val="Heading1"/>
@@ -5626,8 +5644,8 @@
         <w:t xml:space="preserve">The author declares no competing financial or non-financial interests.</w:t>
       </w:r>
     </w:p>
-    <w:bookmarkEnd w:id="55"/>
-    <w:bookmarkStart w:id="56" w:name="author-contributions"/>
+    <w:bookmarkEnd w:id="56"/>
+    <w:bookmarkStart w:id="57" w:name="author-contributions"/>
     <w:p>
       <w:pPr>
         <w:pStyle w:val="Heading1"/>
@@ -5644,8 +5662,8 @@
         <w:t xml:space="preserve">Author 1: conceptualization, methodology, software, data curation, formal analysis, validation, visualization, writing—original draft, writing—review and editing, project administration.</w:t>
       </w:r>
     </w:p>
-    <w:bookmarkEnd w:id="56"/>
-    <w:bookmarkStart w:id="57" w:name="generative-ai-declaration"/>
+    <w:bookmarkEnd w:id="57"/>
+    <w:bookmarkStart w:id="58" w:name="generative-ai-declaration"/>
     <w:p>
       <w:pPr>
         <w:pStyle w:val="Heading1"/>
@@ -5662,8 +5680,8 @@
         <w:t xml:space="preserve">Generative AI tools were used for language editing and code assistance. The author reviewed and verified all content and takes full responsibility for the published article.</w:t>
       </w:r>
     </w:p>
-    <w:bookmarkEnd w:id="57"/>
-    <w:bookmarkStart w:id="58" w:name="computer-code-availability"/>
+    <w:bookmarkEnd w:id="58"/>
+    <w:bookmarkStart w:id="59" w:name="computer-code-availability"/>
     <w:p>
       <w:pPr>
         <w:pStyle w:val="Heading1"/>
@@ -5960,8 +5978,8 @@
         <w:t xml:space="preserve">.</w:t>
       </w:r>
     </w:p>
-    <w:bookmarkEnd w:id="58"/>
-    <w:bookmarkStart w:id="111" w:name="references"/>
+    <w:bookmarkEnd w:id="59"/>
+    <w:bookmarkStart w:id="112" w:name="references"/>
     <w:p>
       <w:pPr>
         <w:pStyle w:val="Heading1"/>
@@ -5970,8 +5988,8 @@
         <w:t xml:space="preserve">References</w:t>
       </w:r>
     </w:p>
-    <w:bookmarkStart w:id="110" w:name="refs"/>
-    <w:bookmarkStart w:id="60" w:name="ref-alvarado2018"/>
+    <w:bookmarkStart w:id="111" w:name="refs"/>
+    <w:bookmarkStart w:id="61" w:name="ref-alvarado2018"/>
     <w:p>
       <w:pPr>
         <w:pStyle w:val="Bibliography"/>
@@ -6008,7 +6026,7 @@
       <w:r>
         <w:t xml:space="preserve"> </w:t>
       </w:r>
-      <w:hyperlink r:id="rId59">
+      <w:hyperlink r:id="rId60">
         <w:r>
           <w:rPr>
             <w:rStyle w:val="Hyperlink"/>
@@ -6017,8 +6035,8 @@
         </w:r>
       </w:hyperlink>
     </w:p>
-    <w:bookmarkEnd w:id="60"/>
-    <w:bookmarkStart w:id="62" w:name="ref-barmpoutis2020"/>
+    <w:bookmarkEnd w:id="61"/>
+    <w:bookmarkStart w:id="63" w:name="ref-barmpoutis2020"/>
     <w:p>
       <w:pPr>
         <w:pStyle w:val="Bibliography"/>
@@ -6055,7 +6073,7 @@
       <w:r>
         <w:t xml:space="preserve"> </w:t>
       </w:r>
-      <w:hyperlink r:id="rId61">
+      <w:hyperlink r:id="rId62">
         <w:r>
           <w:rPr>
             <w:rStyle w:val="Hyperlink"/>
@@ -6064,8 +6082,8 @@
         </w:r>
       </w:hyperlink>
     </w:p>
-    <w:bookmarkEnd w:id="62"/>
-    <w:bookmarkStart w:id="64" w:name="ref-baumann2017"/>
+    <w:bookmarkEnd w:id="63"/>
+    <w:bookmarkStart w:id="65" w:name="ref-baumann2017"/>
     <w:p>
       <w:pPr>
         <w:pStyle w:val="Bibliography"/>
@@ -6102,7 +6120,7 @@
       <w:r>
         <w:t xml:space="preserve"> </w:t>
       </w:r>
-      <w:hyperlink r:id="rId63">
+      <w:hyperlink r:id="rId64">
         <w:r>
           <w:rPr>
             <w:rStyle w:val="Hyperlink"/>
@@ -6111,8 +6129,8 @@
         </w:r>
       </w:hyperlink>
     </w:p>
-    <w:bookmarkEnd w:id="64"/>
-    <w:bookmarkStart w:id="66" w:name="ref-dormann2007"/>
+    <w:bookmarkEnd w:id="65"/>
+    <w:bookmarkStart w:id="67" w:name="ref-dormann2007"/>
     <w:p>
       <w:pPr>
         <w:pStyle w:val="Bibliography"/>
@@ -6149,7 +6167,7 @@
       <w:r>
         <w:t xml:space="preserve"> </w:t>
       </w:r>
-      <w:hyperlink r:id="rId65">
+      <w:hyperlink r:id="rId66">
         <w:r>
           <w:rPr>
             <w:rStyle w:val="Hyperlink"/>
@@ -6158,8 +6176,8 @@
         </w:r>
       </w:hyperlink>
     </w:p>
-    <w:bookmarkEnd w:id="66"/>
-    <w:bookmarkStart w:id="68" w:name="ref-flannigan2009"/>
+    <w:bookmarkEnd w:id="67"/>
+    <w:bookmarkStart w:id="69" w:name="ref-flannigan2009"/>
     <w:p>
       <w:pPr>
         <w:pStyle w:val="Bibliography"/>
@@ -6196,7 +6214,7 @@
       <w:r>
         <w:t xml:space="preserve"> </w:t>
       </w:r>
-      <w:hyperlink r:id="rId67">
+      <w:hyperlink r:id="rId68">
         <w:r>
           <w:rPr>
             <w:rStyle w:val="Hyperlink"/>
@@ -6205,8 +6223,8 @@
         </w:r>
       </w:hyperlink>
     </w:p>
-    <w:bookmarkEnd w:id="68"/>
-    <w:bookmarkStart w:id="70" w:name="ref-flannigan2016"/>
+    <w:bookmarkEnd w:id="69"/>
+    <w:bookmarkStart w:id="71" w:name="ref-flannigan2016"/>
     <w:p>
       <w:pPr>
         <w:pStyle w:val="Bibliography"/>
@@ -6243,7 +6261,7 @@
       <w:r>
         <w:t xml:space="preserve"> </w:t>
       </w:r>
-      <w:hyperlink r:id="rId69">
+      <w:hyperlink r:id="rId70">
         <w:r>
           <w:rPr>
             <w:rStyle w:val="Hyperlink"/>
@@ -6252,8 +6270,8 @@
         </w:r>
       </w:hyperlink>
     </w:p>
-    <w:bookmarkEnd w:id="70"/>
-    <w:bookmarkStart w:id="72" w:name="ref-hansen2013"/>
+    <w:bookmarkEnd w:id="71"/>
+    <w:bookmarkStart w:id="73" w:name="ref-hansen2013"/>
     <w:p>
       <w:pPr>
         <w:pStyle w:val="Bibliography"/>
@@ -6290,7 +6308,7 @@
       <w:r>
         <w:t xml:space="preserve"> </w:t>
       </w:r>
-      <w:hyperlink r:id="rId71">
+      <w:hyperlink r:id="rId72">
         <w:r>
           <w:rPr>
             <w:rStyle w:val="Hyperlink"/>
@@ -6299,8 +6317,8 @@
         </w:r>
       </w:hyperlink>
     </w:p>
-    <w:bookmarkEnd w:id="72"/>
-    <w:bookmarkStart w:id="74" w:name="ref-jain2020review"/>
+    <w:bookmarkEnd w:id="73"/>
+    <w:bookmarkStart w:id="75" w:name="ref-jain2020review"/>
     <w:p>
       <w:pPr>
         <w:pStyle w:val="Bibliography"/>
@@ -6337,7 +6355,7 @@
       <w:r>
         <w:t xml:space="preserve"> </w:t>
       </w:r>
-      <w:hyperlink r:id="rId73">
+      <w:hyperlink r:id="rId74">
         <w:r>
           <w:rPr>
             <w:rStyle w:val="Hyperlink"/>
@@ -6346,8 +6364,8 @@
         </w:r>
       </w:hyperlink>
     </w:p>
-    <w:bookmarkEnd w:id="74"/>
-    <w:bookmarkStart w:id="76" w:name="ref-jolly2015"/>
+    <w:bookmarkEnd w:id="75"/>
+    <w:bookmarkStart w:id="77" w:name="ref-jolly2015"/>
     <w:p>
       <w:pPr>
         <w:pStyle w:val="Bibliography"/>
@@ -6384,7 +6402,7 @@
       <w:r>
         <w:t xml:space="preserve"> </w:t>
       </w:r>
-      <w:hyperlink r:id="rId75">
+      <w:hyperlink r:id="rId76">
         <w:r>
           <w:rPr>
             <w:rStyle w:val="Hyperlink"/>
@@ -6393,8 +6411,8 @@
         </w:r>
       </w:hyperlink>
     </w:p>
-    <w:bookmarkEnd w:id="76"/>
-    <w:bookmarkStart w:id="77" w:name="ref-ke2017lightgbm"/>
+    <w:bookmarkEnd w:id="77"/>
+    <w:bookmarkStart w:id="78" w:name="ref-ke2017lightgbm"/>
     <w:p>
       <w:pPr>
         <w:pStyle w:val="Bibliography"/>
@@ -6429,8 +6447,8 @@
         <w:t xml:space="preserve">, 3146–3154.</w:t>
       </w:r>
     </w:p>
-    <w:bookmarkEnd w:id="77"/>
-    <w:bookmarkStart w:id="79" w:name="ref-legendre1993"/>
+    <w:bookmarkEnd w:id="78"/>
+    <w:bookmarkStart w:id="80" w:name="ref-legendre1993"/>
     <w:p>
       <w:pPr>
         <w:pStyle w:val="Bibliography"/>
@@ -6467,7 +6485,7 @@
       <w:r>
         <w:t xml:space="preserve"> </w:t>
       </w:r>
-      <w:hyperlink r:id="rId78">
+      <w:hyperlink r:id="rId79">
         <w:r>
           <w:rPr>
             <w:rStyle w:val="Hyperlink"/>
@@ -6476,8 +6494,8 @@
         </w:r>
       </w:hyperlink>
     </w:p>
-    <w:bookmarkEnd w:id="79"/>
-    <w:bookmarkStart w:id="81" w:name="ref-lundberg2020treeshap"/>
+    <w:bookmarkEnd w:id="80"/>
+    <w:bookmarkStart w:id="82" w:name="ref-lundberg2020treeshap"/>
     <w:p>
       <w:pPr>
         <w:pStyle w:val="Bibliography"/>
@@ -6526,7 +6544,7 @@
       <w:r>
         <w:t xml:space="preserve"> </w:t>
       </w:r>
-      <w:hyperlink r:id="rId80">
+      <w:hyperlink r:id="rId81">
         <w:r>
           <w:rPr>
             <w:rStyle w:val="Hyperlink"/>
@@ -6535,8 +6553,8 @@
         </w:r>
       </w:hyperlink>
     </w:p>
-    <w:bookmarkEnd w:id="81"/>
-    <w:bookmarkStart w:id="83" w:name="ref-mapbiomas2023"/>
+    <w:bookmarkEnd w:id="82"/>
+    <w:bookmarkStart w:id="84" w:name="ref-mapbiomas2023"/>
     <w:p>
       <w:pPr>
         <w:pStyle w:val="Bibliography"/>
@@ -6574,7 +6592,7 @@
       <w:r>
         <w:t xml:space="preserve"> </w:t>
       </w:r>
-      <w:hyperlink r:id="rId82">
+      <w:hyperlink r:id="rId83">
         <w:r>
           <w:rPr>
             <w:rStyle w:val="Hyperlink"/>
@@ -6586,8 +6604,8 @@
         <w:t xml:space="preserve">.</w:t>
       </w:r>
     </w:p>
-    <w:bookmarkEnd w:id="83"/>
-    <w:bookmarkStart w:id="85" w:name="ref-munoz2021era5land"/>
+    <w:bookmarkEnd w:id="84"/>
+    <w:bookmarkStart w:id="86" w:name="ref-munoz2021era5land"/>
     <w:p>
       <w:pPr>
         <w:pStyle w:val="Bibliography"/>
@@ -6633,7 +6651,7 @@
       <w:r>
         <w:t xml:space="preserve"> </w:t>
       </w:r>
-      <w:hyperlink r:id="rId84">
+      <w:hyperlink r:id="rId85">
         <w:r>
           <w:rPr>
             <w:rStyle w:val="Hyperlink"/>
@@ -6642,8 +6660,8 @@
         </w:r>
       </w:hyperlink>
     </w:p>
-    <w:bookmarkEnd w:id="85"/>
-    <w:bookmarkStart w:id="87" w:name="ref-niculescu2005"/>
+    <w:bookmarkEnd w:id="86"/>
+    <w:bookmarkStart w:id="88" w:name="ref-niculescu2005"/>
     <w:p>
       <w:pPr>
         <w:pStyle w:val="Bibliography"/>
@@ -6667,7 +6685,7 @@
       <w:r>
         <w:t xml:space="preserve"> </w:t>
       </w:r>
-      <w:hyperlink r:id="rId86">
+      <w:hyperlink r:id="rId87">
         <w:r>
           <w:rPr>
             <w:rStyle w:val="Hyperlink"/>
@@ -6676,8 +6694,8 @@
         </w:r>
       </w:hyperlink>
     </w:p>
-    <w:bookmarkEnd w:id="87"/>
-    <w:bookmarkStart w:id="89" w:name="ref-pivello2021"/>
+    <w:bookmarkEnd w:id="88"/>
+    <w:bookmarkStart w:id="90" w:name="ref-pivello2021"/>
     <w:p>
       <w:pPr>
         <w:pStyle w:val="Bibliography"/>
@@ -6714,7 +6732,7 @@
       <w:r>
         <w:t xml:space="preserve"> </w:t>
       </w:r>
-      <w:hyperlink r:id="rId88">
+      <w:hyperlink r:id="rId89">
         <w:r>
           <w:rPr>
             <w:rStyle w:val="Hyperlink"/>
@@ -6723,8 +6741,8 @@
         </w:r>
       </w:hyperlink>
     </w:p>
-    <w:bookmarkEnd w:id="89"/>
-    <w:bookmarkStart w:id="90" w:name="ref-platt1999"/>
+    <w:bookmarkEnd w:id="90"/>
+    <w:bookmarkStart w:id="91" w:name="ref-platt1999"/>
     <w:p>
       <w:pPr>
         <w:pStyle w:val="Bibliography"/>
@@ -6746,8 +6764,8 @@
         <w:t xml:space="preserve">, 61–74.</w:t>
       </w:r>
     </w:p>
-    <w:bookmarkEnd w:id="90"/>
-    <w:bookmarkStart w:id="92" w:name="ref-ploton2020"/>
+    <w:bookmarkEnd w:id="91"/>
+    <w:bookmarkStart w:id="93" w:name="ref-ploton2020"/>
     <w:p>
       <w:pPr>
         <w:pStyle w:val="Bibliography"/>
@@ -6784,7 +6802,7 @@
       <w:r>
         <w:t xml:space="preserve"> </w:t>
       </w:r>
-      <w:hyperlink r:id="rId91">
+      <w:hyperlink r:id="rId92">
         <w:r>
           <w:rPr>
             <w:rStyle w:val="Hyperlink"/>
@@ -6793,8 +6811,8 @@
         </w:r>
       </w:hyperlink>
     </w:p>
-    <w:bookmarkEnd w:id="92"/>
-    <w:bookmarkStart w:id="94" w:name="ref-raasveldt2019duckdb"/>
+    <w:bookmarkEnd w:id="93"/>
+    <w:bookmarkStart w:id="95" w:name="ref-raasveldt2019duckdb"/>
     <w:p>
       <w:pPr>
         <w:pStyle w:val="Bibliography"/>
@@ -6818,7 +6836,7 @@
       <w:r>
         <w:t xml:space="preserve"> </w:t>
       </w:r>
-      <w:hyperlink r:id="rId93">
+      <w:hyperlink r:id="rId94">
         <w:r>
           <w:rPr>
             <w:rStyle w:val="Hyperlink"/>
@@ -6827,8 +6845,8 @@
         </w:r>
       </w:hyperlink>
     </w:p>
-    <w:bookmarkEnd w:id="94"/>
-    <w:bookmarkStart w:id="96" w:name="ref-roberts2017"/>
+    <w:bookmarkEnd w:id="95"/>
+    <w:bookmarkStart w:id="97" w:name="ref-roberts2017"/>
     <w:p>
       <w:pPr>
         <w:pStyle w:val="Bibliography"/>
@@ -6865,7 +6883,7 @@
       <w:r>
         <w:t xml:space="preserve"> </w:t>
       </w:r>
-      <w:hyperlink r:id="rId95">
+      <w:hyperlink r:id="rId96">
         <w:r>
           <w:rPr>
             <w:rStyle w:val="Hyperlink"/>
@@ -6874,8 +6892,8 @@
         </w:r>
       </w:hyperlink>
     </w:p>
-    <w:bookmarkEnd w:id="96"/>
-    <w:bookmarkStart w:id="98" w:name="ref-sanmiguel2012"/>
+    <w:bookmarkEnd w:id="97"/>
+    <w:bookmarkStart w:id="99" w:name="ref-sanmiguel2012"/>
     <w:p>
       <w:pPr>
         <w:pStyle w:val="Bibliography"/>
@@ -6905,7 +6923,7 @@
       <w:r>
         <w:t xml:space="preserve"> </w:t>
       </w:r>
-      <w:hyperlink r:id="rId97">
+      <w:hyperlink r:id="rId98">
         <w:r>
           <w:rPr>
             <w:rStyle w:val="Hyperlink"/>
@@ -6914,8 +6932,8 @@
         </w:r>
       </w:hyperlink>
     </w:p>
-    <w:bookmarkEnd w:id="98"/>
-    <w:bookmarkStart w:id="100" w:name="ref-schroeder2014"/>
+    <w:bookmarkEnd w:id="99"/>
+    <w:bookmarkStart w:id="101" w:name="ref-schroeder2014"/>
     <w:p>
       <w:pPr>
         <w:pStyle w:val="Bibliography"/>
@@ -6964,7 +6982,7 @@
       <w:r>
         <w:t xml:space="preserve"> </w:t>
       </w:r>
-      <w:hyperlink r:id="rId99">
+      <w:hyperlink r:id="rId100">
         <w:r>
           <w:rPr>
             <w:rStyle w:val="Hyperlink"/>
@@ -6973,8 +6991,8 @@
         </w:r>
       </w:hyperlink>
     </w:p>
-    <w:bookmarkEnd w:id="100"/>
-    <w:bookmarkStart w:id="102" w:name="ref-setzer2019"/>
+    <w:bookmarkEnd w:id="101"/>
+    <w:bookmarkStart w:id="103" w:name="ref-setzer2019"/>
     <w:p>
       <w:pPr>
         <w:pStyle w:val="Bibliography"/>
@@ -7068,7 +7086,7 @@
       <w:r>
         <w:t xml:space="preserve"> </w:t>
       </w:r>
-      <w:hyperlink r:id="rId101">
+      <w:hyperlink r:id="rId102">
         <w:r>
           <w:rPr>
             <w:rStyle w:val="Hyperlink"/>
@@ -7077,8 +7095,8 @@
         </w:r>
       </w:hyperlink>
     </w:p>
-    <w:bookmarkEnd w:id="102"/>
-    <w:bookmarkStart w:id="104" w:name="ref-stocks1989"/>
+    <w:bookmarkEnd w:id="103"/>
+    <w:bookmarkStart w:id="105" w:name="ref-stocks1989"/>
     <w:p>
       <w:pPr>
         <w:pStyle w:val="Bibliography"/>
@@ -7115,7 +7133,7 @@
       <w:r>
         <w:t xml:space="preserve"> </w:t>
       </w:r>
-      <w:hyperlink r:id="rId103">
+      <w:hyperlink r:id="rId104">
         <w:r>
           <w:rPr>
             <w:rStyle w:val="Hyperlink"/>
@@ -7124,8 +7142,8 @@
         </w:r>
       </w:hyperlink>
     </w:p>
-    <w:bookmarkEnd w:id="104"/>
-    <w:bookmarkStart w:id="106" w:name="ref-tobler1970"/>
+    <w:bookmarkEnd w:id="105"/>
+    <w:bookmarkStart w:id="107" w:name="ref-tobler1970"/>
     <w:p>
       <w:pPr>
         <w:pStyle w:val="Bibliography"/>
@@ -7162,7 +7180,7 @@
       <w:r>
         <w:t xml:space="preserve"> </w:t>
       </w:r>
-      <w:hyperlink r:id="rId105">
+      <w:hyperlink r:id="rId106">
         <w:r>
           <w:rPr>
             <w:rStyle w:val="Hyperlink"/>
@@ -7171,8 +7189,8 @@
         </w:r>
       </w:hyperlink>
     </w:p>
-    <w:bookmarkEnd w:id="106"/>
-    <w:bookmarkStart w:id="108" w:name="ref-vallejos2015"/>
+    <w:bookmarkEnd w:id="107"/>
+    <w:bookmarkStart w:id="109" w:name="ref-vallejos2015"/>
     <w:p>
       <w:pPr>
         <w:pStyle w:val="Bibliography"/>
@@ -7209,7 +7227,7 @@
       <w:r>
         <w:t xml:space="preserve"> </w:t>
       </w:r>
-      <w:hyperlink r:id="rId107">
+      <w:hyperlink r:id="rId108">
         <w:r>
           <w:rPr>
             <w:rStyle w:val="Hyperlink"/>
@@ -7218,8 +7236,8 @@
         </w:r>
       </w:hyperlink>
     </w:p>
-    <w:bookmarkEnd w:id="108"/>
-    <w:bookmarkStart w:id="109" w:name="ref-vanwagner1987"/>
+    <w:bookmarkEnd w:id="109"/>
+    <w:bookmarkStart w:id="110" w:name="ref-vanwagner1987"/>
     <w:p>
       <w:pPr>
         <w:pStyle w:val="Bibliography"/>
@@ -7254,9 +7272,9 @@
         <w:t xml:space="preserve">, 1–37.</w:t>
       </w:r>
     </w:p>
-    <w:bookmarkEnd w:id="109"/>
     <w:bookmarkEnd w:id="110"/>
     <w:bookmarkEnd w:id="111"/>
+    <w:bookmarkEnd w:id="112"/>
     <w:sectPr>
       <w:footnotePr>
         <w:numRestart w:val="eachSect"/>

</xml_diff>

<commit_message>
feat(robustez): cierra R.4, R.9, R.10 y R.12; variantes VIIRS
</commit_message>
<xml_diff>
--- a/entregables/en/manuscrito.docx
+++ b/entregables/en/manuscrito.docx
@@ -4882,7 +4882,7 @@
         <w:pStyle w:val="BodyText"/>
       </w:pPr>
       <w:r>
-        <w:t xml:space="preserve">With t-1 weather, M3 retains 0.7831/0.7613 and M2 0.7818/0.7463; M1 is lower and is reported in Supplementary Table S9. The small M3 drop shows that recurrence priors, not same-day weather, dominate the hybrid signal. This is why the current system is a nowcast/hindcast; a real day-ahead system would require forecast weather. Lead-time details are in Supplementary Table S9. As a direct leakage comparator, a coupled model trained on the combined fire sample with t-1 fire inputs did not materially outperform the decoupled task architecture: 0.8862 vs 0.8868 ROC-AUC in Chaco and 0.7871 vs 0.7806 in Oriental. This comparator uses the same gated case-control sample, so it does not test removal of gating; it only shows that the coupled shortcut does not provide a large advantage on this sample (Supplementary Table S19). A full 3 × 3 D2 sensitivity (15/25/35 km × 7/10/14 d) regenerated the 1:10 sampling and retrained M1, M2 and M3 for every combination. M3 outperformed M2 in all nine combinations on both validation and test, with a positive M3 − M2 ROC-AUC of +0.004 to +0.016, and was the best test model in all nine; its range was 0.771–0.782 in 2023 and 0.785–0.797 in Chaco for 2024–2025, and 0.759–0.768 and 0.750–0.755 in Oriental. The 7-day window gave the highest ROC-AUC in every region × radius pair, and the radius effect was small: 35 km was slightly better in Chaco and 25 km in Oriental. The D2 conclusion is therefore not an artefact of the 25 km/10 d choice (Supplementary Table S20). A four-fold rolling-origin backtest retrained M1/M2/M3 with training through Y−2, validation on Y−1 and test on Y. The M3−M2 ROC-AUC difference was +0.0030/+0.0059 in 2022, +0.0029/+0.0120 in 2023, +0.0038/+0.0166 in 2024 and +0.0019/+0.0084 in 2025 (Chaco/Oriental); the corresponding p-values were 0.032/0.006, 0.082/0.001, 0.004/0.001 and 0.148/0.001. The sign was positive in all eight region-fold comparisons, and M1 remained below M2 in every fold (Table S26; Figure S5). The temporal ordering is therefore not an artefact of the single 2024–2025 split. Across 20 runs (five seeds × two capacities × two regions), the M3−M2 difference remained positive in every run, with mean differences of +0.0036/+0.0035 in Chaco and +0.0128/+0.0128 in Oriental for the current/high-capacity configurations (Table S25). Adversarial validation separates training (2018–2022) from test (2024–2025) rows with AUC 0.8832/0.9241 (Chaco/Oriental); day-of-year, seasonal harmonics, 25-km historical density and 60-day water deficit dominate the discriminator (Table S29). The shift is real and is not eliminated by the temporal design; it is why the spatial and all-cell results are reported separately.</w:t>
+        <w:t xml:space="preserve">With t-1 weather, M3 retains 0.7831/0.7613 and M2 0.7818/0.7463; M1 is lower and is reported in Supplementary Table S9. The small M3 drop shows that recurrence priors, not same-day weather, dominate the hybrid signal. This is why the current system is a nowcast/hindcast; a real day-ahead system would require forecast weather. Lead-time details are in Supplementary Table S9. As a direct leakage comparator, a coupled model trained on the combined fire sample with t-1 fire inputs did not materially outperform the decoupled task architecture: 0.8862 vs 0.8868 ROC-AUC in Chaco and 0.7871 vs 0.7806 in Oriental. This comparator uses the same gated case-control sample, so it does not test removal of gating; it only shows that the coupled shortcut does not provide a large advantage on this sample (Supplementary Table S19). A full 3 × 3 D2 sensitivity (15/25/35 km × 7/10/14 d) regenerated the 1:10 sampling and retrained M1, M2 and M3 for every combination. M3 outperformed M2 in all nine combinations on both validation and test, with a positive M3 − M2 ROC-AUC of +0.004 to +0.016, and was the best test model in all nine; its range was 0.771–0.782 in 2023 and 0.785–0.797 in Chaco for 2024–2025, and 0.759–0.768 and 0.750–0.755 in Oriental. The 7-day window gave the highest ROC-AUC in every region × radius pair, and the radius effect was small: 35 km was slightly better in Chaco and 25 km in Oriental. The D2 conclusion is therefore not an artefact of the 25 km/10 d choice (Supplementary Table S20). A four-fold rolling-origin backtest retrained M1/M2/M3 with training through Y−2, validation on Y−1 and test on Y. The M3−M2 ROC-AUC difference was +0.0030/+0.0059 in 2022, +0.0029/+0.0120 in 2023, +0.0038/+0.0166 in 2024 and +0.0019/+0.0084 in 2025 (Chaco/Oriental); the corresponding p-values were 0.032/0.006, 0.082/0.001, 0.004/0.001 and 0.148/0.001. The sign was positive in all eight region-fold comparisons, and M1 remained below M2 in every fold (Table S26; Figure S5). The temporal ordering is therefore not an artefact of the single 2024–2025 split. Across 20 runs (five seeds × two capacities × two regions), the M3−M2 difference remained positive in every run, with mean differences of +0.0036/+0.0035 in Chaco and +0.0128/+0.0128 in Oriental for the current/high-capacity configurations (Table S25). Adversarial validation separates training (2018–2022) from test (2024–2025) rows with AUC 0.8832/0.9241 (Chaco/Oriental); day-of-year, seasonal harmonics, 25-km historical density and 60-day water deficit dominate the discriminator (Table S29). The shift is real and is not eliminated by the temporal design; it is why the spatial and all-cell results are reported separately. Three further sensitivities bound the result. Stricter gate thresholds (VPD ≥ 1.0/1.2 kPa and 48-h rainfall &lt; 5/2 mm) retained 92–73 % of test positives and left M3 above M2 and FWI; removing the gate entirely (independent 1:10 sample) lowered M3 to 0.7924/0.7510 and M2 to 0.7833/0.7379, but M3 remained above M2 (+0.0091/+0.0131) and FWI (0.5105/0.5457; Table S31). Restricting labels to high-confidence detections retained 12.2 %/6.5 % of positives and raised ROC-AUC to 0.8228/0.7793, but precision–recall fell (0.0719/0.0246) because the retained subset has a different prevalence; FRP ≥ 10 MW retained 31.9 %/19.0 % and gave 0.8136/0.7763 (Table S30). The cloud-mask variant is unavailable. Sampling at 1:5 changed ROC-AUC by less than 0.001; the independent 1:20 sample lowered Chaco M3 ROC-AUC to 0.7926 and population precision by about 7 %, while Oriental remained stable (0.7526), and M3 stayed above M2 in both regions (Table S28). A permuted-label negative control reached AUC 0.6297/0.5138; removing historical features did not lower it (0.6276/0.5168), indicating residual cell-level association or feature leakage in Chaco (Table S32; Figure S7). The M3 score should therefore be read as a nowcast/prioritization signal, not a causal attribution.</w:t>
       </w:r>
     </w:p>
     <w:bookmarkEnd w:id="38"/>
@@ -5477,7 +5477,7 @@
         <w:t xml:space="preserve"> </w:t>
       </w:r>
       <w:r>
-        <w:t xml:space="preserve">Although D2 sensitivity across 15/25/35-km radii and 7/10/14-day windows confirmed that model rankings are stable under full retraining (Supplementary Table S20), the 2024–2025 test is retrospective rather than blind and shares 90.65 % of its active cells with the training period through temporal overlap; restricting to cells never seen in training reduces M3 ROC-AUC by 0.018/0.039 but keeps a positive M3 &gt; M2 gap in ROC-AUC and PR-AUC, although the ROC gap is not resolved in Oriental (Supplementary Table S27). Adversarial validation reaches AUC 0.8832/0.9241, confirming that the temporal shift is substantial and driven mainly by seasonal and historical-density features (Table S29). M3 loses its predictive advantage in unseen spatial blocks, which requires M2 as the operational fallback while M1 remains an insufficient baseline; conformal coverage (90.17 %/90.31 % at the 90 % level) is empirical rather than formally guaranteed under temporal shift; and the coupled</w:t>
+        <w:t xml:space="preserve">Although D2 sensitivity across 15/25/35-km radii and 7/10/14-day windows confirmed that model rankings are stable under full retraining (Supplementary Table S20), the 2024–2025 test is retrospective rather than blind and shares 90.65 % of its active cells with the training period through temporal overlap; restricting to cells never seen in training reduces M3 ROC-AUC by 0.018/0.039 but keeps a positive M3 &gt; M2 gap in ROC-AUC and PR-AUC, although the ROC gap is not resolved in Oriental (Supplementary Table S27). Adversarial validation reaches AUC 0.8832/0.9241, confirming that the temporal shift is substantial and driven mainly by seasonal and historical-density features (Table S29). A permuted-label control remains above chance in Chaco (0.63), so residual cell-level or historical signal cannot be excluded; the score is a nowcasting signal, not a causal attribution. M3 loses its predictive advantage in unseen spatial blocks, which requires M2 as the operational fallback while M1 remains an insufficient baseline; conformal coverage (90.17 %/90.31 % at the 90 % level) is empirical rather than formally guaranteed under temporal shift; and the coupled</w:t>
       </w:r>
       <w:r>
         <w:t xml:space="preserve"> </w:t>
@@ -5557,7 +5557,7 @@
         <w:t xml:space="preserve">t</w:t>
       </w:r>
       <w:r>
-        <w:t xml:space="preserve">−1 baseline (Supplementary Table S19). Nevertheless, population-level ignition precision remains low (0.082 %/0.198 %; 95 % CI 0.075–0.088/0.178–0.222) and the hybrid advantage is strictly temporal rather than spatial. Decision-curve and cost-loss analyses locate the operational gain in propagation (V = 0.63/0.40 at α = 0.002) and in ignition only as a low-α screening layer, positioning the system as an operational screening and prioritization tool rather than a stand-alone warning system. Ultimately, the main contribution of this work is not a single susceptibility map but an open, auditable protocol—archived with public code and data—that shows where a geoscientific model holds, where it fails and how to extend the benchmark to other subtropical regions and to day-ahead weather forecasts.</w:t>
+        <w:t xml:space="preserve">−1 baseline (Supplementary Table S19). Nevertheless, population-level ignition precision remains low (0.082 %/0.198 %; 95 % CI 0.075–0.088/0.178–0.222) and the hybrid advantage is strictly temporal rather than spatial. Decision-curve and cost-loss analyses locate the operational gain in propagation (V = 0.63/0.40 at α = 0.002) and in ignition only as a low-α screening layer, positioning the system as an operational screening and prioritization tool rather than a stand-alone warning system. A permuted-label control remains above chance in Chaco (0.63), so this ranking is a nowcasting signal rather than a causal attribution. Ultimately, the main contribution of this work is not a single susceptibility map but an open, auditable protocol—archived with public code and data—that shows where a geoscientific model holds, where it fails and how to extend the benchmark to other subtropical regions and to day-ahead weather forecasts.</w:t>
       </w:r>
     </w:p>
     <w:bookmarkEnd w:id="52"/>

</xml_diff>

<commit_message>
feat(externo): agrega validacion externa Boqueron y cierra DOI/hashes
</commit_message>
<xml_diff>
--- a/entregables/en/manuscrito.docx
+++ b/entregables/en/manuscrito.docx
@@ -1067,7 +1067,7 @@
         <w:pStyle w:val="FirstParagraph"/>
       </w:pPr>
       <w:r>
-        <w:t xml:space="preserve">The bootstrap resamples dates rather than rows, because daily fire activity is strongly temporally clustered. For each replicate, all cells from the sampled dates are retained; this preserves within-day dependence and gives more honest intervals than row-wise resampling. The same block structure is used for paired differences against FWI and INPE. The spatial holdout divides the country into 50-km blocks, removes an entire block and a 20-km buffer from training, recomputes the historical priors without the held-out fires and evaluates both held-in and held-out cells. The primary metrics are the area under the receiver operating characteristic curve (ROC-AUC) and precision–recall area under the curve (PR-AUC). We also report Brier score, expected calibration error, precision, recall, F0.5 and false positives at the validation cutoff. AUC confidence intervals use 500 grouped bootstrap replicates; paired model differences use 1 000 replicates. We define a pre-specified family of six confirmatory comparisons (four against FWI and INPE and two M3 − M2) and report Holm–Bonferroni and Benjamini–Hochberg adjusted p-values; all remain significant at α = 0.05 (Holm p = 0.006, BH p = 0.001). The bootstrap resolution is 0.001, so raw p-values at the floor are upper bounds. The protocol is applied without modifying the test set. The target operator, the list of test cell-days and the evaluation scripts are archived with the code release. The complete protocol is reported in Supplementary Note S3 and Tables S7–S14.</w:t>
+        <w:t xml:space="preserve">The bootstrap resamples dates rather than rows, because daily fire activity is strongly temporally clustered. For each replicate, all cells from the sampled dates are retained; this preserves within-day dependence and gives more honest intervals than row-wise resampling. The same block structure is used for paired differences against FWI and INPE. The spatial holdout divides the country into 50-km blocks, removes an entire block and a 20-km buffer from training, recomputes the historical priors without the held-out fires and evaluates both held-in and held-out cells. The primary metrics are the area under the receiver operating characteristic curve (ROC-AUC) and precision–recall area under the curve (PR-AUC). We also report Brier score, expected calibration error, precision, recall, F0.5 and false positives at the validation cutoff. AUC confidence intervals use 500 grouped bootstrap replicates; paired model differences use 1 000 replicates. We define a pre-specified family of six confirmatory comparisons (four against FWI and INPE and two M3 − M2) and report Holm–Bonferroni and Benjamini–Hochberg adjusted p-values; all remain significant at α = 0.05 (Holm p = 0.006, BH p = 0.001). The bootstrap resolution is 0.001, so raw p-values at the floor are upper bounds. The protocol is applied without modifying the test set. The target operator, the list of test cell-days and the evaluation scripts are archived with the code release. The complete protocol is reported in Supplementary Note S3 and Tables S7–S14; the robustness protocol is in Supplementary Note S5.</w:t>
       </w:r>
     </w:p>
     <w:bookmarkEnd w:id="17"/>
@@ -4882,7 +4882,7 @@
         <w:pStyle w:val="BodyText"/>
       </w:pPr>
       <w:r>
-        <w:t xml:space="preserve">With t-1 weather, M3 retains 0.7831/0.7613 and M2 0.7818/0.7463; M1 is lower and is reported in Supplementary Table S9. The small M3 drop shows that recurrence priors, not same-day weather, dominate the hybrid signal. This is why the current system is a nowcast/hindcast; a real day-ahead system would require forecast weather. Lead-time details are in Supplementary Table S9. As a direct leakage comparator, a coupled model trained on the combined fire sample with t-1 fire inputs did not materially outperform the decoupled task architecture: 0.8862 vs 0.8868 ROC-AUC in Chaco and 0.7871 vs 0.7806 in Oriental. This comparator uses the same gated case-control sample, so it does not test removal of gating; it only shows that the coupled shortcut does not provide a large advantage on this sample (Supplementary Table S19). A full 3 × 3 D2 sensitivity (15/25/35 km × 7/10/14 d) regenerated the 1:10 sampling and retrained M1, M2 and M3 for every combination. M3 outperformed M2 in all nine combinations on both validation and test, with a positive M3 − M2 ROC-AUC of +0.004 to +0.016, and was the best test model in all nine; its range was 0.771–0.782 in 2023 and 0.785–0.797 in Chaco for 2024–2025, and 0.759–0.768 and 0.750–0.755 in Oriental. The 7-day window gave the highest ROC-AUC in every region × radius pair, and the radius effect was small: 35 km was slightly better in Chaco and 25 km in Oriental. The D2 conclusion is therefore not an artefact of the 25 km/10 d choice (Supplementary Table S20). A four-fold rolling-origin backtest retrained M1/M2/M3 with training through Y−2, validation on Y−1 and test on Y. The M3−M2 ROC-AUC difference was +0.0030/+0.0059 in 2022, +0.0029/+0.0120 in 2023, +0.0038/+0.0166 in 2024 and +0.0019/+0.0084 in 2025 (Chaco/Oriental); the corresponding p-values were 0.032/0.006, 0.082/0.001, 0.004/0.001 and 0.148/0.001. The sign was positive in all eight region-fold comparisons, and M1 remained below M2 in every fold (Table S26; Figure S5). The temporal ordering is therefore not an artefact of the single 2024–2025 split. Across 20 runs (five seeds × two capacities × two regions), the M3−M2 difference remained positive in every run, with mean differences of +0.0036/+0.0035 in Chaco and +0.0128/+0.0128 in Oriental for the current/high-capacity configurations (Table S25). Adversarial validation separates training (2018–2022) from test (2024–2025) rows with AUC 0.8832/0.9241 (Chaco/Oriental); day-of-year, seasonal harmonics, 25-km historical density and 60-day water deficit dominate the discriminator (Table S29). The shift is real and is not eliminated by the temporal design; it is why the spatial and all-cell results are reported separately. Three further sensitivities bound the result. Stricter gate thresholds (VPD ≥ 1.0/1.2 kPa and 48-h rainfall &lt; 5/2 mm) retained 92–73 % of test positives and left M3 above M2 and FWI; removing the gate entirely (independent 1:10 sample) lowered M3 to 0.7924/0.7510 and M2 to 0.7833/0.7379, but M3 remained above M2 (+0.0091/+0.0131) and FWI (0.5105/0.5457; Table S31). Restricting labels to high-confidence detections retained 12.2 %/6.5 % of positives and raised ROC-AUC to 0.8228/0.7793, but precision–recall fell (0.0719/0.0246) because the retained subset has a different prevalence; FRP ≥ 10 MW retained 31.9 %/19.0 % and gave 0.8136/0.7763 (Table S30). The cloud-mask variant is unavailable. Sampling at 1:5 changed ROC-AUC by less than 0.001; the independent 1:20 sample lowered Chaco M3 ROC-AUC to 0.7926 and population precision by about 7 %, while Oriental remained stable (0.7526), and M3 stayed above M2 in both regions (Table S28). A permuted-label negative control reached AUC 0.6297/0.5138; removing historical features did not lower it (0.6276/0.5168), indicating residual cell-level association or feature leakage in Chaco (Table S32; Figure S7). The M3 score should therefore be read as a nowcast/prioritization signal, not a causal attribution.</w:t>
+        <w:t xml:space="preserve">With t-1 weather, M3 retains 0.7831/0.7613 and M2 0.7818/0.7463; M1 is lower and is reported in Supplementary Table S9. The small M3 drop shows that recurrence priors, not same-day weather, dominate the hybrid signal. This is why the current system is a nowcast/hindcast; a real day-ahead system would require forecast weather. Lead-time details are in Supplementary Table S9. As a direct leakage comparator, a coupled model trained on the combined fire sample with t-1 fire inputs did not materially outperform the decoupled task architecture: 0.8862 vs 0.8868 ROC-AUC in Chaco and 0.7871 vs 0.7806 in Oriental. This comparator uses the same gated case-control sample, so it does not test removal of gating; it only shows that the coupled shortcut does not provide a large advantage on this sample (Supplementary Table S19). A full 3 × 3 D2 sensitivity (15/25/35 km × 7/10/14 d) regenerated the 1:10 sampling and retrained M1, M2 and M3 for every combination. M3 outperformed M2 in all nine combinations on both validation and test, with a positive M3 − M2 ROC-AUC of +0.004 to +0.016, and was the best test model in all nine; its range was 0.771–0.782 in 2023 and 0.785–0.797 in Chaco for 2024–2025, and 0.759–0.768 and 0.750–0.755 in Oriental. The 7-day window gave the highest ROC-AUC in every region × radius pair, and the radius effect was small: 35 km was slightly better in Chaco and 25 km in Oriental. The D2 conclusion is therefore not an artefact of the 25 km/10 d choice (Supplementary Table S20). A four-fold rolling-origin backtest retrained M1/M2/M3 with training through Y−2, validation on Y−1 and test on Y. The M3−M2 ROC-AUC difference was +0.0030/+0.0059 in 2022, +0.0029/+0.0120 in 2023, +0.0038/+0.0166 in 2024 and +0.0019/+0.0084 in 2025 (Chaco/Oriental); the corresponding p-values were 0.032/0.006, 0.082/0.001, 0.004/0.001 and 0.148/0.001. The sign was positive in all eight region-fold comparisons, and M1 remained below M2 in every fold (Table S26; Figure S5). The temporal ordering is therefore not an artefact of the single 2024–2025 split. Across 20 runs (five seeds × two capacities × two regions), the M3−M2 difference remained positive in every run, with mean differences of +0.0036/+0.0035 in Chaco and +0.0128/+0.0128 in Oriental for the current/high-capacity configurations (Table S25). Adversarial validation separates training (2018–2022) from test (2024–2025) rows with AUC 0.8832/0.9241 (Chaco/Oriental); day-of-year, seasonal harmonics, 25-km historical density and 60-day water deficit dominate the discriminator (Table S29). The shift is real and is not eliminated by the temporal design; it is why the spatial and all-cell results are reported separately. Three further sensitivities bound the result. Stricter gate thresholds (VPD ≥ 1.0/1.2 kPa and 48-h rainfall &lt; 5/2 mm) retained 92–73 % of test positives and left M3 above M2 and FWI; removing the gate entirely (independent 1:10 sample) lowered M3 to 0.7924/0.7510 and M2 to 0.7833/0.7379, but M3 remained above M2 (+0.0091/+0.0131) and FWI (0.5105/0.5457; Table S31). Restricting labels to high-confidence detections retained 12.2 %/6.5 % of positives and raised ROC-AUC to 0.8228/0.7793, but precision–recall fell (0.0719/0.0246) because the retained subset has a different prevalence; FRP ≥ 10 MW retained 31.9 %/19.0 % and gave 0.8136/0.7763 (Table S30). The cloud-mask variant is unavailable. Sampling at 1:5 changed ROC-AUC by less than 0.001; the independent 1:20 sample lowered Chaco M3 ROC-AUC to 0.7926 and population precision by about 7 %, while Oriental remained stable (0.7526), and M3 stayed above M2 in both regions (Table S28). A permuted-label negative control reached AUC 0.6297/0.5138; removing historical features did not lower it (0.6276/0.5168), indicating residual cell-level association or feature leakage in Chaco (Table S32; Figure S7). The M3 score should therefore be read as a nowcast/prioritization signal, not a causal attribution. External spatial validation in Boquerón, after excluding the department and a 25-km buffer and recomputing priors, reproduced the M2/M3 discrimination (ROC-AUC 0.8104/0.8120; PR-AUC 0.2440/0.2505) but not a significant M3−M2 gain (+0.0016; p = 0.254). FWI was below chance (0.4719) and INPE reached 0.5845 (Table S33; Figure S9). Population precision was 0.0891 %/0.0678 % for M2/M3, with recall 16.2 %/27.1 %; M3 trades precision for recall. The M3−M2 difference was +0.0039 (p = 0.010) with a 20-km buffer, +0.0016 (p = 0.254) with 25 km and +0.0020 (p = 0.206) with 30 km (Table S33b), so the hybrid advantage is not robust to the buffer. The ranking transports spatially, but the operational preference for M3 over M2 does not.</w:t>
       </w:r>
     </w:p>
     <w:bookmarkEnd w:id="38"/>
@@ -5263,7 +5263,7 @@
         <w:pStyle w:val="BodyText"/>
       </w:pPr>
       <w:r>
-        <w:t xml:space="preserve">Two practical checks are worth reporting. First, the test split is frozen and the cutoff is selected on validation; no test row is used for model selection. Second, the calibration and conformal layers are fitted before the test and never updated. These checks do not eliminate distribution shift, but they remove the most common sources of optimistic bias. The tables in this manuscript are regenerated from the repository and correspond to release v2.0.1; the code and data concept DOIs are reported in the Code and Data Availability sections.</w:t>
+        <w:t xml:space="preserve">Two practical checks are worth reporting. First, the test split is frozen and the cutoff is selected on validation; no test row is used for model selection. Second, the calibration and conformal layers are fitted before the test and never updated. These checks do not eliminate distribution shift, but they remove the most common sources of optimistic bias. The tables in this manuscript are regenerated from the repository and correspond to release v2.1.0; the code and data concept DOIs are reported in the Code and Data Availability sections.</w:t>
       </w:r>
     </w:p>
     <w:bookmarkEnd w:id="45"/>
@@ -5352,7 +5352,7 @@
         <w:t xml:space="preserve">t</w:t>
       </w:r>
       <w:r>
-        <w:t xml:space="preserve">−1 ignition layer and a spatial block holdout is the main methodological contribution. It also explains why a single aggregate score is not enough: the same model can be strong on held-in cells, weak on held-out blocks and weak at population prevalence, and each of these results answers a different question. Reporting the three views separately is more informative than selecting the most favorable one. A fourth view, decision value, asks whether the ranking survives a cost-loss ratio; it is the view that determines operational use.</w:t>
+        <w:t xml:space="preserve">−1 ignition layer and a spatial block holdout is the main methodological contribution. A permuted-label negative control sharpens this point. Retraining M3 on shuffled training labels yields AUC 0.6297/0.5138, and removing the historical features does not lower it (0.6276/0.5168). A leakage-free control should be near 0.5. The excess in Chaco therefore indicates residual cell-level or feature information—not proof that the headline ranking is wrong, but a clear reason to avoid a causal reading and to audit the historical priors and static cell descriptors. The control is reported in Table S32 and Figure S7. It also explains why a single aggregate score is not enough: the same model can be strong on held-in cells, weak on held-out blocks and weak at population prevalence, and each of these results answers a different question. Reporting the three views separately is more informative than selecting the most favorable one. A fourth view, decision value, asks whether the ranking survives a cost-loss ratio; it is the view that determines operational use.</w:t>
       </w:r>
     </w:p>
     <w:p>
@@ -5477,7 +5477,7 @@
         <w:t xml:space="preserve"> </w:t>
       </w:r>
       <w:r>
-        <w:t xml:space="preserve">Although D2 sensitivity across 15/25/35-km radii and 7/10/14-day windows confirmed that model rankings are stable under full retraining (Supplementary Table S20), the 2024–2025 test is retrospective rather than blind and shares 90.65 % of its active cells with the training period through temporal overlap; restricting to cells never seen in training reduces M3 ROC-AUC by 0.018/0.039 but keeps a positive M3 &gt; M2 gap in ROC-AUC and PR-AUC, although the ROC gap is not resolved in Oriental (Supplementary Table S27). Adversarial validation reaches AUC 0.8832/0.9241, confirming that the temporal shift is substantial and driven mainly by seasonal and historical-density features (Table S29). A permuted-label control remains above chance in Chaco (0.63), so residual cell-level or historical signal cannot be excluded; the score is a nowcasting signal, not a causal attribution. M3 loses its predictive advantage in unseen spatial blocks, which requires M2 as the operational fallback while M1 remains an insufficient baseline; conformal coverage (90.17 %/90.31 % at the 90 % level) is empirical rather than formally guaranteed under temporal shift; and the coupled</w:t>
+        <w:t xml:space="preserve">Although D2 sensitivity across 15/25/35-km radii and 7/10/14-day windows confirmed that model rankings are stable under full retraining (Supplementary Table S20), the 2024–2025 test is retrospective rather than blind and shares 90.65 % of its active cells with the training period through temporal overlap; restricting to cells never seen in training reduces M3 ROC-AUC by 0.018/0.039 but keeps a positive M3 &gt; M2 gap in ROC-AUC and PR-AUC, although the ROC gap is not resolved in Oriental (Supplementary Table S27). Adversarial validation reaches AUC 0.8832/0.9241, confirming that the temporal shift is substantial and driven mainly by seasonal and historical-density features (Table S29). A permuted-label control remains above chance in Chaco (0.63), so residual cell-level or historical signal cannot be excluded; the score is a nowcasting signal, not a causal attribution. M3 loses its predictive advantage in unseen spatial blocks, which requires M2 as the operational fallback while M1 remains an insufficient baseline; The Boquerón external test is within Paraguay; it provides derived population metrics but no cross-country transport, and M3’s gain over M2 is not significant at the primary 25-km buffer. conformal coverage (90.17 %/90.31 % at the 90 % level) is empirical rather than formally guaranteed under temporal shift; and the coupled</w:t>
       </w:r>
       <w:r>
         <w:t xml:space="preserve"> </w:t>
@@ -5557,11 +5557,11 @@
         <w:t xml:space="preserve">t</w:t>
       </w:r>
       <w:r>
-        <w:t xml:space="preserve">−1 baseline (Supplementary Table S19). Nevertheless, population-level ignition precision remains low (0.082 %/0.198 %; 95 % CI 0.075–0.088/0.178–0.222) and the hybrid advantage is strictly temporal rather than spatial. Decision-curve and cost-loss analyses locate the operational gain in propagation (V = 0.63/0.40 at α = 0.002) and in ignition only as a low-α screening layer, positioning the system as an operational screening and prioritization tool rather than a stand-alone warning system. A permuted-label control remains above chance in Chaco (0.63), so this ranking is a nowcasting signal rather than a causal attribution. Ultimately, the main contribution of this work is not a single susceptibility map but an open, auditable protocol—archived with public code and data—that shows where a geoscientific model holds, where it fails and how to extend the benchmark to other subtropical regions and to day-ahead weather forecasts.</w:t>
+        <w:t xml:space="preserve">−1 baseline (Supplementary Table S19). Nevertheless, population-level ignition precision remains low (0.082 %/0.198 %; 95 % CI 0.075–0.088/0.178–0.222) and the hybrid advantage is strictly temporal rather than spatial. Decision-curve and cost-loss analyses locate the operational gain in propagation (V = 0.63/0.40 at α = 0.002) and in ignition only as a low-α screening layer, positioning the system as an operational screening and prioritization tool rather than a stand-alone warning system. A permuted-label control remains above chance in Chaco (0.63), so this ranking is a nowcasting signal rather than a causal attribution. An external leave-one-department-out test in Boquerón reproduced the M2/M3 discrimination (0.8104/0.8120) but not a significant M3−M2 gain (+0.0016, p = 0.254); FWI remained below chance (0.4719) and INPE reached 0.5845. Ultimately, the main contribution of this work is not a single susceptibility map but an open, auditable protocol—archived with public code and data—that shows where a geoscientific model holds, where it fails and how to extend the benchmark to other subtropical regions and to day-ahead weather forecasts.</w:t>
       </w:r>
     </w:p>
     <w:bookmarkEnd w:id="52"/>
-    <w:bookmarkStart w:id="53" w:name="data-availability"/>
+    <w:bookmarkStart w:id="54" w:name="data-availability"/>
     <w:p>
       <w:pPr>
         <w:pStyle w:val="Heading1"/>
@@ -5575,7 +5575,21 @@
         <w:pStyle w:val="FirstParagraph"/>
       </w:pPr>
       <w:r>
-        <w:t xml:space="preserve">Processed data, test predictions, trained models and derived tables are available in the anonymized review repository under CC BY 4.0 and are documented under the data concept DOI provided on the title page. Raw NASA FIRMS, ERA5-Land/CDS, MapBiomas, Hansen GFC and geoBoundaries data are obtained from their original providers under their own terms and are documented with SHA-256 hashes in</w:t>
+        <w:t xml:space="preserve">Processed data, test predictions, trained models and derived tables are available in the anonymized review repository under CC BY 4.0 and are documented under the data concept DOI</w:t>
+      </w:r>
+      <w:r>
+        <w:t xml:space="preserve"> </w:t>
+      </w:r>
+      <w:hyperlink r:id="rId53">
+        <w:r>
+          <w:rPr>
+            <w:rStyle w:val="Hyperlink"/>
+          </w:rPr>
+          <w:t xml:space="preserve">10.5281/zenodo.23675278</w:t>
+        </w:r>
+      </w:hyperlink>
+      <w:r>
+        <w:t xml:space="preserve">. Raw NASA FIRMS, ERA5-Land/CDS, MapBiomas, Hansen GFC and geoBoundaries data are obtained from their original providers under their own terms and are documented with SHA-256 hashes in</w:t>
       </w:r>
       <w:r>
         <w:t xml:space="preserve"> </w:t>
@@ -5590,8 +5604,8 @@
         <w:t xml:space="preserve">.</w:t>
       </w:r>
     </w:p>
-    <w:bookmarkEnd w:id="53"/>
-    <w:bookmarkStart w:id="54" w:name="acknowledgments"/>
+    <w:bookmarkEnd w:id="54"/>
+    <w:bookmarkStart w:id="55" w:name="acknowledgments"/>
     <w:p>
       <w:pPr>
         <w:pStyle w:val="Heading1"/>
@@ -5608,8 +5622,8 @@
         <w:t xml:space="preserve">We thank NASA FIRMS, the Copernicus Climate Data Store, MapBiomas, Hansen/UMD and geoBoundaries for open data. The author is responsible for all interpretations and errors.</w:t>
       </w:r>
     </w:p>
-    <w:bookmarkEnd w:id="54"/>
-    <w:bookmarkStart w:id="55" w:name="funding"/>
+    <w:bookmarkEnd w:id="55"/>
+    <w:bookmarkStart w:id="56" w:name="funding"/>
     <w:p>
       <w:pPr>
         <w:pStyle w:val="Heading1"/>
@@ -5626,8 +5640,8 @@
         <w:t xml:space="preserve">This research received no specific grant from public, commercial or not-for-profit funding agencies.</w:t>
       </w:r>
     </w:p>
-    <w:bookmarkEnd w:id="55"/>
-    <w:bookmarkStart w:id="56" w:name="competing-interests"/>
+    <w:bookmarkEnd w:id="56"/>
+    <w:bookmarkStart w:id="57" w:name="competing-interests"/>
     <w:p>
       <w:pPr>
         <w:pStyle w:val="Heading1"/>
@@ -5644,8 +5658,8 @@
         <w:t xml:space="preserve">The author declares no competing financial or non-financial interests.</w:t>
       </w:r>
     </w:p>
-    <w:bookmarkEnd w:id="56"/>
-    <w:bookmarkStart w:id="57" w:name="author-contributions"/>
+    <w:bookmarkEnd w:id="57"/>
+    <w:bookmarkStart w:id="58" w:name="author-contributions"/>
     <w:p>
       <w:pPr>
         <w:pStyle w:val="Heading1"/>
@@ -5662,8 +5676,8 @@
         <w:t xml:space="preserve">Author 1: conceptualization, methodology, software, data curation, formal analysis, validation, visualization, writing—original draft, writing—review and editing, project administration.</w:t>
       </w:r>
     </w:p>
-    <w:bookmarkEnd w:id="57"/>
-    <w:bookmarkStart w:id="58" w:name="generative-ai-declaration"/>
+    <w:bookmarkEnd w:id="58"/>
+    <w:bookmarkStart w:id="59" w:name="generative-ai-declaration"/>
     <w:p>
       <w:pPr>
         <w:pStyle w:val="Heading1"/>
@@ -5680,8 +5694,8 @@
         <w:t xml:space="preserve">Generative AI tools were used for language editing and code assistance. The author reviewed and verified all content and takes full responsibility for the published article.</w:t>
       </w:r>
     </w:p>
-    <w:bookmarkEnd w:id="58"/>
-    <w:bookmarkStart w:id="59" w:name="computer-code-availability"/>
+    <w:bookmarkEnd w:id="59"/>
+    <w:bookmarkStart w:id="61" w:name="computer-code-availability"/>
     <w:p>
       <w:pPr>
         <w:pStyle w:val="Heading1"/>
@@ -5855,14 +5869,19 @@
           <w:b/>
           <w:bCs/>
         </w:rPr>
-        <w:t xml:space="preserve">Code version DOI:</w:t>
-      </w:r>
-      <w:r>
-        <w:t xml:space="preserve"> </w:t>
-      </w:r>
-      <w:r>
-        <w:t xml:space="preserve">provided on the title page</w:t>
-      </w:r>
+        <w:t xml:space="preserve">Code concept DOI (latest version):</w:t>
+      </w:r>
+      <w:r>
+        <w:t xml:space="preserve"> </w:t>
+      </w:r>
+      <w:hyperlink r:id="rId60">
+        <w:r>
+          <w:rPr>
+            <w:rStyle w:val="Hyperlink"/>
+          </w:rPr>
+          <w:t xml:space="preserve">10.5281/zenodo.23675104</w:t>
+        </w:r>
+      </w:hyperlink>
       <w:r>
         <w:br/>
       </w:r>
@@ -5871,14 +5890,19 @@
           <w:b/>
           <w:bCs/>
         </w:rPr>
-        <w:t xml:space="preserve">Data version DOI:</w:t>
-      </w:r>
-      <w:r>
-        <w:t xml:space="preserve"> </w:t>
-      </w:r>
-      <w:r>
-        <w:t xml:space="preserve">provided on the title page</w:t>
-      </w:r>
+        <w:t xml:space="preserve">Data concept DOI (latest version):</w:t>
+      </w:r>
+      <w:r>
+        <w:t xml:space="preserve"> </w:t>
+      </w:r>
+      <w:hyperlink r:id="rId53">
+        <w:r>
+          <w:rPr>
+            <w:rStyle w:val="Hyperlink"/>
+          </w:rPr>
+          <w:t xml:space="preserve">10.5281/zenodo.23675278</w:t>
+        </w:r>
+      </w:hyperlink>
       <w:r>
         <w:br/>
       </w:r>
@@ -5887,13 +5911,13 @@
           <w:b/>
           <w:bCs/>
         </w:rPr>
-        <w:t xml:space="preserve">Code concept DOI:</w:t>
-      </w:r>
-      <w:r>
-        <w:t xml:space="preserve"> </w:t>
-      </w:r>
-      <w:r>
-        <w:t xml:space="preserve">provided on the title page</w:t>
+        <w:t xml:space="preserve">Version:</w:t>
+      </w:r>
+      <w:r>
+        <w:t xml:space="preserve"> </w:t>
+      </w:r>
+      <w:r>
+        <w:t xml:space="preserve">v2.1.0 (version DOI assigned on Zenodo deposition)</w:t>
       </w:r>
       <w:r>
         <w:br/>
@@ -5903,13 +5927,16 @@
           <w:b/>
           <w:bCs/>
         </w:rPr>
-        <w:t xml:space="preserve">Data concept DOI:</w:t>
-      </w:r>
-      <w:r>
-        <w:t xml:space="preserve"> </w:t>
-      </w:r>
-      <w:r>
-        <w:t xml:space="preserve">provided on the title page</w:t>
+        <w:t xml:space="preserve">User guide:</w:t>
+      </w:r>
+      <w:r>
+        <w:t xml:space="preserve"> </w:t>
+      </w:r>
+      <w:r>
+        <w:rPr>
+          <w:rStyle w:val="VerbatimChar"/>
+        </w:rPr>
+        <w:t xml:space="preserve">docs/USER_GUIDE.md</w:t>
       </w:r>
       <w:r>
         <w:br/>
@@ -5919,7 +5946,7 @@
           <w:b/>
           <w:bCs/>
         </w:rPr>
-        <w:t xml:space="preserve">User guide:</w:t>
+        <w:t xml:space="preserve">Tutorial:</w:t>
       </w:r>
       <w:r>
         <w:t xml:space="preserve"> </w:t>
@@ -5928,7 +5955,7 @@
         <w:rPr>
           <w:rStyle w:val="VerbatimChar"/>
         </w:rPr>
-        <w:t xml:space="preserve">docs/USER_GUIDE.md</w:t>
+        <w:t xml:space="preserve">docs/TUTORIAL.md</w:t>
       </w:r>
       <w:r>
         <w:br/>
@@ -5938,7 +5965,13 @@
           <w:b/>
           <w:bCs/>
         </w:rPr>
-        <w:t xml:space="preserve">Tutorial:</w:t>
+        <w:t xml:space="preserve">Tests:</w:t>
+      </w:r>
+      <w:r>
+        <w:t xml:space="preserve"> </w:t>
+      </w:r>
+      <w:r>
+        <w:t xml:space="preserve">76 tests pass with</w:t>
       </w:r>
       <w:r>
         <w:t xml:space="preserve"> </w:t>
@@ -5947,39 +5980,14 @@
         <w:rPr>
           <w:rStyle w:val="VerbatimChar"/>
         </w:rPr>
-        <w:t xml:space="preserve">docs/TUTORIAL.md</w:t>
-      </w:r>
-      <w:r>
-        <w:br/>
-      </w:r>
-      <w:r>
-        <w:rPr>
-          <w:b/>
-          <w:bCs/>
-        </w:rPr>
-        <w:t xml:space="preserve">Tests:</w:t>
-      </w:r>
-      <w:r>
-        <w:t xml:space="preserve"> </w:t>
-      </w:r>
-      <w:r>
-        <w:t xml:space="preserve">76 tests pass with</w:t>
-      </w:r>
-      <w:r>
-        <w:t xml:space="preserve"> </w:t>
-      </w:r>
-      <w:r>
-        <w:rPr>
-          <w:rStyle w:val="VerbatimChar"/>
-        </w:rPr>
         <w:t xml:space="preserve">python -m pytest -q tests</w:t>
       </w:r>
       <w:r>
         <w:t xml:space="preserve">.</w:t>
       </w:r>
     </w:p>
-    <w:bookmarkEnd w:id="59"/>
-    <w:bookmarkStart w:id="112" w:name="references"/>
+    <w:bookmarkEnd w:id="61"/>
+    <w:bookmarkStart w:id="114" w:name="references"/>
     <w:p>
       <w:pPr>
         <w:pStyle w:val="Heading1"/>
@@ -5988,8 +5996,8 @@
         <w:t xml:space="preserve">References</w:t>
       </w:r>
     </w:p>
-    <w:bookmarkStart w:id="111" w:name="refs"/>
-    <w:bookmarkStart w:id="61" w:name="ref-alvarado2018"/>
+    <w:bookmarkStart w:id="113" w:name="refs"/>
+    <w:bookmarkStart w:id="63" w:name="ref-alvarado2018"/>
     <w:p>
       <w:pPr>
         <w:pStyle w:val="Bibliography"/>
@@ -6026,7 +6034,7 @@
       <w:r>
         <w:t xml:space="preserve"> </w:t>
       </w:r>
-      <w:hyperlink r:id="rId60">
+      <w:hyperlink r:id="rId62">
         <w:r>
           <w:rPr>
             <w:rStyle w:val="Hyperlink"/>
@@ -6035,8 +6043,8 @@
         </w:r>
       </w:hyperlink>
     </w:p>
-    <w:bookmarkEnd w:id="61"/>
-    <w:bookmarkStart w:id="63" w:name="ref-barmpoutis2020"/>
+    <w:bookmarkEnd w:id="63"/>
+    <w:bookmarkStart w:id="65" w:name="ref-barmpoutis2020"/>
     <w:p>
       <w:pPr>
         <w:pStyle w:val="Bibliography"/>
@@ -6073,7 +6081,7 @@
       <w:r>
         <w:t xml:space="preserve"> </w:t>
       </w:r>
-      <w:hyperlink r:id="rId62">
+      <w:hyperlink r:id="rId64">
         <w:r>
           <w:rPr>
             <w:rStyle w:val="Hyperlink"/>
@@ -6082,8 +6090,8 @@
         </w:r>
       </w:hyperlink>
     </w:p>
-    <w:bookmarkEnd w:id="63"/>
-    <w:bookmarkStart w:id="65" w:name="ref-baumann2017"/>
+    <w:bookmarkEnd w:id="65"/>
+    <w:bookmarkStart w:id="67" w:name="ref-baumann2017"/>
     <w:p>
       <w:pPr>
         <w:pStyle w:val="Bibliography"/>
@@ -6120,7 +6128,7 @@
       <w:r>
         <w:t xml:space="preserve"> </w:t>
       </w:r>
-      <w:hyperlink r:id="rId64">
+      <w:hyperlink r:id="rId66">
         <w:r>
           <w:rPr>
             <w:rStyle w:val="Hyperlink"/>
@@ -6129,8 +6137,8 @@
         </w:r>
       </w:hyperlink>
     </w:p>
-    <w:bookmarkEnd w:id="65"/>
-    <w:bookmarkStart w:id="67" w:name="ref-dormann2007"/>
+    <w:bookmarkEnd w:id="67"/>
+    <w:bookmarkStart w:id="69" w:name="ref-dormann2007"/>
     <w:p>
       <w:pPr>
         <w:pStyle w:val="Bibliography"/>
@@ -6167,7 +6175,7 @@
       <w:r>
         <w:t xml:space="preserve"> </w:t>
       </w:r>
-      <w:hyperlink r:id="rId66">
+      <w:hyperlink r:id="rId68">
         <w:r>
           <w:rPr>
             <w:rStyle w:val="Hyperlink"/>
@@ -6176,8 +6184,8 @@
         </w:r>
       </w:hyperlink>
     </w:p>
-    <w:bookmarkEnd w:id="67"/>
-    <w:bookmarkStart w:id="69" w:name="ref-flannigan2009"/>
+    <w:bookmarkEnd w:id="69"/>
+    <w:bookmarkStart w:id="71" w:name="ref-flannigan2009"/>
     <w:p>
       <w:pPr>
         <w:pStyle w:val="Bibliography"/>
@@ -6214,7 +6222,7 @@
       <w:r>
         <w:t xml:space="preserve"> </w:t>
       </w:r>
-      <w:hyperlink r:id="rId68">
+      <w:hyperlink r:id="rId70">
         <w:r>
           <w:rPr>
             <w:rStyle w:val="Hyperlink"/>
@@ -6223,8 +6231,8 @@
         </w:r>
       </w:hyperlink>
     </w:p>
-    <w:bookmarkEnd w:id="69"/>
-    <w:bookmarkStart w:id="71" w:name="ref-flannigan2016"/>
+    <w:bookmarkEnd w:id="71"/>
+    <w:bookmarkStart w:id="73" w:name="ref-flannigan2016"/>
     <w:p>
       <w:pPr>
         <w:pStyle w:val="Bibliography"/>
@@ -6261,7 +6269,7 @@
       <w:r>
         <w:t xml:space="preserve"> </w:t>
       </w:r>
-      <w:hyperlink r:id="rId70">
+      <w:hyperlink r:id="rId72">
         <w:r>
           <w:rPr>
             <w:rStyle w:val="Hyperlink"/>
@@ -6270,8 +6278,8 @@
         </w:r>
       </w:hyperlink>
     </w:p>
-    <w:bookmarkEnd w:id="71"/>
-    <w:bookmarkStart w:id="73" w:name="ref-hansen2013"/>
+    <w:bookmarkEnd w:id="73"/>
+    <w:bookmarkStart w:id="75" w:name="ref-hansen2013"/>
     <w:p>
       <w:pPr>
         <w:pStyle w:val="Bibliography"/>
@@ -6308,7 +6316,7 @@
       <w:r>
         <w:t xml:space="preserve"> </w:t>
       </w:r>
-      <w:hyperlink r:id="rId72">
+      <w:hyperlink r:id="rId74">
         <w:r>
           <w:rPr>
             <w:rStyle w:val="Hyperlink"/>
@@ -6317,8 +6325,8 @@
         </w:r>
       </w:hyperlink>
     </w:p>
-    <w:bookmarkEnd w:id="73"/>
-    <w:bookmarkStart w:id="75" w:name="ref-jain2020review"/>
+    <w:bookmarkEnd w:id="75"/>
+    <w:bookmarkStart w:id="77" w:name="ref-jain2020review"/>
     <w:p>
       <w:pPr>
         <w:pStyle w:val="Bibliography"/>
@@ -6355,7 +6363,7 @@
       <w:r>
         <w:t xml:space="preserve"> </w:t>
       </w:r>
-      <w:hyperlink r:id="rId74">
+      <w:hyperlink r:id="rId76">
         <w:r>
           <w:rPr>
             <w:rStyle w:val="Hyperlink"/>
@@ -6364,8 +6372,8 @@
         </w:r>
       </w:hyperlink>
     </w:p>
-    <w:bookmarkEnd w:id="75"/>
-    <w:bookmarkStart w:id="77" w:name="ref-jolly2015"/>
+    <w:bookmarkEnd w:id="77"/>
+    <w:bookmarkStart w:id="79" w:name="ref-jolly2015"/>
     <w:p>
       <w:pPr>
         <w:pStyle w:val="Bibliography"/>
@@ -6402,7 +6410,7 @@
       <w:r>
         <w:t xml:space="preserve"> </w:t>
       </w:r>
-      <w:hyperlink r:id="rId76">
+      <w:hyperlink r:id="rId78">
         <w:r>
           <w:rPr>
             <w:rStyle w:val="Hyperlink"/>
@@ -6411,8 +6419,8 @@
         </w:r>
       </w:hyperlink>
     </w:p>
-    <w:bookmarkEnd w:id="77"/>
-    <w:bookmarkStart w:id="78" w:name="ref-ke2017lightgbm"/>
+    <w:bookmarkEnd w:id="79"/>
+    <w:bookmarkStart w:id="80" w:name="ref-ke2017lightgbm"/>
     <w:p>
       <w:pPr>
         <w:pStyle w:val="Bibliography"/>
@@ -6447,8 +6455,8 @@
         <w:t xml:space="preserve">, 3146–3154.</w:t>
       </w:r>
     </w:p>
-    <w:bookmarkEnd w:id="78"/>
-    <w:bookmarkStart w:id="80" w:name="ref-legendre1993"/>
+    <w:bookmarkEnd w:id="80"/>
+    <w:bookmarkStart w:id="82" w:name="ref-legendre1993"/>
     <w:p>
       <w:pPr>
         <w:pStyle w:val="Bibliography"/>
@@ -6485,7 +6493,7 @@
       <w:r>
         <w:t xml:space="preserve"> </w:t>
       </w:r>
-      <w:hyperlink r:id="rId79">
+      <w:hyperlink r:id="rId81">
         <w:r>
           <w:rPr>
             <w:rStyle w:val="Hyperlink"/>
@@ -6494,8 +6502,8 @@
         </w:r>
       </w:hyperlink>
     </w:p>
-    <w:bookmarkEnd w:id="80"/>
-    <w:bookmarkStart w:id="82" w:name="ref-lundberg2020treeshap"/>
+    <w:bookmarkEnd w:id="82"/>
+    <w:bookmarkStart w:id="84" w:name="ref-lundberg2020treeshap"/>
     <w:p>
       <w:pPr>
         <w:pStyle w:val="Bibliography"/>
@@ -6544,7 +6552,7 @@
       <w:r>
         <w:t xml:space="preserve"> </w:t>
       </w:r>
-      <w:hyperlink r:id="rId81">
+      <w:hyperlink r:id="rId83">
         <w:r>
           <w:rPr>
             <w:rStyle w:val="Hyperlink"/>
@@ -6553,8 +6561,8 @@
         </w:r>
       </w:hyperlink>
     </w:p>
-    <w:bookmarkEnd w:id="82"/>
-    <w:bookmarkStart w:id="84" w:name="ref-mapbiomas2023"/>
+    <w:bookmarkEnd w:id="84"/>
+    <w:bookmarkStart w:id="86" w:name="ref-mapbiomas2023"/>
     <w:p>
       <w:pPr>
         <w:pStyle w:val="Bibliography"/>
@@ -6592,7 +6600,7 @@
       <w:r>
         <w:t xml:space="preserve"> </w:t>
       </w:r>
-      <w:hyperlink r:id="rId83">
+      <w:hyperlink r:id="rId85">
         <w:r>
           <w:rPr>
             <w:rStyle w:val="Hyperlink"/>
@@ -6604,8 +6612,8 @@
         <w:t xml:space="preserve">.</w:t>
       </w:r>
     </w:p>
-    <w:bookmarkEnd w:id="84"/>
-    <w:bookmarkStart w:id="86" w:name="ref-munoz2021era5land"/>
+    <w:bookmarkEnd w:id="86"/>
+    <w:bookmarkStart w:id="88" w:name="ref-munoz2021era5land"/>
     <w:p>
       <w:pPr>
         <w:pStyle w:val="Bibliography"/>
@@ -6651,7 +6659,7 @@
       <w:r>
         <w:t xml:space="preserve"> </w:t>
       </w:r>
-      <w:hyperlink r:id="rId85">
+      <w:hyperlink r:id="rId87">
         <w:r>
           <w:rPr>
             <w:rStyle w:val="Hyperlink"/>
@@ -6660,8 +6668,8 @@
         </w:r>
       </w:hyperlink>
     </w:p>
-    <w:bookmarkEnd w:id="86"/>
-    <w:bookmarkStart w:id="88" w:name="ref-niculescu2005"/>
+    <w:bookmarkEnd w:id="88"/>
+    <w:bookmarkStart w:id="90" w:name="ref-niculescu2005"/>
     <w:p>
       <w:pPr>
         <w:pStyle w:val="Bibliography"/>
@@ -6685,7 +6693,7 @@
       <w:r>
         <w:t xml:space="preserve"> </w:t>
       </w:r>
-      <w:hyperlink r:id="rId87">
+      <w:hyperlink r:id="rId89">
         <w:r>
           <w:rPr>
             <w:rStyle w:val="Hyperlink"/>
@@ -6694,8 +6702,8 @@
         </w:r>
       </w:hyperlink>
     </w:p>
-    <w:bookmarkEnd w:id="88"/>
-    <w:bookmarkStart w:id="90" w:name="ref-pivello2021"/>
+    <w:bookmarkEnd w:id="90"/>
+    <w:bookmarkStart w:id="92" w:name="ref-pivello2021"/>
     <w:p>
       <w:pPr>
         <w:pStyle w:val="Bibliography"/>
@@ -6732,7 +6740,7 @@
       <w:r>
         <w:t xml:space="preserve"> </w:t>
       </w:r>
-      <w:hyperlink r:id="rId89">
+      <w:hyperlink r:id="rId91">
         <w:r>
           <w:rPr>
             <w:rStyle w:val="Hyperlink"/>
@@ -6741,8 +6749,8 @@
         </w:r>
       </w:hyperlink>
     </w:p>
-    <w:bookmarkEnd w:id="90"/>
-    <w:bookmarkStart w:id="91" w:name="ref-platt1999"/>
+    <w:bookmarkEnd w:id="92"/>
+    <w:bookmarkStart w:id="93" w:name="ref-platt1999"/>
     <w:p>
       <w:pPr>
         <w:pStyle w:val="Bibliography"/>
@@ -6764,8 +6772,8 @@
         <w:t xml:space="preserve">, 61–74.</w:t>
       </w:r>
     </w:p>
-    <w:bookmarkEnd w:id="91"/>
-    <w:bookmarkStart w:id="93" w:name="ref-ploton2020"/>
+    <w:bookmarkEnd w:id="93"/>
+    <w:bookmarkStart w:id="95" w:name="ref-ploton2020"/>
     <w:p>
       <w:pPr>
         <w:pStyle w:val="Bibliography"/>
@@ -6802,7 +6810,7 @@
       <w:r>
         <w:t xml:space="preserve"> </w:t>
       </w:r>
-      <w:hyperlink r:id="rId92">
+      <w:hyperlink r:id="rId94">
         <w:r>
           <w:rPr>
             <w:rStyle w:val="Hyperlink"/>
@@ -6811,8 +6819,8 @@
         </w:r>
       </w:hyperlink>
     </w:p>
-    <w:bookmarkEnd w:id="93"/>
-    <w:bookmarkStart w:id="95" w:name="ref-raasveldt2019duckdb"/>
+    <w:bookmarkEnd w:id="95"/>
+    <w:bookmarkStart w:id="97" w:name="ref-raasveldt2019duckdb"/>
     <w:p>
       <w:pPr>
         <w:pStyle w:val="Bibliography"/>
@@ -6836,7 +6844,7 @@
       <w:r>
         <w:t xml:space="preserve"> </w:t>
       </w:r>
-      <w:hyperlink r:id="rId94">
+      <w:hyperlink r:id="rId96">
         <w:r>
           <w:rPr>
             <w:rStyle w:val="Hyperlink"/>
@@ -6845,8 +6853,8 @@
         </w:r>
       </w:hyperlink>
     </w:p>
-    <w:bookmarkEnd w:id="95"/>
-    <w:bookmarkStart w:id="97" w:name="ref-roberts2017"/>
+    <w:bookmarkEnd w:id="97"/>
+    <w:bookmarkStart w:id="99" w:name="ref-roberts2017"/>
     <w:p>
       <w:pPr>
         <w:pStyle w:val="Bibliography"/>
@@ -6883,7 +6891,7 @@
       <w:r>
         <w:t xml:space="preserve"> </w:t>
       </w:r>
-      <w:hyperlink r:id="rId96">
+      <w:hyperlink r:id="rId98">
         <w:r>
           <w:rPr>
             <w:rStyle w:val="Hyperlink"/>
@@ -6892,8 +6900,8 @@
         </w:r>
       </w:hyperlink>
     </w:p>
-    <w:bookmarkEnd w:id="97"/>
-    <w:bookmarkStart w:id="99" w:name="ref-sanmiguel2012"/>
+    <w:bookmarkEnd w:id="99"/>
+    <w:bookmarkStart w:id="101" w:name="ref-sanmiguel2012"/>
     <w:p>
       <w:pPr>
         <w:pStyle w:val="Bibliography"/>
@@ -6923,7 +6931,7 @@
       <w:r>
         <w:t xml:space="preserve"> </w:t>
       </w:r>
-      <w:hyperlink r:id="rId98">
+      <w:hyperlink r:id="rId100">
         <w:r>
           <w:rPr>
             <w:rStyle w:val="Hyperlink"/>
@@ -6932,8 +6940,8 @@
         </w:r>
       </w:hyperlink>
     </w:p>
-    <w:bookmarkEnd w:id="99"/>
-    <w:bookmarkStart w:id="101" w:name="ref-schroeder2014"/>
+    <w:bookmarkEnd w:id="101"/>
+    <w:bookmarkStart w:id="103" w:name="ref-schroeder2014"/>
     <w:p>
       <w:pPr>
         <w:pStyle w:val="Bibliography"/>
@@ -6982,7 +6990,7 @@
       <w:r>
         <w:t xml:space="preserve"> </w:t>
       </w:r>
-      <w:hyperlink r:id="rId100">
+      <w:hyperlink r:id="rId102">
         <w:r>
           <w:rPr>
             <w:rStyle w:val="Hyperlink"/>
@@ -6991,8 +6999,8 @@
         </w:r>
       </w:hyperlink>
     </w:p>
-    <w:bookmarkEnd w:id="101"/>
-    <w:bookmarkStart w:id="103" w:name="ref-setzer2019"/>
+    <w:bookmarkEnd w:id="103"/>
+    <w:bookmarkStart w:id="105" w:name="ref-setzer2019"/>
     <w:p>
       <w:pPr>
         <w:pStyle w:val="Bibliography"/>
@@ -7086,7 +7094,7 @@
       <w:r>
         <w:t xml:space="preserve"> </w:t>
       </w:r>
-      <w:hyperlink r:id="rId102">
+      <w:hyperlink r:id="rId104">
         <w:r>
           <w:rPr>
             <w:rStyle w:val="Hyperlink"/>
@@ -7095,8 +7103,8 @@
         </w:r>
       </w:hyperlink>
     </w:p>
-    <w:bookmarkEnd w:id="103"/>
-    <w:bookmarkStart w:id="105" w:name="ref-stocks1989"/>
+    <w:bookmarkEnd w:id="105"/>
+    <w:bookmarkStart w:id="107" w:name="ref-stocks1989"/>
     <w:p>
       <w:pPr>
         <w:pStyle w:val="Bibliography"/>
@@ -7133,7 +7141,7 @@
       <w:r>
         <w:t xml:space="preserve"> </w:t>
       </w:r>
-      <w:hyperlink r:id="rId104">
+      <w:hyperlink r:id="rId106">
         <w:r>
           <w:rPr>
             <w:rStyle w:val="Hyperlink"/>
@@ -7142,8 +7150,8 @@
         </w:r>
       </w:hyperlink>
     </w:p>
-    <w:bookmarkEnd w:id="105"/>
-    <w:bookmarkStart w:id="107" w:name="ref-tobler1970"/>
+    <w:bookmarkEnd w:id="107"/>
+    <w:bookmarkStart w:id="109" w:name="ref-tobler1970"/>
     <w:p>
       <w:pPr>
         <w:pStyle w:val="Bibliography"/>
@@ -7180,7 +7188,7 @@
       <w:r>
         <w:t xml:space="preserve"> </w:t>
       </w:r>
-      <w:hyperlink r:id="rId106">
+      <w:hyperlink r:id="rId108">
         <w:r>
           <w:rPr>
             <w:rStyle w:val="Hyperlink"/>
@@ -7189,8 +7197,8 @@
         </w:r>
       </w:hyperlink>
     </w:p>
-    <w:bookmarkEnd w:id="107"/>
-    <w:bookmarkStart w:id="109" w:name="ref-vallejos2015"/>
+    <w:bookmarkEnd w:id="109"/>
+    <w:bookmarkStart w:id="111" w:name="ref-vallejos2015"/>
     <w:p>
       <w:pPr>
         <w:pStyle w:val="Bibliography"/>
@@ -7227,7 +7235,7 @@
       <w:r>
         <w:t xml:space="preserve"> </w:t>
       </w:r>
-      <w:hyperlink r:id="rId108">
+      <w:hyperlink r:id="rId110">
         <w:r>
           <w:rPr>
             <w:rStyle w:val="Hyperlink"/>
@@ -7236,8 +7244,8 @@
         </w:r>
       </w:hyperlink>
     </w:p>
-    <w:bookmarkEnd w:id="109"/>
-    <w:bookmarkStart w:id="110" w:name="ref-vanwagner1987"/>
+    <w:bookmarkEnd w:id="111"/>
+    <w:bookmarkStart w:id="112" w:name="ref-vanwagner1987"/>
     <w:p>
       <w:pPr>
         <w:pStyle w:val="Bibliography"/>
@@ -7272,9 +7280,9 @@
         <w:t xml:space="preserve">, 1–37.</w:t>
       </w:r>
     </w:p>
-    <w:bookmarkEnd w:id="110"/>
-    <w:bookmarkEnd w:id="111"/>
     <w:bookmarkEnd w:id="112"/>
+    <w:bookmarkEnd w:id="113"/>
+    <w:bookmarkEnd w:id="114"/>
     <w:sectPr>
       <w:footnotePr>
         <w:numRestart w:val="eachSect"/>

</xml_diff>

<commit_message>
feat(externo): agrega G0-Formosa, benchmark FWI/INPE y QA H4/H6
</commit_message>
<xml_diff>
--- a/entregables/en/manuscrito.docx
+++ b/entregables/en/manuscrito.docx
@@ -4882,7 +4882,7 @@
         <w:pStyle w:val="BodyText"/>
       </w:pPr>
       <w:r>
-        <w:t xml:space="preserve">With t-1 weather, M3 retains 0.7831/0.7613 and M2 0.7818/0.7463; M1 is lower and is reported in Supplementary Table S9. The small M3 drop shows that recurrence priors, not same-day weather, dominate the hybrid signal. This is why the current system is a nowcast/hindcast; a real day-ahead system would require forecast weather. Lead-time details are in Supplementary Table S9. As a direct leakage comparator, a coupled model trained on the combined fire sample with t-1 fire inputs did not materially outperform the decoupled task architecture: 0.8862 vs 0.8868 ROC-AUC in Chaco and 0.7871 vs 0.7806 in Oriental. This comparator uses the same gated case-control sample, so it does not test removal of gating; it only shows that the coupled shortcut does not provide a large advantage on this sample (Supplementary Table S19). A full 3 × 3 D2 sensitivity (15/25/35 km × 7/10/14 d) regenerated the 1:10 sampling and retrained M1, M2 and M3 for every combination. M3 outperformed M2 in all nine combinations on both validation and test, with a positive M3 − M2 ROC-AUC of +0.004 to +0.016, and was the best test model in all nine; its range was 0.771–0.782 in 2023 and 0.785–0.797 in Chaco for 2024–2025, and 0.759–0.768 and 0.750–0.755 in Oriental. The 7-day window gave the highest ROC-AUC in every region × radius pair, and the radius effect was small: 35 km was slightly better in Chaco and 25 km in Oriental. The D2 conclusion is therefore not an artefact of the 25 km/10 d choice (Supplementary Table S20). A four-fold rolling-origin backtest retrained M1/M2/M3 with training through Y−2, validation on Y−1 and test on Y. The M3−M2 ROC-AUC difference was +0.0030/+0.0059 in 2022, +0.0029/+0.0120 in 2023, +0.0038/+0.0166 in 2024 and +0.0019/+0.0084 in 2025 (Chaco/Oriental); the corresponding p-values were 0.032/0.006, 0.082/0.001, 0.004/0.001 and 0.148/0.001. The sign was positive in all eight region-fold comparisons, and M1 remained below M2 in every fold (Table S26; Figure S5). The temporal ordering is therefore not an artefact of the single 2024–2025 split. Across 20 runs (five seeds × two capacities × two regions), the M3−M2 difference remained positive in every run, with mean differences of +0.0036/+0.0035 in Chaco and +0.0128/+0.0128 in Oriental for the current/high-capacity configurations (Table S25). Adversarial validation separates training (2018–2022) from test (2024–2025) rows with AUC 0.8832/0.9241 (Chaco/Oriental); day-of-year, seasonal harmonics, 25-km historical density and 60-day water deficit dominate the discriminator (Table S29). The shift is real and is not eliminated by the temporal design; it is why the spatial and all-cell results are reported separately. Three further sensitivities bound the result. Stricter gate thresholds (VPD ≥ 1.0/1.2 kPa and 48-h rainfall &lt; 5/2 mm) retained 92–73 % of test positives and left M3 above M2 and FWI; removing the gate entirely (independent 1:10 sample) lowered M3 to 0.7924/0.7510 and M2 to 0.7833/0.7379, but M3 remained above M2 (+0.0091/+0.0131) and FWI (0.5105/0.5457; Table S31). Restricting labels to high-confidence detections retained 12.2 %/6.5 % of positives and raised ROC-AUC to 0.8228/0.7793, but precision–recall fell (0.0719/0.0246) because the retained subset has a different prevalence; FRP ≥ 10 MW retained 31.9 %/19.0 % and gave 0.8136/0.7763 (Table S30). The cloud-mask variant is unavailable. Sampling at 1:5 changed ROC-AUC by less than 0.001; the independent 1:20 sample lowered Chaco M3 ROC-AUC to 0.7926 and population precision by about 7 %, while Oriental remained stable (0.7526), and M3 stayed above M2 in both regions (Table S28). A permuted-label negative control reached AUC 0.6297/0.5138; removing historical features did not lower it (0.6276/0.5168), indicating residual cell-level association or feature leakage in Chaco (Table S32; Figure S7). The M3 score should therefore be read as a nowcast/prioritization signal, not a causal attribution. External spatial validation in Boquerón, after excluding the department and a 25-km buffer and recomputing priors, reproduced the M2/M3 discrimination (ROC-AUC 0.8104/0.8120; PR-AUC 0.2440/0.2505) but not a significant M3−M2 gain (+0.0016; p = 0.254). FWI was below chance (0.4719) and INPE reached 0.5845 (Table S33; Figure S9). Population precision was 0.0891 %/0.0678 % for M2/M3, with recall 16.2 %/27.1 %; M3 trades precision for recall. The M3−M2 difference was +0.0039 (p = 0.010) with a 20-km buffer, +0.0016 (p = 0.254) with 25 km and +0.0020 (p = 0.206) with 30 km (Table S33b), so the hybrid advantage is not robust to the buffer. The ranking transports spatially, but the operational preference for M3 over M2 does not.</w:t>
+        <w:t xml:space="preserve">With t-1 weather, M3 retains 0.7831/0.7613 and M2 0.7818/0.7463; M1 is lower and is reported in Supplementary Table S9. The small M3 drop shows that recurrence priors, not same-day weather, dominate the hybrid signal. This is why the current system is a nowcast/hindcast; a real day-ahead system would require forecast weather. Lead-time details are in Supplementary Table S9. As a direct leakage comparator, a coupled model trained on the combined fire sample with t-1 fire inputs did not materially outperform the decoupled task architecture: 0.8862 vs 0.8868 ROC-AUC in Chaco and 0.7871 vs 0.7806 in Oriental. This comparator uses the same gated case-control sample, so it does not test removal of gating; it only shows that the coupled shortcut does not provide a large advantage on this sample (Supplementary Table S19). A full 3 × 3 D2 sensitivity (15/25/35 km × 7/10/14 d) regenerated the 1:10 sampling and retrained M1, M2 and M3 for every combination. M3 outperformed M2 in all nine combinations on both validation and test, with a positive M3 − M2 ROC-AUC of +0.004 to +0.016, and was the best test model in all nine; its range was 0.771–0.782 in 2023 and 0.785–0.797 in Chaco for 2024–2025, and 0.759–0.768 and 0.750–0.755 in Oriental. The 7-day window gave the highest ROC-AUC in every region × radius pair, and the radius effect was small: 35 km was slightly better in Chaco and 25 km in Oriental. The D2 conclusion is therefore not an artefact of the 25 km/10 d choice (Supplementary Table S20). A four-fold rolling-origin backtest retrained M1/M2/M3 with training through Y−2, validation on Y−1 and test on Y. The M3−M2 ROC-AUC difference was +0.0030/+0.0059 in 2022, +0.0029/+0.0120 in 2023, +0.0038/+0.0166 in 2024 and +0.0019/+0.0084 in 2025 (Chaco/Oriental); the corresponding p-values were 0.032/0.006, 0.082/0.001, 0.004/0.001 and 0.148/0.001. The sign was positive in all eight region-fold comparisons, and M1 remained below M2 in every fold (Table S26; Figure S5). The temporal ordering is therefore not an artefact of the single 2024–2025 split. Across 20 runs (five seeds × two capacities × two regions), the M3−M2 difference remained positive in every run, with mean differences of +0.0036/+0.0035 in Chaco and +0.0128/+0.0128 in Oriental for the current/high-capacity configurations (Table S25). Adversarial validation separates training (2018–2022) from test (2024–2025) rows with AUC 0.8832/0.9241 (Chaco/Oriental); day-of-year, seasonal harmonics, 25-km historical density and 60-day water deficit dominate the discriminator (Table S29). The shift is real and is not eliminated by the temporal design; it is why the spatial and all-cell results are reported separately. Three further sensitivities bound the result. Stricter gate thresholds (VPD ≥ 1.0/1.2 kPa and 48-h rainfall &lt; 5/2 mm) retained 92–73 % of test positives and left M3 above M2 and FWI; removing the gate entirely (independent 1:10 sample) lowered M3 to 0.7924/0.7510 and M2 to 0.7833/0.7379, but M3 remained above M2 (+0.0091/+0.0131) and FWI (0.5105/0.5457; Table S31). Restricting labels to high-confidence detections retained 12.2 %/6.5 % of positives and raised ROC-AUC to 0.8228/0.7793, but precision–recall fell (0.0719/0.0246) because the retained subset has a different prevalence; FRP ≥ 10 MW retained 31.9 %/19.0 % and gave 0.8136/0.7763 (Table S30). The cloud-mask variant is unavailable. Sampling at 1:5 changed ROC-AUC by less than 0.001; the independent 1:20 sample lowered Chaco M3 ROC-AUC to 0.7926 and population precision by about 7 %, while Oriental remained stable (0.7526), and M3 stayed above M2 in both regions (Table S28). A permuted-label negative control reached AUC 0.6297/0.5138; removing historical features did not lower it (0.6276/0.5168), indicating residual cell-level association or feature leakage in Chaco (Table S32; Figure S7). The M3 score should therefore be read as a nowcast/prioritization signal, not a causal attribution. External spatial validation in Boquerón, after excluding the department and a 25-km buffer and recomputing priors, reproduced the M2/M3 discrimination (ROC-AUC 0.8104/0.8120; PR-AUC 0.2440/0.2505) but not a significant M3−M2 gain (+0.0016; p = 0.254). FWI was below chance (0.4719) and INPE reached 0.5845 (Table S33; Figure S9). Population precision was 0.0891 %/0.0678 % for M2/M3, with recall 16.2 %/27.1 %; M3 trades precision for recall. The M3−M2 difference was +0.0039 (p = 0.010) with a 20-km buffer, +0.0016 (p = 0.254) with 25 km and +0.0020 (p = 0.206) with 30 km (Table S33b), so the hybrid advantage is not robust to the buffer. The ranking transports spatially, but the operational preference for M3 over M2 does not. A pre-registered cross-country pilot in Formosa (Argentina) was lower: G0-C reached ROC-AUC 0.7133/0.7245 in 2024 and 0.7050/0.7112 in 2025 (M2/M3), below the 0.75 transport threshold, with a small positive M3−M2 gap (+0.0112 in 2024; +0.0062 in 2025). Because 22.3 % of Formosa is flooded forest (42.9 % of detections) and pasture fraction had PSI 1.18 against the Paraguay-Chaco training distribution, we read this as limited, conditional transport rather than a cross-country replication. The Canadian FWI and INPE were near chance in the same test (ROC-AUC 0.498/0.520 and 0.466/0.464 in 2024/2025), far below M2/M3 (Supplementary Note S5.11; Tables S34/S34c; Figure S10).</w:t>
       </w:r>
     </w:p>
     <w:bookmarkEnd w:id="38"/>
@@ -5455,7 +5455,7 @@
         <w:t xml:space="preserve"> </w:t>
       </w:r>
       <w:r>
-        <w:t xml:space="preserve">The study covers one country and two macro-regions without external-country validation. Fuel characterization relies on the annual MapBiomas Collection 2 series (2017–2023) joined by prior year, so 2024 uses the 2023 map with a one-year lag and 2025 extrapolates it with a two-year lag. Active-fire targets depend on VIIRS detections, which can miss sub-canopy or cloud-obscured fires in the absence of an explicit observation model, while ERA5-Land inputs (0.25°, 3-hourly) may smooth local intra-day VPD and wind peaks.</w:t>
+        <w:t xml:space="preserve">The study covers two macro-regions of Paraguay and includes only an exploratory cross-country test in Formosa; that test did not meet the pre-registered transport threshold and is not a full multi-country validation. Fuel characterization relies on the annual MapBiomas Collection 2 series (2017–2023) joined by prior year, so 2024 uses the 2023 map with a one-year lag and 2025 extrapolates it with a two-year lag. Active-fire targets depend on VIIRS detections, which can miss sub-canopy or cloud-obscured fires in the absence of an explicit observation model, while ERA5-Land inputs (0.25°, 3-hourly) may smooth local intra-day VPD and wind peaks.</w:t>
       </w:r>
     </w:p>
     <w:p>
@@ -5477,7 +5477,7 @@
         <w:t xml:space="preserve"> </w:t>
       </w:r>
       <w:r>
-        <w:t xml:space="preserve">Although D2 sensitivity across 15/25/35-km radii and 7/10/14-day windows confirmed that model rankings are stable under full retraining (Supplementary Table S20), the 2024–2025 test is retrospective rather than blind and shares 90.65 % of its active cells with the training period through temporal overlap; restricting to cells never seen in training reduces M3 ROC-AUC by 0.018/0.039 but keeps a positive M3 &gt; M2 gap in ROC-AUC and PR-AUC, although the ROC gap is not resolved in Oriental (Supplementary Table S27). Adversarial validation reaches AUC 0.8832/0.9241, confirming that the temporal shift is substantial and driven mainly by seasonal and historical-density features (Table S29). A permuted-label control remains above chance in Chaco (0.63), so residual cell-level or historical signal cannot be excluded; the score is a nowcasting signal, not a causal attribution. M3 loses its predictive advantage in unseen spatial blocks, which requires M2 as the operational fallback while M1 remains an insufficient baseline; The Boquerón external test is within Paraguay; it provides derived population metrics but no cross-country transport, and M3’s gain over M2 is not significant at the primary 25-km buffer. conformal coverage (90.17 %/90.31 % at the 90 % level) is empirical rather than formally guaranteed under temporal shift; and the coupled</w:t>
+        <w:t xml:space="preserve">Although D2 sensitivity across 15/25/35-km radii and 7/10/14-day windows confirmed that model rankings are stable under full retraining (Supplementary Table S20), the 2024–2025 test is retrospective rather than blind and shares 90.65 % of its active cells with the training period through temporal overlap; restricting to cells never seen in training reduces M3 ROC-AUC by 0.018/0.039 but keeps a positive M3 &gt; M2 gap in ROC-AUC and PR-AUC, although the ROC gap is not resolved in Oriental (Supplementary Table S27). Adversarial validation reaches AUC 0.8832/0.9241, confirming that the temporal shift is substantial and driven mainly by seasonal and historical-density features (Table S29). A permuted-label control remains above chance in Chaco (0.63), so residual cell-level or historical signal cannot be excluded; the score is a nowcasting signal, not a causal attribution. M3 loses its predictive advantage in unseen spatial blocks, which requires M2 as the operational fallback while M1 remains an insufficient baseline; The Boquerón test is within Paraguay and provides derived population metrics; the Formosa cross-country pilot was exploratory, used a different climate source (CDS/Hargreaves) and did not meet the transport threshold, so M3’s small gain there is not evidence of cross-country superiority. conformal coverage (90.17 %/90.31 % at the 90 % level) is empirical rather than formally guaranteed under temporal shift; and the coupled</w:t>
       </w:r>
       <w:r>
         <w:t xml:space="preserve"> </w:t>

</xml_diff>

<commit_message>
feat(fig01): rediseña el marco computacional y regenera entregables
</commit_message>
<xml_diff>
--- a/entregables/en/manuscrito.docx
+++ b/entregables/en/manuscrito.docx
@@ -927,7 +927,7 @@
             <w:r>
               <w:drawing>
                 <wp:inline>
-                  <wp:extent cx="5334000" cy="2936902"/>
+                  <wp:extent cx="5334000" cy="3934472"/>
                   <wp:effectExtent b="0" l="0" r="0" t="0"/>
                   <wp:docPr descr="" title="" id="12" name="Picture"/>
                   <a:graphic>
@@ -948,7 +948,7 @@
                         <pic:spPr bwMode="auto">
                           <a:xfrm>
                             <a:off x="0" y="0"/>
-                            <a:ext cx="5334000" cy="2936902"/>
+                            <a:ext cx="5334000" cy="3934472"/>
                           </a:xfrm>
                           <a:prstGeom prst="rect">
                             <a:avLst/>
@@ -977,7 +977,64 @@
               <w:pStyle w:val="ImageCaption"/>
             </w:pPr>
             <w:r>
-              <w:t xml:space="preserve">Figure 1: Computational framework: multi-source inputs, D2 target operator, biophysical gate, decoupled M3/M2 ignition and t-1 propagation, reproducible evaluation and open outputs.</w:t>
+              <w:t xml:space="preserve">Figure 1: Computational framework. (a) Daily 1-km² inputs (VIIRS 375 m, ERA5-Land 3-hourly, MapBiomas C2, Hansen GFC and causal historical priors) pass through a biophysical gate (fuel = 1, VPD ≥ 0.8 kPa, 48-h rainfall &lt; 10 mm); the gate removes 21.7 % of cell-days but retains 97.17 % of thermal detections and is not a label filter. (b) D2 separates primary ignition from tactical propagation; the domains are disjoint.</w:t>
+            </w:r>
+            <w:r>
+              <w:t xml:space="preserve"> </w:t>
+            </w:r>
+            <w:r>
+              <w:rPr>
+                <w:rStyle w:val="VerbatimChar"/>
+              </w:rPr>
+              <w:t xml:space="preserve">N25(i,t−1)</w:t>
+            </w:r>
+            <w:r>
+              <w:t xml:space="preserve"> </w:t>
+            </w:r>
+            <w:r>
+              <w:t xml:space="preserve">is the set of cells within 25 km with fire at t−1 and</w:t>
+            </w:r>
+            <w:r>
+              <w:t xml:space="preserve"> </w:t>
+            </w:r>
+            <w:r>
+              <w:rPr>
+                <w:rStyle w:val="VerbatimChar"/>
+              </w:rPr>
+              <w:t xml:space="preserve">H10(i,t)</w:t>
+            </w:r>
+            <w:r>
+              <w:t xml:space="preserve"> </w:t>
+            </w:r>
+            <w:r>
+              <w:t xml:space="preserve">any same-cell detection in the previous 10 d. (c) Operational ignition uses M3 for cells with</w:t>
+            </w:r>
+            <w:r>
+              <w:t xml:space="preserve"> </w:t>
+            </w:r>
+            <w:r>
+              <w:rPr>
+                <w:rStyle w:val="VerbatimChar"/>
+              </w:rPr>
+              <w:t xml:space="preserve">freq_hist_1km &gt; 0</w:t>
+            </w:r>
+            <w:r>
+              <w:t xml:space="preserve"> </w:t>
+            </w:r>
+            <w:r>
+              <w:t xml:space="preserve">and M2 as fallback for</w:t>
+            </w:r>
+            <w:r>
+              <w:t xml:space="preserve"> </w:t>
+            </w:r>
+            <w:r>
+              <w:rPr>
+                <w:rStyle w:val="VerbatimChar"/>
+              </w:rPr>
+              <w:t xml:space="preserve">freq_hist_1km = 0</w:t>
+            </w:r>
+            <w:r>
+              <w:t xml:space="preserve">; propagation uses a causal t−1 kernel. Probabilities are calibrated with a monotonic Platt transform and a frozen F0.5 cutoff after prior correction; M1 (24 variables) is a diagnostic baseline and is not shown. (d) Evaluation uses a temporal split (2018–2022/2023/2024–2025), 50-km spatial blocks with a 20-km buffer, date-grouped bootstrap (500 AUC CI; 1,000 paired), cost-loss and open code/data; the 20-km buffer applies only to the spatial holdout.</w:t>
             </w:r>
           </w:p>
           <w:bookmarkEnd w:id="14"/>
@@ -6959,7 +7016,7 @@
         <w:pStyle w:val="FirstParagraph"/>
       </w:pPr>
       <w:r>
-        <w:t xml:space="preserve">Figure 1: Computational framework: multi-source inputs, D2 target operator, biophysical gate, decoupled M3/M2 ignition and t-1 propagation, reproducible evaluation and open outputs.</w:t>
+        <w:t xml:space="preserve">Figure 1: Computational framework. (a) Multisource 1-km² ingestion and biophysical gate; (b) D2 target operator; (c) decoupled M3/M2 ignition and t−1 propagation; (d) temporal, spatial, bootstrap and cost-loss evaluation. M1 is a diagnostic baseline; the 20-km buffer applies only to the spatial holdout.</w:t>
       </w:r>
     </w:p>
     <w:p>

</xml_diff>

<commit_message>
feat(fig01): restituye mapa de dominio y separa el resumen gráfico
El resumen gráfico queda como archivo independiente, el mapa de dominio vuelve al cuerpo como Figure 1 y el suplemento pasa a Figuras S1–S10. Actualiza numeración, maestros, checklist y verificador.
</commit_message>
<xml_diff>
--- a/entregables/en/manuscrito.docx
+++ b/entregables/en/manuscrito.docx
@@ -141,6 +141,257 @@
       </w:r>
       <w:r>
         <w:t xml:space="preserve">−1 fire inputs, using M2 as a fallback for cells without history and M1 as a biophysical baseline. On 2023 validation, M3 reaches ROC-AUC 0.7844/0.7628 (Chaco/Oriental) versus 0.7817/0.7496 for M2. In 2023 spatial blocks, M2 is most robust (0.6773/0.7470); M1 does not beat M2 on cells without history. An independent confirmation holdout also retained M2 (0.6871/0.6621). On the retrospective 2024–2025 test, M3 reaches 0.8021/0.7534 versus 0.5059/0.5611 for the Canadian Forest Fire Weather Index (FWI) and 0.5266/0.4973 for the INPE Risco de Fogo; propagation reaches 0.9039/0.7859. Population-level ignition precision is 0.082 %/0.198 % (95 % CI 0.075–0.088/0.178–0.222), and decision value is concentrated in propagation, confirming a screening-and-prioritization role rather than a stand-alone warning system. The contribution is the open D2 operator, gated inference and evaluation harness, released as reproducible software.</w:t>
+      </w:r>
+    </w:p>
+    <w:bookmarkStart w:id="9" w:name="introduction"/>
+    <w:p>
+      <w:pPr>
+        <w:pStyle w:val="Heading1"/>
+      </w:pPr>
+      <w:r>
+        <w:t xml:space="preserve">1. Introduction</w:t>
+      </w:r>
+    </w:p>
+    <w:p>
+      <w:pPr>
+        <w:pStyle w:val="FirstParagraph"/>
+      </w:pPr>
+      <w:r>
+        <w:t xml:space="preserve">Vegetation fires in the South American Gran Chaco are a recurring threat to ecosystems, regional climate and public health</w:t>
+      </w:r>
+      <w:r>
+        <w:t xml:space="preserve"> </w:t>
+      </w:r>
+      <w:r>
+        <w:t xml:space="preserve">(Baumann et al., 2017; Flannigan et al., 2009; Jolly et al., 2015)</w:t>
+      </w:r>
+      <w:r>
+        <w:t xml:space="preserve">. The region combines some of the fastest agricultural frontiers in South America with prolonged dry seasons and extreme heat</w:t>
+      </w:r>
+      <w:r>
+        <w:t xml:space="preserve"> </w:t>
+      </w:r>
+      <w:r>
+        <w:t xml:space="preserve">(Alvarado et al., 2018; Pivello et al., 2021; Vallejos et al., 2015)</w:t>
+      </w:r>
+      <w:r>
+        <w:t xml:space="preserve">. Operational fire danger there is still largely based on fire-weather indices developed for temperate or tropical savanna systems: the Canadian Forest Fire Weather Index (FWI)</w:t>
+      </w:r>
+      <w:r>
+        <w:t xml:space="preserve"> </w:t>
+      </w:r>
+      <w:r>
+        <w:t xml:space="preserve">(San-Miguel-Ayanz et al., 2012; Stocks et al., 1989; Van Wagner, 1987)</w:t>
+      </w:r>
+      <w:r>
+        <w:t xml:space="preserve"> </w:t>
+      </w:r>
+      <w:r>
+        <w:t xml:space="preserve">and the Instituto Nacional de Pesquisas Espaciais (INPE) Risco de Fogo</w:t>
+      </w:r>
+      <w:r>
+        <w:t xml:space="preserve"> </w:t>
+      </w:r>
+      <w:r>
+        <w:t xml:space="preserve">(Setzer et al., 2019)</w:t>
+      </w:r>
+      <w:r>
+        <w:t xml:space="preserve">. These indices are widely used, but they were not designed for the moisture-limited, fuel-limited and strongly anthropogenic ignition regime of the Dry Chaco.</w:t>
+      </w:r>
+    </w:p>
+    <w:p>
+      <w:pPr>
+        <w:pStyle w:val="BodyText"/>
+      </w:pPr>
+      <w:r>
+        <w:t xml:space="preserve">Machine learning has become a common alternative for fire susceptibility mapping</w:t>
+      </w:r>
+      <w:r>
+        <w:t xml:space="preserve"> </w:t>
+      </w:r>
+      <w:r>
+        <w:t xml:space="preserve">(Barmpoutis et al., 2020; Jain et al., 2020)</w:t>
+      </w:r>
+      <w:r>
+        <w:t xml:space="preserve">, typically with gradient-boosted trees</w:t>
+      </w:r>
+      <w:r>
+        <w:t xml:space="preserve"> </w:t>
+      </w:r>
+      <w:r>
+        <w:t xml:space="preserve">(Ke et al., 2017)</w:t>
+      </w:r>
+      <w:r>
+        <w:t xml:space="preserve">. Two methodological problems limit the operational value of many published models. First, when spatial lags or</w:t>
+      </w:r>
+      <w:r>
+        <w:t xml:space="preserve"> </w:t>
+      </w:r>
+      <w:r>
+        <w:rPr>
+          <w:i/>
+          <w:iCs/>
+        </w:rPr>
+        <w:t xml:space="preserve">t</w:t>
+      </w:r>
+      <w:r>
+        <w:t xml:space="preserve">−1 fire variables enter the ignition layer, the model learns persistence rather than ignition; reported discrimination can be high while the model is unable to anticipate new ignitions</w:t>
+      </w:r>
+      <w:r>
+        <w:t xml:space="preserve"> </w:t>
+      </w:r>
+      <w:r>
+        <w:t xml:space="preserve">(Dormann et al., 2007; Legendre, 1993; Ploton et al., 2020; Roberts et al., 2017; Tobler, 1970)</w:t>
+      </w:r>
+      <w:r>
+        <w:t xml:space="preserve">. Second, fire-weather indices calibrated in boreal or temperate systems do not necessarily transfer to subtropical biomes, and their failure is rarely quantified on a common retrospective test. A reproducible benchmark is therefore needed not only to compare models, but to make the target definition, the leakage controls and the evaluation protocol explicit enough to be audited. The two tasks are also physically distinct: primary ignition is controlled by fine-fuel curing, atmospheric water demand and human land management, whereas tactical propagation is governed by thermal radiation and the proximity of active perimeters. Conflating both processes into a single binary label does not only introduce a statistical shortcut; it also mixes two different physical regimes that respond to different predictors.</w:t>
+      </w:r>
+    </w:p>
+    <w:p>
+      <w:pPr>
+        <w:pStyle w:val="BodyText"/>
+      </w:pPr>
+      <w:r>
+        <w:t xml:space="preserve">The operational context adds a third constraint: most agencies need a daily product that can run on commodity hardware, with transparent inputs and a documented failure mode. A model that cannot be reproduced or audited is difficult to adopt even when its aggregate score is high. The framework is therefore designed around explicit targets, a frozen test and a small, inspectable software stack.</w:t>
+      </w:r>
+    </w:p>
+    <w:p>
+      <w:pPr>
+        <w:pStyle w:val="BodyText"/>
+      </w:pPr>
+      <w:r>
+        <w:t xml:space="preserve">We address these methodological and operational constraints over the continuous 2018–2025 Visible Infrared Imaging Radiometer Suite (VIIRS) record (Suomi-NPP, NOAA-20 and NOAA-21) across a 1-km² national grid of Paraguay (400 006 cells)</w:t>
+      </w:r>
+      <w:r>
+        <w:t xml:space="preserve"> </w:t>
+      </w:r>
+      <w:r>
+        <w:t xml:space="preserve">(Schroeder et al., 2014)</w:t>
+      </w:r>
+      <w:r>
+        <w:t xml:space="preserve">. While keeping the underlying learner intentionally replaceable, we formalize four reusable computational contributions:</w:t>
+      </w:r>
+    </w:p>
+    <w:p>
+      <w:pPr>
+        <w:pStyle w:val="Compact"/>
+        <w:numPr>
+          <w:ilvl w:val="0"/>
+          <w:numId w:val="1001"/>
+        </w:numPr>
+      </w:pPr>
+      <w:r>
+        <w:rPr>
+          <w:b/>
+          <w:bCs/>
+        </w:rPr>
+        <w:t xml:space="preserve">D2 target operator.</w:t>
+      </w:r>
+      <w:r>
+        <w:t xml:space="preserve"> </w:t>
+      </w:r>
+      <w:r>
+        <w:t xml:space="preserve">A formal target contract that separates primary ignition from tactical propagation, prevents persistence from being mixed with ignition and makes leakage checks explicit.</w:t>
+      </w:r>
+    </w:p>
+    <w:p>
+      <w:pPr>
+        <w:pStyle w:val="Compact"/>
+        <w:numPr>
+          <w:ilvl w:val="0"/>
+          <w:numId w:val="1001"/>
+        </w:numPr>
+      </w:pPr>
+      <w:r>
+        <w:rPr>
+          <w:b/>
+          <w:bCs/>
+        </w:rPr>
+        <w:t xml:space="preserve">Gated M3/M2 inference.</w:t>
+      </w:r>
+      <w:r>
+        <w:t xml:space="preserve"> </w:t>
+      </w:r>
+      <w:r>
+        <w:t xml:space="preserve">A two-stage policy that combines biophysical screening with a recurrence-aware hybrid model (M3) where fire history exists and a historical-anchor fallback (M2) where it does not.</w:t>
+      </w:r>
+    </w:p>
+    <w:p>
+      <w:pPr>
+        <w:pStyle w:val="Compact"/>
+        <w:numPr>
+          <w:ilvl w:val="0"/>
+          <w:numId w:val="1001"/>
+        </w:numPr>
+      </w:pPr>
+      <w:r>
+        <w:rPr>
+          <w:b/>
+          <w:bCs/>
+        </w:rPr>
+        <w:t xml:space="preserve">Reproducible evaluation harness.</w:t>
+      </w:r>
+      <w:r>
+        <w:t xml:space="preserve"> </w:t>
+      </w:r>
+      <w:r>
+        <w:t xml:space="preserve">A unified protocol that integrates temporal holdout, spatial blocks, date-grouped bootstrap, lead-time analysis, conformal coverage and cost-loss evaluation.</w:t>
+      </w:r>
+    </w:p>
+    <w:p>
+      <w:pPr>
+        <w:pStyle w:val="Compact"/>
+        <w:numPr>
+          <w:ilvl w:val="0"/>
+          <w:numId w:val="1001"/>
+        </w:numPr>
+      </w:pPr>
+      <w:r>
+        <w:rPr>
+          <w:b/>
+          <w:bCs/>
+        </w:rPr>
+        <w:t xml:space="preserve">Open software and data.</w:t>
+      </w:r>
+      <w:r>
+        <w:t xml:space="preserve"> </w:t>
+      </w:r>
+      <w:r>
+        <w:t xml:space="preserve">A vectorized, zero-copy Polars/DuckDB pipeline with public code, archived DOIs and automated tests.</w:t>
+      </w:r>
+    </w:p>
+    <w:p>
+      <w:pPr>
+        <w:pStyle w:val="FirstParagraph"/>
+      </w:pPr>
+      <w:r>
+        <w:t xml:space="preserve">The novelty is computational and infrastructural rather than algorithmic: D2 formalizes the target contract, gated inference defines the operational policy, and the software exposes that contract to other learners. The geoscientific contribution is a transferable, leakage-controlled benchmark: full FWI and INPE are tested under the same D2 protocol in the Gran Chaco, and the temporal versus spatial limits of the hybrid model are reported explicitly. The national case study is a testbed for data-scarce subtropical regions; we do not claim universal validity.</w:t>
+      </w:r>
+    </w:p>
+    <w:p>
+      <w:pPr>
+        <w:pStyle w:val="BodyText"/>
+      </w:pPr>
+      <w:r>
+        <w:t xml:space="preserve">The remainder of the paper is organized as follows. Section 2 defines the D2 operator, the biophysical gate, the decoupled inference architecture and the evaluation harness. Section 3 reports selection on 2023 validation, the retrospective 2024–2025 test, the benchmark against FWI and INPE, the spatial and temporal generalization analyses and the operational value. Section 4 discusses why canonical indices fail, what decoupling buys and where it fails, and the limitations of the study. Section 5 concludes.</w:t>
+      </w:r>
+    </w:p>
+    <w:bookmarkEnd w:id="9"/>
+    <w:bookmarkStart w:id="22" w:name="computational-framework"/>
+    <w:p>
+      <w:pPr>
+        <w:pStyle w:val="Heading1"/>
+      </w:pPr>
+      <w:r>
+        <w:t xml:space="preserve">2. Computational framework</w:t>
+      </w:r>
+    </w:p>
+    <w:p>
+      <w:pPr>
+        <w:pStyle w:val="FirstParagraph"/>
+      </w:pPr>
+      <w:r>
+        <w:t xml:space="preserve">The framework operates over the national 1-km² grid of Paraguay, divided into the Dry Chaco and Oriental Region (Figure 1). All target construction, inference and evaluation steps below use this domain.</w:t>
       </w:r>
     </w:p>
     <w:tbl>
@@ -156,7 +407,7 @@
       <w:tr>
         <w:tc>
           <w:tcPr/>
-          <w:bookmarkStart w:id="12" w:name="fig-graphical"/>
+          <w:bookmarkStart w:id="13" w:name="fig-area"/>
           <w:p>
             <w:pPr>
               <w:pStyle w:val="Compact"/>
@@ -165,20 +416,20 @@
             <w:r>
               <w:drawing>
                 <wp:inline>
-                  <wp:extent cx="4054501" cy="1621189"/>
+                  <wp:extent cx="4267200" cy="4742348"/>
                   <wp:effectExtent b="0" l="0" r="0" t="0"/>
-                  <wp:docPr descr="" title="" id="10" name="Picture"/>
+                  <wp:docPr descr="" title="" id="11" name="Picture"/>
                   <a:graphic>
                     <a:graphicData uri="http://schemas.openxmlformats.org/drawingml/2006/picture">
                       <pic:pic>
                         <pic:nvPicPr>
-                          <pic:cNvPr descr="../../entregables/figuras/graphical_abstract.png" id="11" name="Picture"/>
+                          <pic:cNvPr descr="../../entregables/figuras/fig01_macro_regiones_cobertura.png" id="12" name="Picture"/>
                           <pic:cNvPicPr>
                             <a:picLocks noChangeArrowheads="1" noChangeAspect="1"/>
                           </pic:cNvPicPr>
                         </pic:nvPicPr>
                         <pic:blipFill>
-                          <a:blip r:embed="rId9"/>
+                          <a:blip r:embed="rId10"/>
                           <a:stretch>
                             <a:fillRect/>
                           </a:stretch>
@@ -186,7 +437,7 @@
                         <pic:spPr bwMode="auto">
                           <a:xfrm>
                             <a:off x="0" y="0"/>
-                            <a:ext cx="4054501" cy="1621189"/>
+                            <a:ext cx="4267200" cy="4742348"/>
                           </a:xfrm>
                           <a:prstGeom prst="rect">
                             <a:avLst/>
@@ -215,256 +466,13 @@
               <w:pStyle w:val="ImageCaption"/>
             </w:pPr>
             <w:r>
-              <w:t xml:space="preserve">Figure 1: Graphical abstract. Temporal skill is not spatial skill: M3 provides a temporal ignition nowcast, M2 remains the fallback in unseen blocks, and decision value is concentrated in propagation. Figure 2 details the computational framework.</w:t>
+              <w:t xml:space="preserve">Figure 1: Study domain and regional split: Dry Chaco (west) and Oriental Region (east) over the national 1-km² grid (EPSG:32721).</w:t>
             </w:r>
           </w:p>
-          <w:bookmarkEnd w:id="12"/>
+          <w:bookmarkEnd w:id="13"/>
         </w:tc>
       </w:tr>
     </w:tbl>
-    <w:bookmarkStart w:id="13" w:name="introduction"/>
-    <w:p>
-      <w:pPr>
-        <w:pStyle w:val="Heading1"/>
-      </w:pPr>
-      <w:r>
-        <w:t xml:space="preserve">1. Introduction</w:t>
-      </w:r>
-    </w:p>
-    <w:p>
-      <w:pPr>
-        <w:pStyle w:val="FirstParagraph"/>
-      </w:pPr>
-      <w:r>
-        <w:t xml:space="preserve">Vegetation fires in the South American Gran Chaco are a recurring threat to ecosystems, regional climate and public health</w:t>
-      </w:r>
-      <w:r>
-        <w:t xml:space="preserve"> </w:t>
-      </w:r>
-      <w:r>
-        <w:t xml:space="preserve">(Baumann et al., 2017; Flannigan et al., 2009; Jolly et al., 2015)</w:t>
-      </w:r>
-      <w:r>
-        <w:t xml:space="preserve">. The region combines some of the fastest agricultural frontiers in South America with prolonged dry seasons and extreme heat</w:t>
-      </w:r>
-      <w:r>
-        <w:t xml:space="preserve"> </w:t>
-      </w:r>
-      <w:r>
-        <w:t xml:space="preserve">(Alvarado et al., 2018; Pivello et al., 2021; Vallejos et al., 2015)</w:t>
-      </w:r>
-      <w:r>
-        <w:t xml:space="preserve">. Operational fire danger there is still largely based on fire-weather indices developed for temperate or tropical savanna systems: the Canadian Forest Fire Weather Index (FWI)</w:t>
-      </w:r>
-      <w:r>
-        <w:t xml:space="preserve"> </w:t>
-      </w:r>
-      <w:r>
-        <w:t xml:space="preserve">(San-Miguel-Ayanz et al., 2012; Stocks et al., 1989; Van Wagner, 1987)</w:t>
-      </w:r>
-      <w:r>
-        <w:t xml:space="preserve"> </w:t>
-      </w:r>
-      <w:r>
-        <w:t xml:space="preserve">and the Instituto Nacional de Pesquisas Espaciais (INPE) Risco de Fogo</w:t>
-      </w:r>
-      <w:r>
-        <w:t xml:space="preserve"> </w:t>
-      </w:r>
-      <w:r>
-        <w:t xml:space="preserve">(Setzer et al., 2019)</w:t>
-      </w:r>
-      <w:r>
-        <w:t xml:space="preserve">. These indices are widely used, but they were not designed for the moisture-limited, fuel-limited and strongly anthropogenic ignition regime of the Dry Chaco.</w:t>
-      </w:r>
-    </w:p>
-    <w:p>
-      <w:pPr>
-        <w:pStyle w:val="BodyText"/>
-      </w:pPr>
-      <w:r>
-        <w:t xml:space="preserve">Machine learning has become a common alternative for fire susceptibility mapping</w:t>
-      </w:r>
-      <w:r>
-        <w:t xml:space="preserve"> </w:t>
-      </w:r>
-      <w:r>
-        <w:t xml:space="preserve">(Barmpoutis et al., 2020; Jain et al., 2020)</w:t>
-      </w:r>
-      <w:r>
-        <w:t xml:space="preserve">, typically with gradient-boosted trees</w:t>
-      </w:r>
-      <w:r>
-        <w:t xml:space="preserve"> </w:t>
-      </w:r>
-      <w:r>
-        <w:t xml:space="preserve">(Ke et al., 2017)</w:t>
-      </w:r>
-      <w:r>
-        <w:t xml:space="preserve">. Two methodological problems limit the operational value of many published models. First, when spatial lags or</w:t>
-      </w:r>
-      <w:r>
-        <w:t xml:space="preserve"> </w:t>
-      </w:r>
-      <w:r>
-        <w:rPr>
-          <w:i/>
-          <w:iCs/>
-        </w:rPr>
-        <w:t xml:space="preserve">t</w:t>
-      </w:r>
-      <w:r>
-        <w:t xml:space="preserve">−1 fire variables enter the ignition layer, the model learns persistence rather than ignition; reported discrimination can be high while the model is unable to anticipate new ignitions</w:t>
-      </w:r>
-      <w:r>
-        <w:t xml:space="preserve"> </w:t>
-      </w:r>
-      <w:r>
-        <w:t xml:space="preserve">(Dormann et al., 2007; Legendre, 1993; Ploton et al., 2020; Roberts et al., 2017; Tobler, 1970)</w:t>
-      </w:r>
-      <w:r>
-        <w:t xml:space="preserve">. Second, fire-weather indices calibrated in boreal or temperate systems do not necessarily transfer to subtropical biomes, and their failure is rarely quantified on a common retrospective test. A reproducible benchmark is therefore needed not only to compare models, but to make the target definition, the leakage controls and the evaluation protocol explicit enough to be audited. The two tasks are also physically distinct: primary ignition is controlled by fine-fuel curing, atmospheric water demand and human land management, whereas tactical propagation is governed by thermal radiation and the proximity of active perimeters. Conflating both processes into a single binary label does not only introduce a statistical shortcut; it also mixes two different physical regimes that respond to different predictors.</w:t>
-      </w:r>
-    </w:p>
-    <w:p>
-      <w:pPr>
-        <w:pStyle w:val="BodyText"/>
-      </w:pPr>
-      <w:r>
-        <w:t xml:space="preserve">The operational context adds a third constraint: most agencies need a daily product that can run on commodity hardware, with transparent inputs and a documented failure mode. A model that cannot be reproduced or audited is difficult to adopt even when its aggregate score is high. The framework is therefore designed around explicit targets, a frozen test and a small, inspectable software stack.</w:t>
-      </w:r>
-    </w:p>
-    <w:p>
-      <w:pPr>
-        <w:pStyle w:val="BodyText"/>
-      </w:pPr>
-      <w:r>
-        <w:t xml:space="preserve">We address these methodological and operational constraints over the continuous 2018–2025 Visible Infrared Imaging Radiometer Suite (VIIRS) record (Suomi-NPP, NOAA-20 and NOAA-21) across a 1-km² national grid of Paraguay (400 006 cells)</w:t>
-      </w:r>
-      <w:r>
-        <w:t xml:space="preserve"> </w:t>
-      </w:r>
-      <w:r>
-        <w:t xml:space="preserve">(Schroeder et al., 2014)</w:t>
-      </w:r>
-      <w:r>
-        <w:t xml:space="preserve">. While keeping the underlying learner intentionally replaceable, we formalize four reusable computational contributions:</w:t>
-      </w:r>
-    </w:p>
-    <w:p>
-      <w:pPr>
-        <w:pStyle w:val="Compact"/>
-        <w:numPr>
-          <w:ilvl w:val="0"/>
-          <w:numId w:val="1001"/>
-        </w:numPr>
-      </w:pPr>
-      <w:r>
-        <w:rPr>
-          <w:b/>
-          <w:bCs/>
-        </w:rPr>
-        <w:t xml:space="preserve">D2 target operator.</w:t>
-      </w:r>
-      <w:r>
-        <w:t xml:space="preserve"> </w:t>
-      </w:r>
-      <w:r>
-        <w:t xml:space="preserve">A formal target contract that separates primary ignition from tactical propagation, prevents persistence from being mixed with ignition and makes leakage checks explicit.</w:t>
-      </w:r>
-    </w:p>
-    <w:p>
-      <w:pPr>
-        <w:pStyle w:val="Compact"/>
-        <w:numPr>
-          <w:ilvl w:val="0"/>
-          <w:numId w:val="1001"/>
-        </w:numPr>
-      </w:pPr>
-      <w:r>
-        <w:rPr>
-          <w:b/>
-          <w:bCs/>
-        </w:rPr>
-        <w:t xml:space="preserve">Gated M3/M2 inference.</w:t>
-      </w:r>
-      <w:r>
-        <w:t xml:space="preserve"> </w:t>
-      </w:r>
-      <w:r>
-        <w:t xml:space="preserve">A two-stage policy that combines biophysical screening with a recurrence-aware hybrid model (M3) where fire history exists and a historical-anchor fallback (M2) where it does not.</w:t>
-      </w:r>
-    </w:p>
-    <w:p>
-      <w:pPr>
-        <w:pStyle w:val="Compact"/>
-        <w:numPr>
-          <w:ilvl w:val="0"/>
-          <w:numId w:val="1001"/>
-        </w:numPr>
-      </w:pPr>
-      <w:r>
-        <w:rPr>
-          <w:b/>
-          <w:bCs/>
-        </w:rPr>
-        <w:t xml:space="preserve">Reproducible evaluation harness.</w:t>
-      </w:r>
-      <w:r>
-        <w:t xml:space="preserve"> </w:t>
-      </w:r>
-      <w:r>
-        <w:t xml:space="preserve">A unified protocol that integrates temporal holdout, spatial blocks, date-grouped bootstrap, lead-time analysis, conformal coverage and cost-loss evaluation.</w:t>
-      </w:r>
-    </w:p>
-    <w:p>
-      <w:pPr>
-        <w:pStyle w:val="Compact"/>
-        <w:numPr>
-          <w:ilvl w:val="0"/>
-          <w:numId w:val="1001"/>
-        </w:numPr>
-      </w:pPr>
-      <w:r>
-        <w:rPr>
-          <w:b/>
-          <w:bCs/>
-        </w:rPr>
-        <w:t xml:space="preserve">Open software and data.</w:t>
-      </w:r>
-      <w:r>
-        <w:t xml:space="preserve"> </w:t>
-      </w:r>
-      <w:r>
-        <w:t xml:space="preserve">A vectorized, zero-copy Polars/DuckDB pipeline with public code, archived DOIs and automated tests.</w:t>
-      </w:r>
-    </w:p>
-    <w:p>
-      <w:pPr>
-        <w:pStyle w:val="FirstParagraph"/>
-      </w:pPr>
-      <w:r>
-        <w:t xml:space="preserve">The novelty is computational and infrastructural rather than algorithmic: D2 formalizes the target contract, gated inference defines the operational policy, and the software exposes that contract to other learners. The geoscientific contribution is a transferable, leakage-controlled benchmark: full FWI and INPE are tested under the same D2 protocol in the Gran Chaco, and the temporal versus spatial limits of the hybrid model are reported explicitly. The national case study is a testbed for data-scarce subtropical regions; we do not claim universal validity.</w:t>
-      </w:r>
-    </w:p>
-    <w:p>
-      <w:pPr>
-        <w:pStyle w:val="BodyText"/>
-      </w:pPr>
-      <w:r>
-        <w:t xml:space="preserve">The remainder of the paper is organized as follows. Section 2 defines the D2 operator, the biophysical gate, the decoupled inference architecture and the evaluation harness. Section 3 reports selection on 2023 validation, the retrospective 2024–2025 test, the benchmark against FWI and INPE, the spatial and temporal generalization analyses and the operational value. Section 4 discusses why canonical indices fail, what decoupling buys and where it fails, and the limitations of the study. Section 5 concludes.</w:t>
-      </w:r>
-    </w:p>
-    <w:bookmarkEnd w:id="13"/>
-    <w:bookmarkStart w:id="22" w:name="computational-framework"/>
-    <w:p>
-      <w:pPr>
-        <w:pStyle w:val="Heading1"/>
-      </w:pPr>
-      <w:r>
-        <w:t xml:space="preserve">2. Computational framework</w:t>
-      </w:r>
-    </w:p>
     <w:bookmarkStart w:id="14" w:name="d2-target-operator"/>
     <w:p>
       <w:pPr>
@@ -1333,7 +1341,7 @@
         <w:t xml:space="preserve">(Raasveldt and Mühleisen, 2019)</w:t>
       </w:r>
       <w:r>
-        <w:t xml:space="preserve">. A spatial join of 50 000 points is shown only as a reference (Supplementary Table S4); the operational lookup avoids point-in-polygon at inference. The full inference pipeline processes 400 006 cells in 3.474 s with 2 212.9 MB peak RAM on ARM64; x86_64 was not measured. The study domain and regional split are shown in Supplementary Figure S11; the per-stage profile is in Supplementary Table S4.</w:t>
+        <w:t xml:space="preserve">. A spatial join of 50 000 points is shown only as a reference (Supplementary Table S4); the operational lookup avoids point-in-polygon at inference. The full inference pipeline processes 400 006 cells in 3.474 s with 2 212.9 MB peak RAM on ARM64; x86_64 was not measured. The per-stage profile is in Supplementary Table S4.</w:t>
       </w:r>
     </w:p>
     <w:p>
@@ -7023,7 +7031,7 @@
         <w:pStyle w:val="FirstParagraph"/>
       </w:pPr>
       <w:r>
-        <w:t xml:space="preserve">Figure 1: Graphical abstract. Temporal skill is not spatial skill: temporal ignition nowcast, M2 fallback in unseen blocks and decision value in propagation.</w:t>
+        <w:t xml:space="preserve">Figure 1: Study domain and regional split: Dry Chaco (west) and Oriental Region (east) over the national 1-km² grid (EPSG:32721).</w:t>
       </w:r>
     </w:p>
     <w:p>

</xml_diff>

<commit_message>
style: divide párrafos largos y mejora la legibilidad
Separa la conclusión y los bloques de estabilidad temporal en párrafos independientes, en inglés y español.
</commit_message>
<xml_diff>
--- a/entregables/en/manuscrito.docx
+++ b/entregables/en/manuscrito.docx
@@ -1258,7 +1258,15 @@
         <w:pStyle w:val="FirstParagraph"/>
       </w:pPr>
       <w:r>
-        <w:t xml:space="preserve">The bootstrap resamples dates rather than rows, because daily fire activity is strongly temporally clustered. For each replicate, all cells from the sampled dates are retained; this preserves within-day dependence and gives more honest intervals than row-wise resampling. The same block structure is used for paired differences against FWI and INPE. The spatial holdout divides the country into 50-km blocks, removes an entire block and a 20-km buffer from training, recomputes the historical priors without the held-out fires and evaluates both held-in and held-out cells. The primary metrics are the area under the receiver operating characteristic curve (ROC-AUC) and precision–recall area under the curve (PR-AUC). We also report Brier score, expected calibration error, precision, recall, F0.5 and false positives at the validation cutoff. AUC confidence intervals use 500 grouped bootstrap replicates; paired model differences use 1 000 replicates. We define a pre-specified family of six confirmatory comparisons (four against FWI and INPE and two M3 − M2) and report Holm–Bonferroni and Benjamini–Hochberg adjusted p-values; all remain significant at α = 0.05 (Holm p = 0.006, BH p = 0.001). The bootstrap resolution is 0.001, so raw p-values at the floor are upper bounds. The protocol is applied without modifying the test set. The target operator, the list of test cell-days and the evaluation scripts are archived with the code release. The complete protocol is reported in Supplementary Note S3 and Tables S7–S14; the robustness protocol is in Supplementary Note S5.</w:t>
+        <w:t xml:space="preserve">The bootstrap resamples dates rather than rows, because daily fire activity is strongly temporally clustered. For each replicate, all cells from the sampled dates are retained; this preserves within-day dependence and gives more honest intervals than row-wise resampling.</w:t>
+      </w:r>
+    </w:p>
+    <w:p>
+      <w:pPr>
+        <w:pStyle w:val="BodyText"/>
+      </w:pPr>
+      <w:r>
+        <w:t xml:space="preserve">The same block structure is used for paired differences against FWI and INPE. The spatial holdout divides the country into 50-km blocks, removes an entire block and a 20-km buffer from training, recomputes the historical priors without the held-out fires and evaluates both held-in and held-out cells. The primary metrics are the area under the receiver operating characteristic curve (ROC-AUC) and precision–recall area under the curve (PR-AUC). We also report Brier score, expected calibration error, precision, recall, F0.5 and false positives at the validation cutoff. AUC confidence intervals use 500 grouped bootstrap replicates; paired model differences use 1 000 replicates. We define a pre-specified family of six confirmatory comparisons (four against FWI and INPE and two M3 − M2) and report Holm–Bonferroni and Benjamini–Hochberg adjusted p-values; all remain significant at α = 0.05 (Holm p = 0.006, BH p = 0.001). The bootstrap resolution is 0.001, so raw p-values at the floor are upper bounds. The protocol is applied without modifying the test set. The target operator, the list of test cell-days and the evaluation scripts are archived with the code release. The complete protocol is reported in Supplementary Note S3 and Tables S7–S14; the robustness protocol is in Supplementary Note S5.</w:t>
       </w:r>
     </w:p>
     <w:bookmarkEnd w:id="20"/>
@@ -4990,7 +4998,23 @@
         <w:pStyle w:val="BodyText"/>
       </w:pPr>
       <w:r>
-        <w:t xml:space="preserve">With t-1 weather, M3 retains 0.7831/0.7613 and M2 0.7818/0.7463; M1 is lower and is reported in Supplementary Table S9. The small M3 drop shows that recurrence priors, not same-day weather, dominate the hybrid signal. This is why the current system is a nowcast/hindcast; a real day-ahead system would require forecast weather. Lead-time details are in Supplementary Table S9. As a direct leakage comparator, a coupled model trained on the combined fire sample with t-1 fire inputs did not materially outperform the decoupled task architecture: 0.8862 vs 0.8868 ROC-AUC in Chaco and 0.7871 vs 0.7806 in Oriental. This comparator uses the same gated case-control sample, so it does not test removal of gating; it only shows that the coupled shortcut does not provide a large advantage on this sample (Supplementary Table S19). A full 3 × 3 D2 sensitivity (15/25/35 km × 7/10/14 d) regenerated the 1:10 sampling and retrained M1, M2 and M3 for every combination. M3 outperformed M2 in all nine combinations on both validation and test, with a positive M3 − M2 ROC-AUC of +0.004 to +0.016, and was the best test model in all nine; its range was 0.771–0.782 in 2023 and 0.785–0.797 in Chaco for 2024–2025, and 0.759–0.768 and 0.750–0.755 in Oriental. The 7-day window gave the highest ROC-AUC in every region × radius pair, and the radius effect was small: 35 km was slightly better in Chaco and 25 km in Oriental. The D2 conclusion is therefore not an artifact of the 25 km/10 d choice (Supplementary Table S20). A four-fold rolling-origin backtest retrained M1/M2/M3 with training through Y−2, validation on Y−1 and test on Y. The M3−M2 ROC-AUC difference was +0.0030/+0.0059 in 2022, +0.0029/+0.0120 in 2023, +0.0038/+0.0166 in 2024 and +0.0019/+0.0084 in 2025 (Chaco/Oriental); the corresponding p-values were 0.032/0.006, 0.082/0.001, 0.004/0.001 and 0.148/0.001. The sign was positive in all eight region-fold comparisons, and M1 remained below M2 in every fold (Table S26; Figure S5). The temporal ordering is therefore not an artifact of the single 2024–2025 split. Across 20 runs (five seeds × two capacities × two regions), the M3−M2 difference remained positive in every run, with mean differences of +0.0036/+0.0035 in Chaco and +0.0128/+0.0128 in Oriental for the current/high-capacity configurations (Table S25).</w:t>
+        <w:t xml:space="preserve">With t-1 weather, M3 retains 0.7831/0.7613 and M2 0.7818/0.7463; M1 is lower and is reported in Supplementary Table S9. The small M3 drop shows that recurrence priors, not same-day weather, dominate the hybrid signal. This is why the current system is a nowcast/hindcast; a real day-ahead system would require forecast weather. Lead-time details are in Supplementary Table S9. As a direct leakage comparator, a coupled model trained on the combined fire sample with t-1 fire inputs did not materially outperform the decoupled task architecture: 0.8862 vs 0.8868 ROC-AUC in Chaco and 0.7871 vs 0.7806 in Oriental. This comparator uses the same gated case-control sample, so it does not test removal of gating; it only shows that the coupled shortcut does not provide a large advantage on this sample (Supplementary Table S19).</w:t>
+      </w:r>
+    </w:p>
+    <w:p>
+      <w:pPr>
+        <w:pStyle w:val="BodyText"/>
+      </w:pPr>
+      <w:r>
+        <w:t xml:space="preserve">A full 3 × 3 D2 sensitivity (15/25/35 km × 7/10/14 d) regenerated the 1:10 sampling and retrained M1, M2 and M3 for every combination. M3 outperformed M2 in all nine combinations on both validation and test, with a positive M3 − M2 ROC-AUC of +0.004 to +0.016, and was the best test model in all nine; its range was 0.771–0.782 in 2023 and 0.785–0.797 in Chaco for 2024–2025, and 0.759–0.768 and 0.750–0.755 in Oriental. The 7-day window gave the highest ROC-AUC in every region × radius pair, and the radius effect was small: 35 km was slightly better in Chaco and 25 km in Oriental. The D2 conclusion is therefore not an artifact of the 25 km/10 d choice (Supplementary Table S20).</w:t>
+      </w:r>
+    </w:p>
+    <w:p>
+      <w:pPr>
+        <w:pStyle w:val="BodyText"/>
+      </w:pPr>
+      <w:r>
+        <w:t xml:space="preserve">A four-fold rolling-origin backtest retrained M1/M2/M3 with training through Y−2, validation on Y−1 and test on Y. The M3−M2 ROC-AUC difference was +0.0030/+0.0059 in 2022, +0.0029/+0.0120 in 2023, +0.0038/+0.0166 in 2024 and +0.0019/+0.0084 in 2025 (Chaco/Oriental); the corresponding p-values were 0.032/0.006, 0.082/0.001, 0.004/0.001 and 0.148/0.001. The sign was positive in all eight region-fold comparisons, and M1 remained below M2 in every fold (Table S26; Figure S5). The temporal ordering is therefore not an artifact of the single 2024–2025 split. Across 20 runs (five seeds × two capacities × two regions), the M3−M2 difference remained positive in every run, with mean differences of +0.0036/+0.0035 in Chaco and +0.0128/+0.0128 in Oriental for the current/high-capacity configurations (Table S25).</w:t>
       </w:r>
     </w:p>
     <w:p>
@@ -5714,7 +5738,15 @@
         <w:pStyle w:val="FirstParagraph"/>
       </w:pPr>
       <w:r>
-        <w:t xml:space="preserve">We presented a reproducible computational framework for decoupled wildfire ignition and propagation benchmarking in the Gran Chaco and Oriental Region of Paraguay. The D2 target operator separates primary ignition from multi-day persistence, the gated M3/M2 architecture pairs a recurrence-aware temporal nowcast with a spatially robust fallback, and the evaluation harness makes every comparison auditable. On 2023 validation, M3 reached a ROC-AUC of 0.7844/0.7628 (Chaco/Oriental), whereas M2 proved most robust across both development (0.6773/0.7470) and independent confirmation spatial blocks (0.6871/0.6621; Supplementary Table S18), justifying the replacement of the biophysical baseline M1 as the operational fallback. On the retrospective 2024–2025 test, M3 substantially outperformed the full Canadian FWI (0.8021/0.7534 vs. 0.5059/0.5611) and the INPE Risco de Fogo (0.5266/0.4973), and decoupling did not sacrifice discrimination relative to a coupled</w:t>
+        <w:t xml:space="preserve">We presented a reproducible computational framework for decoupled wildfire ignition and propagation benchmarking in the Gran Chaco and Oriental Region of Paraguay. The D2 target operator separates primary ignition from multi-day persistence, the gated M3/M2 architecture pairs a recurrence-aware temporal nowcast with a spatially robust fallback, and the evaluation harness makes every comparison auditable. On 2023 validation, M3 reached a ROC-AUC of 0.7844/0.7628 (Chaco/Oriental), whereas M2 proved most robust across both development (0.6773/0.7470) and independent confirmation spatial blocks (0.6871/0.6621; Supplementary Table S18), justifying the replacement of the biophysical baseline M1 as the operational fallback.</w:t>
+      </w:r>
+    </w:p>
+    <w:p>
+      <w:pPr>
+        <w:pStyle w:val="BodyText"/>
+      </w:pPr>
+      <w:r>
+        <w:t xml:space="preserve">On the retrospective 2024–2025 test, M3 substantially outperformed the full Canadian FWI (0.8021/0.7534 vs. 0.5059/0.5611) and the INPE Risco de Fogo (0.5266/0.4973), and decoupling did not sacrifice discrimination relative to a coupled</w:t>
       </w:r>
       <w:r>
         <w:t xml:space="preserve"> </w:t>
@@ -5727,7 +5759,15 @@
         <w:t xml:space="preserve">t</w:t>
       </w:r>
       <w:r>
-        <w:t xml:space="preserve">−1 baseline (Supplementary Table S19). Nevertheless, population-level ignition precision remains low (0.082 %/0.198 %; 95 % CI 0.075–0.088/0.178–0.222) and the hybrid advantage is strictly temporal rather than spatial. Decision-curve and cost-loss analyses locate the operational gain in propagation (V = 0.63/0.40 at α = 0.002) and in ignition only as a low-α screening layer, positioning the system as an operational screening and prioritization tool rather than a stand-alone warning system. A permuted-label control remains above chance in Chaco (0.63), so this ranking is a nowcasting signal rather than a causal attribution. An external leave-one-department-out test in Boquerón reproduced the M2/M3 discrimination (0.8104/0.8120) but not a significant M3−M2 gain (+0.0016, p = 0.254); FWI remained below chance (0.4708) and INPE reached 0.5817. Ultimately, the main contribution of this work is not a single susceptibility map but an open, auditable protocol—archived with public code and data—that shows where a geoscientific model holds, where it fails and how to extend the benchmark to other subtropical regions and to day-ahead weather forecasts.</w:t>
+        <w:t xml:space="preserve">−1 baseline (Supplementary Table S19). Nevertheless, population-level ignition precision remains low (0.082 %/0.198 %; 95 % CI 0.075–0.088/0.178–0.222) and the hybrid advantage is strictly temporal rather than spatial. Decision-curve and cost-loss analyses locate the operational gain in propagation (V = 0.63/0.40 at α = 0.002) and in ignition only as a low-α screening layer, positioning the system as an operational screening and prioritization tool rather than a stand-alone warning system.</w:t>
+      </w:r>
+    </w:p>
+    <w:p>
+      <w:pPr>
+        <w:pStyle w:val="BodyText"/>
+      </w:pPr>
+      <w:r>
+        <w:t xml:space="preserve">A permuted-label control remains above chance in Chaco (0.63), so this ranking is a nowcasting signal rather than a causal attribution. An external leave-one-department-out test in Boquerón reproduced the M2/M3 discrimination (0.8104/0.8120) but not a significant M3−M2 gain (+0.0016, p = 0.254); FWI remained below chance (0.4708) and INPE reached 0.5817. Ultimately, the main contribution of this work is not a single susceptibility map but an open, auditable protocol—archived with public code and data—that shows where a geoscientific model holds, where it fails and how to extend the benchmark to other subtropical regions and to day-ahead weather forecasts.</w:t>
       </w:r>
     </w:p>
     <w:bookmarkEnd w:id="51"/>

</xml_diff>